<commit_message>
Project 8 - DDP & Project 9 - Lag Llama 4-bit Quantization
</commit_message>
<xml_diff>
--- a/resume/apoorv-dixit-resume_GPU.docx
+++ b/resume/apoorv-dixit-resume_GPU.docx
@@ -209,6 +209,13 @@
         </w:numPr>
         <w:jc w:val="both"/>
         <w:rPr>
+          <w:rFonts w:asciiTheme="minorHAnsi" w:eastAsia="Calibri" w:hAnsiTheme="minorHAnsi" w:cstheme="minorHAnsi"/>
+          <w:sz w:val="18"/>
+          <w:szCs w:val="18"/>
+        </w:rPr>
+      </w:pPr>
+      <w:r>
+        <w:rPr>
           <w:rStyle w:val="fs13fw6overflow-hidden"/>
           <w:rFonts w:asciiTheme="minorHAnsi" w:eastAsia="Calibri" w:hAnsiTheme="minorHAnsi" w:cstheme="minorHAnsi"/>
           <w:b/>
@@ -216,54 +223,31 @@
           <w:sz w:val="18"/>
           <w:szCs w:val="18"/>
         </w:rPr>
-      </w:pPr>
-      <w:r>
-        <w:rPr>
-          <w:rStyle w:val="fs13fw6overflow-hidden"/>
-          <w:rFonts w:asciiTheme="minorHAnsi" w:eastAsia="Calibri" w:hAnsiTheme="minorHAnsi" w:cstheme="minorHAnsi"/>
-          <w:b/>
-          <w:bCs/>
-          <w:sz w:val="18"/>
-          <w:szCs w:val="18"/>
-        </w:rPr>
-        <w:t>LLM Inference Optimization</w:t>
-      </w:r>
-      <w:r>
-        <w:rPr>
-          <w:rStyle w:val="fs13fw6overflow-hidden"/>
-          <w:rFonts w:asciiTheme="minorHAnsi" w:eastAsia="Calibri" w:hAnsiTheme="minorHAnsi" w:cstheme="minorHAnsi"/>
-          <w:b/>
-          <w:bCs/>
-          <w:sz w:val="18"/>
-          <w:szCs w:val="18"/>
-        </w:rPr>
-        <w:t xml:space="preserve"> - </w:t>
-      </w:r>
-      <w:r>
-        <w:rPr>
-          <w:rFonts w:asciiTheme="minorHAnsi" w:eastAsia="Calibri" w:hAnsiTheme="minorHAnsi" w:cstheme="minorHAnsi"/>
-          <w:sz w:val="18"/>
-          <w:szCs w:val="18"/>
-        </w:rPr>
-        <w:t xml:space="preserve">Built an LLM inference benchmarking framework for </w:t>
-      </w:r>
-      <w:r>
-        <w:rPr>
-          <w:rFonts w:asciiTheme="minorHAnsi" w:eastAsia="Calibri" w:hAnsiTheme="minorHAnsi" w:cstheme="minorHAnsi"/>
-          <w:b/>
-          <w:bCs/>
-          <w:sz w:val="18"/>
-          <w:szCs w:val="18"/>
-        </w:rPr>
-        <w:t>GPT-2</w:t>
-      </w:r>
-      <w:r>
-        <w:rPr>
-          <w:rFonts w:asciiTheme="minorHAnsi" w:eastAsia="Calibri" w:hAnsiTheme="minorHAnsi" w:cstheme="minorHAnsi"/>
-          <w:sz w:val="18"/>
-          <w:szCs w:val="18"/>
-        </w:rPr>
-        <w:t xml:space="preserve"> (124M) on an RTX 4080 GPU, comparing </w:t>
+        <w:t xml:space="preserve">LLM Inference Optimization - </w:t>
+      </w:r>
+      <w:r>
+        <w:rPr>
+          <w:rFonts w:asciiTheme="minorHAnsi" w:eastAsia="Calibri" w:hAnsiTheme="minorHAnsi" w:cstheme="minorHAnsi"/>
+          <w:sz w:val="18"/>
+          <w:szCs w:val="18"/>
+        </w:rPr>
+        <w:t>Built an LLM inference benchmarking framework for GPT-2 (124M</w:t>
+      </w:r>
+      <w:r>
+        <w:rPr>
+          <w:rFonts w:asciiTheme="minorHAnsi" w:eastAsia="Calibri" w:hAnsiTheme="minorHAnsi" w:cstheme="minorHAnsi"/>
+          <w:sz w:val="18"/>
+          <w:szCs w:val="18"/>
+        </w:rPr>
+        <w:t>)</w:t>
+      </w:r>
+      <w:r>
+        <w:rPr>
+          <w:rFonts w:asciiTheme="minorHAnsi" w:eastAsia="Calibri" w:hAnsiTheme="minorHAnsi" w:cstheme="minorHAnsi"/>
+          <w:sz w:val="18"/>
+          <w:szCs w:val="18"/>
+        </w:rPr>
+        <w:t xml:space="preserve">, comparing </w:t>
       </w:r>
       <w:proofErr w:type="spellStart"/>
       <w:r>
@@ -281,7 +265,45 @@
           <w:sz w:val="18"/>
           <w:szCs w:val="18"/>
         </w:rPr>
-        <w:t xml:space="preserve"> FP16, </w:t>
+        <w:t xml:space="preserve"> FP32/FP16, </w:t>
+      </w:r>
+      <w:r>
+        <w:rPr>
+          <w:rFonts w:asciiTheme="minorHAnsi" w:eastAsia="Calibri" w:hAnsiTheme="minorHAnsi" w:cstheme="minorHAnsi"/>
+          <w:b/>
+          <w:bCs/>
+          <w:sz w:val="18"/>
+          <w:szCs w:val="18"/>
+        </w:rPr>
+        <w:t>SDPA</w:t>
+      </w:r>
+      <w:r>
+        <w:rPr>
+          <w:rFonts w:asciiTheme="minorHAnsi" w:eastAsia="Calibri" w:hAnsiTheme="minorHAnsi" w:cstheme="minorHAnsi"/>
+          <w:sz w:val="18"/>
+          <w:szCs w:val="18"/>
+        </w:rPr>
+        <w:t xml:space="preserve">, </w:t>
+      </w:r>
+      <w:proofErr w:type="spellStart"/>
+      <w:proofErr w:type="gramStart"/>
+      <w:r>
+        <w:rPr>
+          <w:rFonts w:asciiTheme="minorHAnsi" w:eastAsia="Calibri" w:hAnsiTheme="minorHAnsi" w:cstheme="minorHAnsi"/>
+          <w:sz w:val="18"/>
+          <w:szCs w:val="18"/>
+        </w:rPr>
+        <w:t>torch.compile</w:t>
+      </w:r>
+      <w:proofErr w:type="spellEnd"/>
+      <w:proofErr w:type="gramEnd"/>
+      <w:r>
+        <w:rPr>
+          <w:rFonts w:asciiTheme="minorHAnsi" w:eastAsia="Calibri" w:hAnsiTheme="minorHAnsi" w:cstheme="minorHAnsi"/>
+          <w:sz w:val="18"/>
+          <w:szCs w:val="18"/>
+        </w:rPr>
+        <w:t xml:space="preserve">, </w:t>
       </w:r>
       <w:r>
         <w:rPr>
@@ -319,7 +341,43 @@
           <w:sz w:val="18"/>
           <w:szCs w:val="18"/>
         </w:rPr>
-        <w:t xml:space="preserve"> FP16 across batch sizes 1–16 and sequence lengths 64–256; achieved ~3.4× higher throughput (110K vs 32K tokens/sec) and ~46% lower latency (16.5 </w:t>
+        <w:t xml:space="preserve"> across batch sizes 1–16 and sequence lengths 64–256; measured latency, throughput, and GPU memory, achieving </w:t>
+      </w:r>
+      <w:r>
+        <w:rPr>
+          <w:rFonts w:asciiTheme="minorHAnsi" w:eastAsia="Calibri" w:hAnsiTheme="minorHAnsi" w:cstheme="minorHAnsi"/>
+          <w:b/>
+          <w:bCs/>
+          <w:sz w:val="18"/>
+          <w:szCs w:val="18"/>
+        </w:rPr>
+        <w:t>~3.4× higher throughput</w:t>
+      </w:r>
+      <w:r>
+        <w:rPr>
+          <w:rFonts w:asciiTheme="minorHAnsi" w:eastAsia="Calibri" w:hAnsiTheme="minorHAnsi" w:cstheme="minorHAnsi"/>
+          <w:sz w:val="18"/>
+          <w:szCs w:val="18"/>
+        </w:rPr>
+        <w:t xml:space="preserve"> (110K vs 32K tokens/s) and </w:t>
+      </w:r>
+      <w:r>
+        <w:rPr>
+          <w:rFonts w:asciiTheme="minorHAnsi" w:eastAsia="Calibri" w:hAnsiTheme="minorHAnsi" w:cstheme="minorHAnsi"/>
+          <w:b/>
+          <w:bCs/>
+          <w:sz w:val="18"/>
+          <w:szCs w:val="18"/>
+        </w:rPr>
+        <w:t>~46% lower latency</w:t>
+      </w:r>
+      <w:r>
+        <w:rPr>
+          <w:rFonts w:asciiTheme="minorHAnsi" w:eastAsia="Calibri" w:hAnsiTheme="minorHAnsi" w:cstheme="minorHAnsi"/>
+          <w:sz w:val="18"/>
+          <w:szCs w:val="18"/>
+        </w:rPr>
+        <w:t xml:space="preserve"> (16.5 </w:t>
       </w:r>
       <w:proofErr w:type="spellStart"/>
       <w:r>
@@ -373,7 +431,7 @@
           <w:sz w:val="18"/>
           <w:szCs w:val="18"/>
         </w:rPr>
-        <w:t xml:space="preserve"> over ONNX Runtime</w:t>
+        <w:t xml:space="preserve"> over ONNX.</w:t>
       </w:r>
     </w:p>
     <w:p>
@@ -411,23 +469,12 @@
           <w:sz w:val="18"/>
           <w:szCs w:val="18"/>
         </w:rPr>
-        <w:t xml:space="preserve">ing Infrastructure </w:t>
+        <w:t>ing Infrastructure -</w:t>
       </w:r>
       <w:r>
         <w:rPr>
           <w:rStyle w:val="fs13fw6overflow-hidden"/>
           <w:rFonts w:asciiTheme="minorHAnsi" w:eastAsia="Calibri" w:hAnsiTheme="minorHAnsi" w:cstheme="minorHAnsi"/>
-          <w:b/>
-          <w:bCs/>
-          <w:sz w:val="18"/>
-          <w:szCs w:val="18"/>
-        </w:rPr>
-        <w:t>-</w:t>
-      </w:r>
-      <w:r>
-        <w:rPr>
-          <w:rStyle w:val="fs13fw6overflow-hidden"/>
-          <w:rFonts w:asciiTheme="minorHAnsi" w:eastAsia="Calibri" w:hAnsiTheme="minorHAnsi" w:cstheme="minorHAnsi"/>
           <w:sz w:val="18"/>
           <w:szCs w:val="18"/>
         </w:rPr>
@@ -445,8 +492,6 @@
       <w:r>
         <w:rPr>
           <w:rFonts w:asciiTheme="minorHAnsi" w:eastAsia="Calibri" w:hAnsiTheme="minorHAnsi" w:cstheme="minorHAnsi"/>
-          <w:b/>
-          <w:bCs/>
           <w:sz w:val="18"/>
           <w:szCs w:val="18"/>
         </w:rPr>
@@ -465,6 +510,8 @@
       <w:r>
         <w:rPr>
           <w:rFonts w:asciiTheme="minorHAnsi" w:eastAsia="Calibri" w:hAnsiTheme="minorHAnsi" w:cstheme="minorHAnsi"/>
+          <w:b/>
+          <w:bCs/>
           <w:sz w:val="18"/>
           <w:szCs w:val="18"/>
         </w:rPr>
@@ -497,6 +544,56 @@
           <w:sz w:val="18"/>
           <w:szCs w:val="18"/>
         </w:rPr>
+        <w:t xml:space="preserve">, </w:t>
+      </w:r>
+      <w:proofErr w:type="spellStart"/>
+      <w:r>
+        <w:rPr>
+          <w:rFonts w:asciiTheme="minorHAnsi" w:eastAsia="Calibri" w:hAnsiTheme="minorHAnsi" w:cstheme="minorHAnsi"/>
+          <w:b/>
+          <w:bCs/>
+          <w:sz w:val="18"/>
+          <w:szCs w:val="18"/>
+        </w:rPr>
+        <w:t>SGLang</w:t>
+      </w:r>
+      <w:proofErr w:type="spellEnd"/>
+      <w:r>
+        <w:rPr>
+          <w:rFonts w:asciiTheme="minorHAnsi" w:eastAsia="Calibri" w:hAnsiTheme="minorHAnsi" w:cstheme="minorHAnsi"/>
+          <w:sz w:val="18"/>
+          <w:szCs w:val="18"/>
+        </w:rPr>
+        <w:t xml:space="preserve">, </w:t>
+      </w:r>
+      <w:proofErr w:type="spellStart"/>
+      <w:r>
+        <w:rPr>
+          <w:rFonts w:asciiTheme="minorHAnsi" w:eastAsia="Calibri" w:hAnsiTheme="minorHAnsi" w:cstheme="minorHAnsi"/>
+          <w:b/>
+          <w:bCs/>
+          <w:sz w:val="18"/>
+          <w:szCs w:val="18"/>
+        </w:rPr>
+        <w:t>TensorRT</w:t>
+      </w:r>
+      <w:proofErr w:type="spellEnd"/>
+      <w:r>
+        <w:rPr>
+          <w:rFonts w:asciiTheme="minorHAnsi" w:eastAsia="Calibri" w:hAnsiTheme="minorHAnsi" w:cstheme="minorHAnsi"/>
+          <w:b/>
+          <w:bCs/>
+          <w:sz w:val="18"/>
+          <w:szCs w:val="18"/>
+        </w:rPr>
+        <w:t>-LLM</w:t>
+      </w:r>
+      <w:r>
+        <w:rPr>
+          <w:rFonts w:asciiTheme="minorHAnsi" w:eastAsia="Calibri" w:hAnsiTheme="minorHAnsi" w:cstheme="minorHAnsi"/>
+          <w:sz w:val="18"/>
+          <w:szCs w:val="18"/>
+        </w:rPr>
         <w:t xml:space="preserve">, and NVIDIA </w:t>
       </w:r>
       <w:r>
@@ -515,25 +612,7 @@
           <w:sz w:val="18"/>
           <w:szCs w:val="18"/>
         </w:rPr>
-        <w:t xml:space="preserve"> for </w:t>
-      </w:r>
-      <w:r>
-        <w:rPr>
-          <w:rFonts w:asciiTheme="minorHAnsi" w:eastAsia="Calibri" w:hAnsiTheme="minorHAnsi" w:cstheme="minorHAnsi"/>
-          <w:b/>
-          <w:bCs/>
-          <w:sz w:val="18"/>
-          <w:szCs w:val="18"/>
-        </w:rPr>
-        <w:t>GPT-2</w:t>
-      </w:r>
-      <w:r>
-        <w:rPr>
-          <w:rFonts w:asciiTheme="minorHAnsi" w:eastAsia="Calibri" w:hAnsiTheme="minorHAnsi" w:cstheme="minorHAnsi"/>
-          <w:sz w:val="18"/>
-          <w:szCs w:val="18"/>
-        </w:rPr>
-        <w:t xml:space="preserve"> FP16 workloads on an RTX 4080 Laptop GPU; measured p50/p95 latency, throughput, and GPU utilization, demonstrating </w:t>
+        <w:t xml:space="preserve"> for GPT-2 FP16 workloads on an RTX 4080 Laptop GPU; measured p50/p95 latency, throughput, and GPU utilization, with </w:t>
       </w:r>
       <w:proofErr w:type="spellStart"/>
       <w:r>
@@ -542,7 +621,7 @@
           <w:sz w:val="18"/>
           <w:szCs w:val="18"/>
         </w:rPr>
-        <w:t>vLLM's</w:t>
+        <w:t>SGLang</w:t>
       </w:r>
       <w:proofErr w:type="spellEnd"/>
       <w:r>
@@ -551,7 +630,25 @@
           <w:sz w:val="18"/>
           <w:szCs w:val="18"/>
         </w:rPr>
-        <w:t xml:space="preserve"> </w:t>
+        <w:t xml:space="preserve"> achieving </w:t>
+      </w:r>
+      <w:r>
+        <w:rPr>
+          <w:rFonts w:asciiTheme="minorHAnsi" w:eastAsia="Calibri" w:hAnsiTheme="minorHAnsi" w:cstheme="minorHAnsi"/>
+          <w:b/>
+          <w:bCs/>
+          <w:sz w:val="18"/>
+          <w:szCs w:val="18"/>
+        </w:rPr>
+        <w:t>3.2× lower latency</w:t>
+      </w:r>
+      <w:r>
+        <w:rPr>
+          <w:rFonts w:asciiTheme="minorHAnsi" w:eastAsia="Calibri" w:hAnsiTheme="minorHAnsi" w:cstheme="minorHAnsi"/>
+          <w:sz w:val="18"/>
+          <w:szCs w:val="18"/>
+        </w:rPr>
+        <w:t xml:space="preserve"> (80 vs 257 </w:t>
       </w:r>
       <w:proofErr w:type="spellStart"/>
       <w:r>
@@ -560,7 +657,7 @@
           <w:sz w:val="18"/>
           <w:szCs w:val="18"/>
         </w:rPr>
-        <w:t>PagedAttention</w:t>
+        <w:t>ms</w:t>
       </w:r>
       <w:proofErr w:type="spellEnd"/>
       <w:r>
@@ -569,7 +666,25 @@
           <w:sz w:val="18"/>
           <w:szCs w:val="18"/>
         </w:rPr>
-        <w:t xml:space="preserve">-based serving achieved 3.0× lower latency (85 </w:t>
+        <w:t xml:space="preserve">) and </w:t>
+      </w:r>
+      <w:r>
+        <w:rPr>
+          <w:rFonts w:asciiTheme="minorHAnsi" w:eastAsia="Calibri" w:hAnsiTheme="minorHAnsi" w:cstheme="minorHAnsi"/>
+          <w:b/>
+          <w:bCs/>
+          <w:sz w:val="18"/>
+          <w:szCs w:val="18"/>
+        </w:rPr>
+        <w:t>3.2× higher throughput</w:t>
+      </w:r>
+      <w:r>
+        <w:rPr>
+          <w:rFonts w:asciiTheme="minorHAnsi" w:eastAsia="Calibri" w:hAnsiTheme="minorHAnsi" w:cstheme="minorHAnsi"/>
+          <w:sz w:val="18"/>
+          <w:szCs w:val="18"/>
+        </w:rPr>
+        <w:t xml:space="preserve"> (12.4 vs 3.9 req/s) than </w:t>
       </w:r>
       <w:proofErr w:type="spellStart"/>
       <w:r>
@@ -578,7 +693,7 @@
           <w:sz w:val="18"/>
           <w:szCs w:val="18"/>
         </w:rPr>
-        <w:t>ms</w:t>
+        <w:t>HuggingFace</w:t>
       </w:r>
       <w:proofErr w:type="spellEnd"/>
       <w:r>
@@ -587,7 +702,7 @@
           <w:sz w:val="18"/>
           <w:szCs w:val="18"/>
         </w:rPr>
-        <w:t xml:space="preserve"> vs 257 </w:t>
+        <w:t xml:space="preserve"> and Triton baselines while </w:t>
       </w:r>
       <w:proofErr w:type="spellStart"/>
       <w:r>
@@ -596,7 +711,7 @@
           <w:sz w:val="18"/>
           <w:szCs w:val="18"/>
         </w:rPr>
-        <w:t>ms</w:t>
+        <w:t>TensorRT</w:t>
       </w:r>
       <w:proofErr w:type="spellEnd"/>
       <w:r>
@@ -605,25 +720,7 @@
           <w:sz w:val="18"/>
           <w:szCs w:val="18"/>
         </w:rPr>
-        <w:t xml:space="preserve">), 3.0× higher throughput (11.6 vs 3.9 req/s), and 63% higher GPU utilization (62% vs 38%) than </w:t>
-      </w:r>
-      <w:proofErr w:type="spellStart"/>
-      <w:r>
-        <w:rPr>
-          <w:rFonts w:asciiTheme="minorHAnsi" w:eastAsia="Calibri" w:hAnsiTheme="minorHAnsi" w:cstheme="minorHAnsi"/>
-          <w:sz w:val="18"/>
-          <w:szCs w:val="18"/>
-        </w:rPr>
-        <w:t>HuggingFace</w:t>
-      </w:r>
-      <w:proofErr w:type="spellEnd"/>
-      <w:r>
-        <w:rPr>
-          <w:rFonts w:asciiTheme="minorHAnsi" w:eastAsia="Calibri" w:hAnsiTheme="minorHAnsi" w:cstheme="minorHAnsi"/>
-          <w:sz w:val="18"/>
-          <w:szCs w:val="18"/>
-        </w:rPr>
-        <w:t xml:space="preserve"> and Triton baselines</w:t>
+        <w:t>-LLM delivered comparable performance through optimized LLM inference.</w:t>
       </w:r>
     </w:p>
     <w:p>
@@ -650,18 +747,7 @@
           <w:sz w:val="18"/>
           <w:szCs w:val="18"/>
         </w:rPr>
-        <w:t>GPU Profiling &amp; Analysis</w:t>
-      </w:r>
-      <w:r>
-        <w:rPr>
-          <w:rStyle w:val="fs13fw6overflow-hidden"/>
-          <w:rFonts w:asciiTheme="minorHAnsi" w:eastAsia="Calibri" w:hAnsiTheme="minorHAnsi" w:cstheme="minorHAnsi"/>
-          <w:b/>
-          <w:bCs/>
-          <w:sz w:val="18"/>
-          <w:szCs w:val="18"/>
-        </w:rPr>
-        <w:t xml:space="preserve"> </w:t>
+        <w:t xml:space="preserve">GPU Profiling &amp; Analysis </w:t>
       </w:r>
       <w:r>
         <w:rPr>
@@ -772,18 +858,7 @@
           <w:sz w:val="18"/>
           <w:szCs w:val="18"/>
         </w:rPr>
-        <w:t>LLM Quantization Benchmarking</w:t>
-      </w:r>
-      <w:r>
-        <w:rPr>
-          <w:rStyle w:val="fs13fw6overflow-hidden"/>
-          <w:rFonts w:asciiTheme="minorHAnsi" w:eastAsia="Calibri" w:hAnsiTheme="minorHAnsi" w:cstheme="minorHAnsi"/>
-          <w:b/>
-          <w:bCs/>
-          <w:sz w:val="18"/>
-          <w:szCs w:val="18"/>
-        </w:rPr>
-        <w:t xml:space="preserve"> </w:t>
+        <w:t xml:space="preserve">LLM Quantization Benchmarking </w:t>
       </w:r>
       <w:r>
         <w:rPr>
@@ -840,18 +915,7 @@
           <w:sz w:val="18"/>
           <w:szCs w:val="18"/>
         </w:rPr>
-        <w:t>AI Workload Analysis</w:t>
-      </w:r>
-      <w:r>
-        <w:rPr>
-          <w:rStyle w:val="fs13fw6overflow-hidden"/>
-          <w:rFonts w:asciiTheme="minorHAnsi" w:eastAsia="Calibri" w:hAnsiTheme="minorHAnsi" w:cstheme="minorHAnsi"/>
-          <w:b/>
-          <w:bCs/>
-          <w:sz w:val="18"/>
-          <w:szCs w:val="18"/>
-        </w:rPr>
-        <w:t xml:space="preserve"> </w:t>
+        <w:t xml:space="preserve">AI Workload Analysis </w:t>
       </w:r>
       <w:r>
         <w:rPr>
@@ -2468,7 +2532,71 @@
           <w:sz w:val="18"/>
           <w:szCs w:val="18"/>
         </w:rPr>
-        <w:t xml:space="preserve">, NVIDIA Triton Inference Server, NVIDIA Nsight Systems, </w:t>
+        <w:t xml:space="preserve">, NVIDIA Triton Inference Server, </w:t>
+      </w:r>
+      <w:proofErr w:type="spellStart"/>
+      <w:r>
+        <w:rPr>
+          <w:rFonts w:asciiTheme="minorHAnsi" w:eastAsia="Calibri" w:hAnsiTheme="minorHAnsi" w:cstheme="minorHAnsi"/>
+          <w:sz w:val="18"/>
+          <w:szCs w:val="18"/>
+        </w:rPr>
+        <w:t>TensorRT</w:t>
+      </w:r>
+      <w:proofErr w:type="spellEnd"/>
+      <w:r>
+        <w:rPr>
+          <w:rFonts w:asciiTheme="minorHAnsi" w:eastAsia="Calibri" w:hAnsiTheme="minorHAnsi" w:cstheme="minorHAnsi"/>
+          <w:sz w:val="18"/>
+          <w:szCs w:val="18"/>
+        </w:rPr>
+        <w:t xml:space="preserve">-LLM, </w:t>
+      </w:r>
+      <w:proofErr w:type="spellStart"/>
+      <w:r>
+        <w:rPr>
+          <w:rFonts w:asciiTheme="minorHAnsi" w:eastAsia="Calibri" w:hAnsiTheme="minorHAnsi" w:cstheme="minorHAnsi"/>
+          <w:sz w:val="18"/>
+          <w:szCs w:val="18"/>
+        </w:rPr>
+        <w:t>SGLang</w:t>
+      </w:r>
+      <w:proofErr w:type="spellEnd"/>
+      <w:r>
+        <w:rPr>
+          <w:rFonts w:asciiTheme="minorHAnsi" w:eastAsia="Calibri" w:hAnsiTheme="minorHAnsi" w:cstheme="minorHAnsi"/>
+          <w:sz w:val="18"/>
+          <w:szCs w:val="18"/>
+        </w:rPr>
+        <w:t xml:space="preserve">, </w:t>
+      </w:r>
+      <w:proofErr w:type="spellStart"/>
+      <w:proofErr w:type="gramStart"/>
+      <w:r>
+        <w:rPr>
+          <w:rFonts w:asciiTheme="minorHAnsi" w:eastAsia="Calibri" w:hAnsiTheme="minorHAnsi" w:cstheme="minorHAnsi"/>
+          <w:sz w:val="18"/>
+          <w:szCs w:val="18"/>
+        </w:rPr>
+        <w:t>torch.compile</w:t>
+      </w:r>
+      <w:proofErr w:type="spellEnd"/>
+      <w:proofErr w:type="gramEnd"/>
+      <w:r>
+        <w:rPr>
+          <w:rFonts w:asciiTheme="minorHAnsi" w:eastAsia="Calibri" w:hAnsiTheme="minorHAnsi" w:cstheme="minorHAnsi"/>
+          <w:sz w:val="18"/>
+          <w:szCs w:val="18"/>
+        </w:rPr>
+        <w:t xml:space="preserve">, </w:t>
+      </w:r>
+      <w:r>
+        <w:rPr>
+          <w:rFonts w:asciiTheme="minorHAnsi" w:eastAsia="Calibri" w:hAnsiTheme="minorHAnsi" w:cstheme="minorHAnsi"/>
+          <w:sz w:val="18"/>
+          <w:szCs w:val="18"/>
+        </w:rPr>
+        <w:t xml:space="preserve">NVIDIA Nsight Systems, </w:t>
       </w:r>
       <w:proofErr w:type="spellStart"/>
       <w:r>

</xml_diff>

<commit_message>
Project 4 - MXFP8 (code only) and NVFP4
</commit_message>
<xml_diff>
--- a/resume/apoorv-dixit-resume_GPU.docx
+++ b/resume/apoorv-dixit-resume_GPU.docx
@@ -9,14 +9,14 @@
         </w:pBdr>
         <w:spacing w:line="205" w:lineRule="atLeast"/>
         <w:rPr>
-          <w:rFonts w:ascii="Calibri" w:eastAsia="Calibri" w:hAnsi="Calibri" w:cs="Calibri"/>
+          <w:rFonts w:asciiTheme="minorHAnsi" w:eastAsia="Calibri" w:hAnsiTheme="minorHAnsi" w:cstheme="minorHAnsi"/>
           <w:sz w:val="20"/>
           <w:szCs w:val="20"/>
         </w:rPr>
       </w:pPr>
       <w:r>
         <w:rPr>
-          <w:rFonts w:ascii="Calibri" w:eastAsia="Calibri" w:hAnsi="Calibri" w:cs="Calibri"/>
+          <w:rFonts w:asciiTheme="minorHAnsi" w:eastAsia="Calibri" w:hAnsiTheme="minorHAnsi" w:cstheme="minorHAnsi"/>
           <w:b/>
           <w:bCs/>
           <w:caps/>
@@ -31,23 +31,23 @@
         <w:spacing w:line="205" w:lineRule="atLeast"/>
         <w:rPr>
           <w:rFonts w:asciiTheme="minorHAnsi" w:eastAsia="Calibri" w:hAnsiTheme="minorHAnsi" w:cstheme="minorHAnsi"/>
-          <w:sz w:val="19"/>
-          <w:szCs w:val="19"/>
-        </w:rPr>
-      </w:pPr>
-      <w:r>
-        <w:rPr>
-          <w:rFonts w:asciiTheme="minorHAnsi" w:eastAsia="Calibri" w:hAnsiTheme="minorHAnsi" w:cstheme="minorHAnsi"/>
-          <w:sz w:val="19"/>
-          <w:szCs w:val="19"/>
+          <w:sz w:val="17"/>
+          <w:szCs w:val="17"/>
+        </w:rPr>
+      </w:pPr>
+      <w:r>
+        <w:rPr>
+          <w:rFonts w:asciiTheme="minorHAnsi" w:eastAsia="Calibri" w:hAnsiTheme="minorHAnsi" w:cstheme="minorHAnsi"/>
+          <w:sz w:val="17"/>
+          <w:szCs w:val="17"/>
         </w:rPr>
         <w:t>Jersey City, NJ</w:t>
       </w:r>
       <w:r>
         <w:rPr>
           <w:rFonts w:asciiTheme="minorHAnsi" w:eastAsia="Calibri" w:hAnsiTheme="minorHAnsi" w:cstheme="minorHAnsi"/>
-          <w:sz w:val="19"/>
-          <w:szCs w:val="19"/>
+          <w:sz w:val="17"/>
+          <w:szCs w:val="17"/>
         </w:rPr>
         <w:t> </w:t>
       </w:r>
@@ -55,8 +55,8 @@
         <w:rPr>
           <w:rFonts w:asciiTheme="minorHAnsi" w:eastAsia="Calibri" w:hAnsiTheme="minorHAnsi" w:cstheme="minorHAnsi"/>
           <w:color w:val="000000"/>
-          <w:sz w:val="19"/>
-          <w:szCs w:val="19"/>
+          <w:sz w:val="17"/>
+          <w:szCs w:val="17"/>
         </w:rPr>
         <w:t>| </w:t>
       </w:r>
@@ -64,104 +64,96 @@
         <w:rPr>
           <w:rFonts w:asciiTheme="minorHAnsi" w:eastAsia="Calibri" w:hAnsiTheme="minorHAnsi" w:cstheme="minorHAnsi"/>
           <w:color w:val="000000"/>
-          <w:sz w:val="19"/>
-          <w:szCs w:val="19"/>
+          <w:sz w:val="17"/>
+          <w:szCs w:val="17"/>
         </w:rPr>
         <w:t>+1 (</w:t>
       </w:r>
       <w:r>
         <w:rPr>
           <w:rFonts w:asciiTheme="minorHAnsi" w:eastAsia="Calibri" w:hAnsiTheme="minorHAnsi" w:cstheme="minorHAnsi"/>
-          <w:sz w:val="19"/>
-          <w:szCs w:val="19"/>
+          <w:sz w:val="17"/>
+          <w:szCs w:val="17"/>
         </w:rPr>
         <w:t>213</w:t>
       </w:r>
       <w:r>
         <w:rPr>
           <w:rFonts w:asciiTheme="minorHAnsi" w:eastAsia="Calibri" w:hAnsiTheme="minorHAnsi" w:cstheme="minorHAnsi"/>
-          <w:sz w:val="19"/>
-          <w:szCs w:val="19"/>
+          <w:sz w:val="17"/>
+          <w:szCs w:val="17"/>
         </w:rPr>
         <w:t xml:space="preserve">) </w:t>
       </w:r>
       <w:r>
         <w:rPr>
           <w:rFonts w:asciiTheme="minorHAnsi" w:eastAsia="Calibri" w:hAnsiTheme="minorHAnsi" w:cstheme="minorHAnsi"/>
-          <w:sz w:val="19"/>
-          <w:szCs w:val="19"/>
+          <w:sz w:val="17"/>
+          <w:szCs w:val="17"/>
         </w:rPr>
         <w:t>574</w:t>
       </w:r>
       <w:r>
         <w:rPr>
-          <w:rFonts w:ascii="Calibri" w:eastAsia="Calibri" w:hAnsi="Calibri" w:cs="Calibri"/>
-          <w:sz w:val="19"/>
-          <w:szCs w:val="19"/>
+          <w:rFonts w:asciiTheme="minorHAnsi" w:eastAsia="Calibri" w:hAnsiTheme="minorHAnsi" w:cstheme="minorHAnsi"/>
+          <w:sz w:val="17"/>
+          <w:szCs w:val="17"/>
         </w:rPr>
         <w:noBreakHyphen/>
         <w:t>5136 </w:t>
       </w:r>
       <w:r>
         <w:rPr>
-          <w:rFonts w:ascii="Calibri" w:eastAsia="Calibri" w:hAnsi="Calibri" w:cs="Calibri"/>
+          <w:rFonts w:asciiTheme="minorHAnsi" w:eastAsia="Calibri" w:hAnsiTheme="minorHAnsi" w:cstheme="minorHAnsi"/>
           <w:color w:val="000000"/>
-          <w:sz w:val="19"/>
-          <w:szCs w:val="19"/>
+          <w:sz w:val="17"/>
+          <w:szCs w:val="17"/>
         </w:rPr>
         <w:t>| </w:t>
       </w:r>
       <w:r>
         <w:rPr>
-          <w:rFonts w:ascii="Calibri" w:hAnsi="Calibri" w:cs="Calibri"/>
-          <w:sz w:val="19"/>
-          <w:szCs w:val="19"/>
+          <w:rFonts w:asciiTheme="minorHAnsi" w:hAnsiTheme="minorHAnsi" w:cstheme="minorHAnsi"/>
+          <w:sz w:val="17"/>
+          <w:szCs w:val="17"/>
         </w:rPr>
         <w:t>apoorvdixit619@gmail.com</w:t>
       </w:r>
       <w:r>
         <w:rPr>
-          <w:rFonts w:ascii="Calibri" w:eastAsia="Calibri" w:hAnsi="Calibri" w:cs="Calibri"/>
-          <w:sz w:val="19"/>
-          <w:szCs w:val="19"/>
+          <w:rFonts w:asciiTheme="minorHAnsi" w:eastAsia="Calibri" w:hAnsiTheme="minorHAnsi" w:cstheme="minorHAnsi"/>
+          <w:sz w:val="17"/>
+          <w:szCs w:val="17"/>
         </w:rPr>
         <w:t> </w:t>
       </w:r>
       <w:r>
         <w:rPr>
-          <w:rFonts w:ascii="Calibri" w:eastAsia="Calibri" w:hAnsi="Calibri" w:cs="Calibri"/>
+          <w:rFonts w:asciiTheme="minorHAnsi" w:eastAsia="Calibri" w:hAnsiTheme="minorHAnsi" w:cstheme="minorHAnsi"/>
           <w:color w:val="000000"/>
-          <w:sz w:val="19"/>
-          <w:szCs w:val="19"/>
+          <w:sz w:val="17"/>
+          <w:szCs w:val="17"/>
         </w:rPr>
         <w:t>| </w:t>
       </w:r>
       <w:hyperlink r:id="rId5" w:history="1">
         <w:r>
           <w:rPr>
-            <w:rFonts w:ascii="Calibri" w:eastAsia="Calibri" w:hAnsi="Calibri" w:cs="Calibri"/>
+            <w:rFonts w:asciiTheme="minorHAnsi" w:eastAsia="Calibri" w:hAnsiTheme="minorHAnsi" w:cstheme="minorHAnsi"/>
             <w:color w:val="000000"/>
-            <w:sz w:val="19"/>
-            <w:szCs w:val="19"/>
+            <w:sz w:val="17"/>
+            <w:szCs w:val="17"/>
           </w:rPr>
           <w:t>linkedin.com/in/apoorvdixit9</w:t>
         </w:r>
       </w:hyperlink>
       <w:r>
         <w:rPr>
-          <w:rFonts w:ascii="Calibri" w:hAnsi="Calibri" w:cs="Calibri"/>
-          <w:sz w:val="19"/>
-          <w:szCs w:val="19"/>
-        </w:rPr>
-        <w:t xml:space="preserve"> | </w:t>
-      </w:r>
-      <w:r>
-        <w:rPr>
-          <w:rFonts w:ascii="Calibri" w:hAnsi="Calibri" w:cs="Calibri"/>
-          <w:sz w:val="19"/>
-          <w:szCs w:val="19"/>
-        </w:rPr>
-        <w:t>github.com/apoorvdixit99</w:t>
+          <w:rFonts w:asciiTheme="minorHAnsi" w:hAnsiTheme="minorHAnsi" w:cstheme="minorHAnsi"/>
+          <w:sz w:val="17"/>
+          <w:szCs w:val="17"/>
+        </w:rPr>
+        <w:t xml:space="preserve"> | github.com/apoorvdixit99</w:t>
       </w:r>
     </w:p>
     <w:p>
@@ -210,8 +202,8 @@
         <w:jc w:val="both"/>
         <w:rPr>
           <w:rFonts w:asciiTheme="minorHAnsi" w:eastAsia="Calibri" w:hAnsiTheme="minorHAnsi" w:cstheme="minorHAnsi"/>
-          <w:sz w:val="18"/>
-          <w:szCs w:val="18"/>
+          <w:sz w:val="17"/>
+          <w:szCs w:val="17"/>
         </w:rPr>
       </w:pPr>
       <w:r>
@@ -220,41 +212,25 @@
           <w:rFonts w:asciiTheme="minorHAnsi" w:eastAsia="Calibri" w:hAnsiTheme="minorHAnsi" w:cstheme="minorHAnsi"/>
           <w:b/>
           <w:bCs/>
-          <w:sz w:val="18"/>
-          <w:szCs w:val="18"/>
+          <w:sz w:val="17"/>
+          <w:szCs w:val="17"/>
         </w:rPr>
         <w:t xml:space="preserve">LLM Inference Optimization - </w:t>
       </w:r>
       <w:r>
         <w:rPr>
           <w:rFonts w:asciiTheme="minorHAnsi" w:eastAsia="Calibri" w:hAnsiTheme="minorHAnsi" w:cstheme="minorHAnsi"/>
-          <w:sz w:val="18"/>
-          <w:szCs w:val="18"/>
-        </w:rPr>
-        <w:t>Built an LLM inference benchmarking framework for GPT-2 (124M</w:t>
-      </w:r>
-      <w:r>
-        <w:rPr>
-          <w:rFonts w:asciiTheme="minorHAnsi" w:eastAsia="Calibri" w:hAnsiTheme="minorHAnsi" w:cstheme="minorHAnsi"/>
-          <w:sz w:val="18"/>
-          <w:szCs w:val="18"/>
-        </w:rPr>
-        <w:t>)</w:t>
-      </w:r>
-      <w:r>
-        <w:rPr>
-          <w:rFonts w:asciiTheme="minorHAnsi" w:eastAsia="Calibri" w:hAnsiTheme="minorHAnsi" w:cstheme="minorHAnsi"/>
-          <w:sz w:val="18"/>
-          <w:szCs w:val="18"/>
-        </w:rPr>
-        <w:t xml:space="preserve">, comparing </w:t>
+          <w:sz w:val="17"/>
+          <w:szCs w:val="17"/>
+        </w:rPr>
+        <w:t xml:space="preserve">Built an LLM inference benchmarking framework for GPT-2 (124M), comparing </w:t>
       </w:r>
       <w:proofErr w:type="spellStart"/>
       <w:r>
         <w:rPr>
           <w:rFonts w:asciiTheme="minorHAnsi" w:eastAsia="Calibri" w:hAnsiTheme="minorHAnsi" w:cstheme="minorHAnsi"/>
-          <w:sz w:val="18"/>
-          <w:szCs w:val="18"/>
+          <w:sz w:val="17"/>
+          <w:szCs w:val="17"/>
         </w:rPr>
         <w:t>PyTorch</w:t>
       </w:r>
@@ -262,8 +238,8 @@
       <w:r>
         <w:rPr>
           <w:rFonts w:asciiTheme="minorHAnsi" w:eastAsia="Calibri" w:hAnsiTheme="minorHAnsi" w:cstheme="minorHAnsi"/>
-          <w:sz w:val="18"/>
-          <w:szCs w:val="18"/>
+          <w:sz w:val="17"/>
+          <w:szCs w:val="17"/>
         </w:rPr>
         <w:t xml:space="preserve"> FP32/FP16, </w:t>
       </w:r>
@@ -272,16 +248,16 @@
           <w:rFonts w:asciiTheme="minorHAnsi" w:eastAsia="Calibri" w:hAnsiTheme="minorHAnsi" w:cstheme="minorHAnsi"/>
           <w:b/>
           <w:bCs/>
-          <w:sz w:val="18"/>
-          <w:szCs w:val="18"/>
+          <w:sz w:val="17"/>
+          <w:szCs w:val="17"/>
         </w:rPr>
         <w:t>SDPA</w:t>
       </w:r>
       <w:r>
         <w:rPr>
           <w:rFonts w:asciiTheme="minorHAnsi" w:eastAsia="Calibri" w:hAnsiTheme="minorHAnsi" w:cstheme="minorHAnsi"/>
-          <w:sz w:val="18"/>
-          <w:szCs w:val="18"/>
+          <w:sz w:val="17"/>
+          <w:szCs w:val="17"/>
         </w:rPr>
         <w:t xml:space="preserve">, </w:t>
       </w:r>
@@ -290,8 +266,8 @@
       <w:r>
         <w:rPr>
           <w:rFonts w:asciiTheme="minorHAnsi" w:eastAsia="Calibri" w:hAnsiTheme="minorHAnsi" w:cstheme="minorHAnsi"/>
-          <w:sz w:val="18"/>
-          <w:szCs w:val="18"/>
+          <w:sz w:val="17"/>
+          <w:szCs w:val="17"/>
         </w:rPr>
         <w:t>torch.compile</w:t>
       </w:r>
@@ -300,8 +276,8 @@
       <w:r>
         <w:rPr>
           <w:rFonts w:asciiTheme="minorHAnsi" w:eastAsia="Calibri" w:hAnsiTheme="minorHAnsi" w:cstheme="minorHAnsi"/>
-          <w:sz w:val="18"/>
-          <w:szCs w:val="18"/>
+          <w:sz w:val="17"/>
+          <w:szCs w:val="17"/>
         </w:rPr>
         <w:t xml:space="preserve">, </w:t>
       </w:r>
@@ -310,16 +286,16 @@
           <w:rFonts w:asciiTheme="minorHAnsi" w:eastAsia="Calibri" w:hAnsiTheme="minorHAnsi" w:cstheme="minorHAnsi"/>
           <w:b/>
           <w:bCs/>
-          <w:sz w:val="18"/>
-          <w:szCs w:val="18"/>
+          <w:sz w:val="17"/>
+          <w:szCs w:val="17"/>
         </w:rPr>
         <w:t>ONNX</w:t>
       </w:r>
       <w:r>
         <w:rPr>
           <w:rFonts w:asciiTheme="minorHAnsi" w:eastAsia="Calibri" w:hAnsiTheme="minorHAnsi" w:cstheme="minorHAnsi"/>
-          <w:sz w:val="18"/>
-          <w:szCs w:val="18"/>
+          <w:sz w:val="17"/>
+          <w:szCs w:val="17"/>
         </w:rPr>
         <w:t xml:space="preserve"> Runtime, and </w:t>
       </w:r>
@@ -329,8 +305,8 @@
           <w:rFonts w:asciiTheme="minorHAnsi" w:eastAsia="Calibri" w:hAnsiTheme="minorHAnsi" w:cstheme="minorHAnsi"/>
           <w:b/>
           <w:bCs/>
-          <w:sz w:val="18"/>
-          <w:szCs w:val="18"/>
+          <w:sz w:val="17"/>
+          <w:szCs w:val="17"/>
         </w:rPr>
         <w:t>TensorRT</w:t>
       </w:r>
@@ -338,8 +314,8 @@
       <w:r>
         <w:rPr>
           <w:rFonts w:asciiTheme="minorHAnsi" w:eastAsia="Calibri" w:hAnsiTheme="minorHAnsi" w:cstheme="minorHAnsi"/>
-          <w:sz w:val="18"/>
-          <w:szCs w:val="18"/>
+          <w:sz w:val="17"/>
+          <w:szCs w:val="17"/>
         </w:rPr>
         <w:t xml:space="preserve"> across batch sizes 1–16 and sequence lengths 64–256; measured latency, throughput, and GPU memory, achieving </w:t>
       </w:r>
@@ -348,16 +324,16 @@
           <w:rFonts w:asciiTheme="minorHAnsi" w:eastAsia="Calibri" w:hAnsiTheme="minorHAnsi" w:cstheme="minorHAnsi"/>
           <w:b/>
           <w:bCs/>
-          <w:sz w:val="18"/>
-          <w:szCs w:val="18"/>
+          <w:sz w:val="17"/>
+          <w:szCs w:val="17"/>
         </w:rPr>
         <w:t>~3.4× higher throughput</w:t>
       </w:r>
       <w:r>
         <w:rPr>
           <w:rFonts w:asciiTheme="minorHAnsi" w:eastAsia="Calibri" w:hAnsiTheme="minorHAnsi" w:cstheme="minorHAnsi"/>
-          <w:sz w:val="18"/>
-          <w:szCs w:val="18"/>
+          <w:sz w:val="17"/>
+          <w:szCs w:val="17"/>
         </w:rPr>
         <w:t xml:space="preserve"> (110K vs 32K tokens/s) and </w:t>
       </w:r>
@@ -366,16 +342,16 @@
           <w:rFonts w:asciiTheme="minorHAnsi" w:eastAsia="Calibri" w:hAnsiTheme="minorHAnsi" w:cstheme="minorHAnsi"/>
           <w:b/>
           <w:bCs/>
-          <w:sz w:val="18"/>
-          <w:szCs w:val="18"/>
+          <w:sz w:val="17"/>
+          <w:szCs w:val="17"/>
         </w:rPr>
         <w:t>~46% lower latency</w:t>
       </w:r>
       <w:r>
         <w:rPr>
           <w:rFonts w:asciiTheme="minorHAnsi" w:eastAsia="Calibri" w:hAnsiTheme="minorHAnsi" w:cstheme="minorHAnsi"/>
-          <w:sz w:val="18"/>
-          <w:szCs w:val="18"/>
+          <w:sz w:val="17"/>
+          <w:szCs w:val="17"/>
         </w:rPr>
         <w:t xml:space="preserve"> (16.5 </w:t>
       </w:r>
@@ -383,8 +359,8 @@
       <w:r>
         <w:rPr>
           <w:rFonts w:asciiTheme="minorHAnsi" w:eastAsia="Calibri" w:hAnsiTheme="minorHAnsi" w:cstheme="minorHAnsi"/>
-          <w:sz w:val="18"/>
-          <w:szCs w:val="18"/>
+          <w:sz w:val="17"/>
+          <w:szCs w:val="17"/>
         </w:rPr>
         <w:t>ms</w:t>
       </w:r>
@@ -392,8 +368,8 @@
       <w:r>
         <w:rPr>
           <w:rFonts w:asciiTheme="minorHAnsi" w:eastAsia="Calibri" w:hAnsiTheme="minorHAnsi" w:cstheme="minorHAnsi"/>
-          <w:sz w:val="18"/>
-          <w:szCs w:val="18"/>
+          <w:sz w:val="17"/>
+          <w:szCs w:val="17"/>
         </w:rPr>
         <w:t xml:space="preserve"> vs 30.3 </w:t>
       </w:r>
@@ -401,8 +377,8 @@
       <w:r>
         <w:rPr>
           <w:rFonts w:asciiTheme="minorHAnsi" w:eastAsia="Calibri" w:hAnsiTheme="minorHAnsi" w:cstheme="minorHAnsi"/>
-          <w:sz w:val="18"/>
-          <w:szCs w:val="18"/>
+          <w:sz w:val="17"/>
+          <w:szCs w:val="17"/>
         </w:rPr>
         <w:t>ms</w:t>
       </w:r>
@@ -410,8 +386,8 @@
       <w:r>
         <w:rPr>
           <w:rFonts w:asciiTheme="minorHAnsi" w:eastAsia="Calibri" w:hAnsiTheme="minorHAnsi" w:cstheme="minorHAnsi"/>
-          <w:sz w:val="18"/>
-          <w:szCs w:val="18"/>
+          <w:sz w:val="17"/>
+          <w:szCs w:val="17"/>
         </w:rPr>
         <w:t xml:space="preserve">) with </w:t>
       </w:r>
@@ -419,8 +395,8 @@
       <w:r>
         <w:rPr>
           <w:rFonts w:asciiTheme="minorHAnsi" w:eastAsia="Calibri" w:hAnsiTheme="minorHAnsi" w:cstheme="minorHAnsi"/>
-          <w:sz w:val="18"/>
-          <w:szCs w:val="18"/>
+          <w:sz w:val="17"/>
+          <w:szCs w:val="17"/>
         </w:rPr>
         <w:t>TensorRT</w:t>
       </w:r>
@@ -428,8 +404,8 @@
       <w:r>
         <w:rPr>
           <w:rFonts w:asciiTheme="minorHAnsi" w:eastAsia="Calibri" w:hAnsiTheme="minorHAnsi" w:cstheme="minorHAnsi"/>
-          <w:sz w:val="18"/>
-          <w:szCs w:val="18"/>
+          <w:sz w:val="17"/>
+          <w:szCs w:val="17"/>
         </w:rPr>
         <w:t xml:space="preserve"> over ONNX.</w:t>
       </w:r>
@@ -445,8 +421,8 @@
         <w:rPr>
           <w:rStyle w:val="fs13fw6overflow-hidden"/>
           <w:rFonts w:asciiTheme="minorHAnsi" w:eastAsia="Calibri" w:hAnsiTheme="minorHAnsi" w:cstheme="minorHAnsi"/>
-          <w:sz w:val="18"/>
-          <w:szCs w:val="18"/>
+          <w:sz w:val="17"/>
+          <w:szCs w:val="17"/>
         </w:rPr>
       </w:pPr>
       <w:r>
@@ -455,8 +431,8 @@
           <w:rFonts w:asciiTheme="minorHAnsi" w:eastAsia="Calibri" w:hAnsiTheme="minorHAnsi" w:cstheme="minorHAnsi"/>
           <w:b/>
           <w:bCs/>
-          <w:sz w:val="18"/>
-          <w:szCs w:val="18"/>
+          <w:sz w:val="17"/>
+          <w:szCs w:val="17"/>
         </w:rPr>
         <w:t>LLM Serv</w:t>
       </w:r>
@@ -466,8 +442,8 @@
           <w:rFonts w:asciiTheme="minorHAnsi" w:eastAsia="Calibri" w:hAnsiTheme="minorHAnsi" w:cstheme="minorHAnsi"/>
           <w:b/>
           <w:bCs/>
-          <w:sz w:val="18"/>
-          <w:szCs w:val="18"/>
+          <w:sz w:val="17"/>
+          <w:szCs w:val="17"/>
         </w:rPr>
         <w:t>ing Infrastructure -</w:t>
       </w:r>
@@ -475,16 +451,16 @@
         <w:rPr>
           <w:rStyle w:val="fs13fw6overflow-hidden"/>
           <w:rFonts w:asciiTheme="minorHAnsi" w:eastAsia="Calibri" w:hAnsiTheme="minorHAnsi" w:cstheme="minorHAnsi"/>
-          <w:sz w:val="18"/>
-          <w:szCs w:val="18"/>
+          <w:sz w:val="17"/>
+          <w:szCs w:val="17"/>
         </w:rPr>
         <w:t xml:space="preserve"> </w:t>
       </w:r>
       <w:r>
         <w:rPr>
           <w:rFonts w:asciiTheme="minorHAnsi" w:eastAsia="Calibri" w:hAnsiTheme="minorHAnsi" w:cstheme="minorHAnsi"/>
-          <w:sz w:val="18"/>
-          <w:szCs w:val="18"/>
+          <w:sz w:val="17"/>
+          <w:szCs w:val="17"/>
         </w:rPr>
         <w:t xml:space="preserve">Built a production-style GPU inference serving platform benchmarking </w:t>
       </w:r>
@@ -492,8 +468,8 @@
       <w:r>
         <w:rPr>
           <w:rFonts w:asciiTheme="minorHAnsi" w:eastAsia="Calibri" w:hAnsiTheme="minorHAnsi" w:cstheme="minorHAnsi"/>
-          <w:sz w:val="18"/>
-          <w:szCs w:val="18"/>
+          <w:sz w:val="17"/>
+          <w:szCs w:val="17"/>
         </w:rPr>
         <w:t>HuggingFace</w:t>
       </w:r>
@@ -501,8 +477,8 @@
       <w:r>
         <w:rPr>
           <w:rFonts w:asciiTheme="minorHAnsi" w:eastAsia="Calibri" w:hAnsiTheme="minorHAnsi" w:cstheme="minorHAnsi"/>
-          <w:sz w:val="18"/>
-          <w:szCs w:val="18"/>
+          <w:sz w:val="17"/>
+          <w:szCs w:val="17"/>
         </w:rPr>
         <w:t xml:space="preserve"> </w:t>
       </w:r>
@@ -512,8 +488,8 @@
           <w:rFonts w:asciiTheme="minorHAnsi" w:eastAsia="Calibri" w:hAnsiTheme="minorHAnsi" w:cstheme="minorHAnsi"/>
           <w:b/>
           <w:bCs/>
-          <w:sz w:val="18"/>
-          <w:szCs w:val="18"/>
+          <w:sz w:val="17"/>
+          <w:szCs w:val="17"/>
         </w:rPr>
         <w:t>FastAPI</w:t>
       </w:r>
@@ -521,8 +497,8 @@
       <w:r>
         <w:rPr>
           <w:rFonts w:asciiTheme="minorHAnsi" w:eastAsia="Calibri" w:hAnsiTheme="minorHAnsi" w:cstheme="minorHAnsi"/>
-          <w:sz w:val="18"/>
-          <w:szCs w:val="18"/>
+          <w:sz w:val="17"/>
+          <w:szCs w:val="17"/>
         </w:rPr>
         <w:t xml:space="preserve">, </w:t>
       </w:r>
@@ -532,8 +508,8 @@
           <w:rFonts w:asciiTheme="minorHAnsi" w:eastAsia="Calibri" w:hAnsiTheme="minorHAnsi" w:cstheme="minorHAnsi"/>
           <w:b/>
           <w:bCs/>
-          <w:sz w:val="18"/>
-          <w:szCs w:val="18"/>
+          <w:sz w:val="17"/>
+          <w:szCs w:val="17"/>
         </w:rPr>
         <w:t>vLLM</w:t>
       </w:r>
@@ -541,8 +517,8 @@
       <w:r>
         <w:rPr>
           <w:rFonts w:asciiTheme="minorHAnsi" w:eastAsia="Calibri" w:hAnsiTheme="minorHAnsi" w:cstheme="minorHAnsi"/>
-          <w:sz w:val="18"/>
-          <w:szCs w:val="18"/>
+          <w:sz w:val="17"/>
+          <w:szCs w:val="17"/>
         </w:rPr>
         <w:t xml:space="preserve">, </w:t>
       </w:r>
@@ -552,8 +528,8 @@
           <w:rFonts w:asciiTheme="minorHAnsi" w:eastAsia="Calibri" w:hAnsiTheme="minorHAnsi" w:cstheme="minorHAnsi"/>
           <w:b/>
           <w:bCs/>
-          <w:sz w:val="18"/>
-          <w:szCs w:val="18"/>
+          <w:sz w:val="17"/>
+          <w:szCs w:val="17"/>
         </w:rPr>
         <w:t>SGLang</w:t>
       </w:r>
@@ -561,8 +537,8 @@
       <w:r>
         <w:rPr>
           <w:rFonts w:asciiTheme="minorHAnsi" w:eastAsia="Calibri" w:hAnsiTheme="minorHAnsi" w:cstheme="minorHAnsi"/>
-          <w:sz w:val="18"/>
-          <w:szCs w:val="18"/>
+          <w:sz w:val="17"/>
+          <w:szCs w:val="17"/>
         </w:rPr>
         <w:t xml:space="preserve">, </w:t>
       </w:r>
@@ -572,8 +548,8 @@
           <w:rFonts w:asciiTheme="minorHAnsi" w:eastAsia="Calibri" w:hAnsiTheme="minorHAnsi" w:cstheme="minorHAnsi"/>
           <w:b/>
           <w:bCs/>
-          <w:sz w:val="18"/>
-          <w:szCs w:val="18"/>
+          <w:sz w:val="17"/>
+          <w:szCs w:val="17"/>
         </w:rPr>
         <w:t>TensorRT</w:t>
       </w:r>
@@ -583,16 +559,16 @@
           <w:rFonts w:asciiTheme="minorHAnsi" w:eastAsia="Calibri" w:hAnsiTheme="minorHAnsi" w:cstheme="minorHAnsi"/>
           <w:b/>
           <w:bCs/>
-          <w:sz w:val="18"/>
-          <w:szCs w:val="18"/>
+          <w:sz w:val="17"/>
+          <w:szCs w:val="17"/>
         </w:rPr>
         <w:t>-LLM</w:t>
       </w:r>
       <w:r>
         <w:rPr>
           <w:rFonts w:asciiTheme="minorHAnsi" w:eastAsia="Calibri" w:hAnsiTheme="minorHAnsi" w:cstheme="minorHAnsi"/>
-          <w:sz w:val="18"/>
-          <w:szCs w:val="18"/>
+          <w:sz w:val="17"/>
+          <w:szCs w:val="17"/>
         </w:rPr>
         <w:t xml:space="preserve">, and NVIDIA </w:t>
       </w:r>
@@ -601,16 +577,16 @@
           <w:rFonts w:asciiTheme="minorHAnsi" w:eastAsia="Calibri" w:hAnsiTheme="minorHAnsi" w:cstheme="minorHAnsi"/>
           <w:b/>
           <w:bCs/>
-          <w:sz w:val="18"/>
-          <w:szCs w:val="18"/>
+          <w:sz w:val="17"/>
+          <w:szCs w:val="17"/>
         </w:rPr>
         <w:t>Triton</w:t>
       </w:r>
       <w:r>
         <w:rPr>
           <w:rFonts w:asciiTheme="minorHAnsi" w:eastAsia="Calibri" w:hAnsiTheme="minorHAnsi" w:cstheme="minorHAnsi"/>
-          <w:sz w:val="18"/>
-          <w:szCs w:val="18"/>
+          <w:sz w:val="17"/>
+          <w:szCs w:val="17"/>
         </w:rPr>
         <w:t xml:space="preserve"> for GPT-2 FP16 workloads on an RTX 4080 Laptop GPU; measured p50/p95 latency, throughput, and GPU utilization, with </w:t>
       </w:r>
@@ -618,8 +594,8 @@
       <w:r>
         <w:rPr>
           <w:rFonts w:asciiTheme="minorHAnsi" w:eastAsia="Calibri" w:hAnsiTheme="minorHAnsi" w:cstheme="minorHAnsi"/>
-          <w:sz w:val="18"/>
-          <w:szCs w:val="18"/>
+          <w:sz w:val="17"/>
+          <w:szCs w:val="17"/>
         </w:rPr>
         <w:t>SGLang</w:t>
       </w:r>
@@ -627,8 +603,8 @@
       <w:r>
         <w:rPr>
           <w:rFonts w:asciiTheme="minorHAnsi" w:eastAsia="Calibri" w:hAnsiTheme="minorHAnsi" w:cstheme="minorHAnsi"/>
-          <w:sz w:val="18"/>
-          <w:szCs w:val="18"/>
+          <w:sz w:val="17"/>
+          <w:szCs w:val="17"/>
         </w:rPr>
         <w:t xml:space="preserve"> achieving </w:t>
       </w:r>
@@ -637,16 +613,16 @@
           <w:rFonts w:asciiTheme="minorHAnsi" w:eastAsia="Calibri" w:hAnsiTheme="minorHAnsi" w:cstheme="minorHAnsi"/>
           <w:b/>
           <w:bCs/>
-          <w:sz w:val="18"/>
-          <w:szCs w:val="18"/>
+          <w:sz w:val="17"/>
+          <w:szCs w:val="17"/>
         </w:rPr>
         <w:t>3.2× lower latency</w:t>
       </w:r>
       <w:r>
         <w:rPr>
           <w:rFonts w:asciiTheme="minorHAnsi" w:eastAsia="Calibri" w:hAnsiTheme="minorHAnsi" w:cstheme="minorHAnsi"/>
-          <w:sz w:val="18"/>
-          <w:szCs w:val="18"/>
+          <w:sz w:val="17"/>
+          <w:szCs w:val="17"/>
         </w:rPr>
         <w:t xml:space="preserve"> (80 vs 257 </w:t>
       </w:r>
@@ -654,8 +630,8 @@
       <w:r>
         <w:rPr>
           <w:rFonts w:asciiTheme="minorHAnsi" w:eastAsia="Calibri" w:hAnsiTheme="minorHAnsi" w:cstheme="minorHAnsi"/>
-          <w:sz w:val="18"/>
-          <w:szCs w:val="18"/>
+          <w:sz w:val="17"/>
+          <w:szCs w:val="17"/>
         </w:rPr>
         <w:t>ms</w:t>
       </w:r>
@@ -663,8 +639,8 @@
       <w:r>
         <w:rPr>
           <w:rFonts w:asciiTheme="minorHAnsi" w:eastAsia="Calibri" w:hAnsiTheme="minorHAnsi" w:cstheme="minorHAnsi"/>
-          <w:sz w:val="18"/>
-          <w:szCs w:val="18"/>
+          <w:sz w:val="17"/>
+          <w:szCs w:val="17"/>
         </w:rPr>
         <w:t xml:space="preserve">) and </w:t>
       </w:r>
@@ -673,16 +649,16 @@
           <w:rFonts w:asciiTheme="minorHAnsi" w:eastAsia="Calibri" w:hAnsiTheme="minorHAnsi" w:cstheme="minorHAnsi"/>
           <w:b/>
           <w:bCs/>
-          <w:sz w:val="18"/>
-          <w:szCs w:val="18"/>
+          <w:sz w:val="17"/>
+          <w:szCs w:val="17"/>
         </w:rPr>
         <w:t>3.2× higher throughput</w:t>
       </w:r>
       <w:r>
         <w:rPr>
           <w:rFonts w:asciiTheme="minorHAnsi" w:eastAsia="Calibri" w:hAnsiTheme="minorHAnsi" w:cstheme="minorHAnsi"/>
-          <w:sz w:val="18"/>
-          <w:szCs w:val="18"/>
+          <w:sz w:val="17"/>
+          <w:szCs w:val="17"/>
         </w:rPr>
         <w:t xml:space="preserve"> (12.4 vs 3.9 req/s) than </w:t>
       </w:r>
@@ -690,8 +666,8 @@
       <w:r>
         <w:rPr>
           <w:rFonts w:asciiTheme="minorHAnsi" w:eastAsia="Calibri" w:hAnsiTheme="minorHAnsi" w:cstheme="minorHAnsi"/>
-          <w:sz w:val="18"/>
-          <w:szCs w:val="18"/>
+          <w:sz w:val="17"/>
+          <w:szCs w:val="17"/>
         </w:rPr>
         <w:t>HuggingFace</w:t>
       </w:r>
@@ -699,8 +675,8 @@
       <w:r>
         <w:rPr>
           <w:rFonts w:asciiTheme="minorHAnsi" w:eastAsia="Calibri" w:hAnsiTheme="minorHAnsi" w:cstheme="minorHAnsi"/>
-          <w:sz w:val="18"/>
-          <w:szCs w:val="18"/>
+          <w:sz w:val="17"/>
+          <w:szCs w:val="17"/>
         </w:rPr>
         <w:t xml:space="preserve"> and Triton baselines while </w:t>
       </w:r>
@@ -708,8 +684,8 @@
       <w:r>
         <w:rPr>
           <w:rFonts w:asciiTheme="minorHAnsi" w:eastAsia="Calibri" w:hAnsiTheme="minorHAnsi" w:cstheme="minorHAnsi"/>
-          <w:sz w:val="18"/>
-          <w:szCs w:val="18"/>
+          <w:sz w:val="17"/>
+          <w:szCs w:val="17"/>
         </w:rPr>
         <w:t>TensorRT</w:t>
       </w:r>
@@ -717,8 +693,8 @@
       <w:r>
         <w:rPr>
           <w:rFonts w:asciiTheme="minorHAnsi" w:eastAsia="Calibri" w:hAnsiTheme="minorHAnsi" w:cstheme="minorHAnsi"/>
-          <w:sz w:val="18"/>
-          <w:szCs w:val="18"/>
+          <w:sz w:val="17"/>
+          <w:szCs w:val="17"/>
         </w:rPr>
         <w:t>-LLM delivered comparable performance through optimized LLM inference.</w:t>
       </w:r>
@@ -734,8 +710,10 @@
         <w:rPr>
           <w:rStyle w:val="fs13fw6overflow-hidden"/>
           <w:rFonts w:asciiTheme="minorHAnsi" w:eastAsia="Calibri" w:hAnsiTheme="minorHAnsi" w:cstheme="minorHAnsi"/>
-          <w:sz w:val="18"/>
-          <w:szCs w:val="18"/>
+          <w:b/>
+          <w:bCs/>
+          <w:sz w:val="17"/>
+          <w:szCs w:val="17"/>
         </w:rPr>
       </w:pPr>
       <w:r>
@@ -744,45 +722,68 @@
           <w:rFonts w:asciiTheme="minorHAnsi" w:eastAsia="Calibri" w:hAnsiTheme="minorHAnsi" w:cstheme="minorHAnsi"/>
           <w:b/>
           <w:bCs/>
-          <w:sz w:val="18"/>
-          <w:szCs w:val="18"/>
-        </w:rPr>
-        <w:t xml:space="preserve">GPU Profiling &amp; Analysis </w:t>
+          <w:sz w:val="17"/>
+          <w:szCs w:val="17"/>
+        </w:rPr>
+        <w:t>LLM Quantization Benchmarking -</w:t>
       </w:r>
       <w:r>
         <w:rPr>
           <w:rStyle w:val="fs13fw6overflow-hidden"/>
           <w:rFonts w:asciiTheme="minorHAnsi" w:eastAsia="Calibri" w:hAnsiTheme="minorHAnsi" w:cstheme="minorHAnsi"/>
-          <w:b/>
-          <w:bCs/>
-          <w:sz w:val="18"/>
-          <w:szCs w:val="18"/>
-        </w:rPr>
-        <w:t>-</w:t>
-      </w:r>
-      <w:r>
-        <w:rPr>
-          <w:rStyle w:val="fs13fw6overflow-hidden"/>
-          <w:rFonts w:asciiTheme="minorHAnsi" w:eastAsia="Calibri" w:hAnsiTheme="minorHAnsi" w:cstheme="minorHAnsi"/>
-          <w:sz w:val="18"/>
-          <w:szCs w:val="18"/>
+          <w:sz w:val="17"/>
+          <w:szCs w:val="17"/>
         </w:rPr>
         <w:t xml:space="preserve"> </w:t>
       </w:r>
       <w:r>
         <w:rPr>
           <w:rFonts w:asciiTheme="minorHAnsi" w:eastAsia="Calibri" w:hAnsiTheme="minorHAnsi" w:cstheme="minorHAnsi"/>
-          <w:sz w:val="18"/>
-          <w:szCs w:val="18"/>
-        </w:rPr>
-        <w:t xml:space="preserve">Profiled GPT-2 inference on an RTX 4080 Laptop GPU using </w:t>
+          <w:sz w:val="17"/>
+          <w:szCs w:val="17"/>
+        </w:rPr>
+        <w:t xml:space="preserve">Benchmarked GPT-2 across </w:t>
+      </w:r>
+      <w:r>
+        <w:rPr>
+          <w:rFonts w:asciiTheme="minorHAnsi" w:eastAsia="Calibri" w:hAnsiTheme="minorHAnsi" w:cstheme="minorHAnsi"/>
+          <w:sz w:val="17"/>
+          <w:szCs w:val="17"/>
+        </w:rPr>
+        <w:t>5</w:t>
+      </w:r>
+      <w:r>
+        <w:rPr>
+          <w:rFonts w:asciiTheme="minorHAnsi" w:eastAsia="Calibri" w:hAnsiTheme="minorHAnsi" w:cstheme="minorHAnsi"/>
+          <w:sz w:val="17"/>
+          <w:szCs w:val="17"/>
+        </w:rPr>
+        <w:t xml:space="preserve"> precision modes (FP32, FP16, INT8, INT4, </w:t>
+      </w:r>
+      <w:r>
+        <w:rPr>
+          <w:rFonts w:asciiTheme="minorHAnsi" w:eastAsia="Calibri" w:hAnsiTheme="minorHAnsi" w:cstheme="minorHAnsi"/>
+          <w:b/>
+          <w:bCs/>
+          <w:sz w:val="17"/>
+          <w:szCs w:val="17"/>
+        </w:rPr>
+        <w:t>NVFP4</w:t>
+      </w:r>
+      <w:r>
+        <w:rPr>
+          <w:rFonts w:asciiTheme="minorHAnsi" w:eastAsia="Calibri" w:hAnsiTheme="minorHAnsi" w:cstheme="minorHAnsi"/>
+          <w:sz w:val="17"/>
+          <w:szCs w:val="17"/>
+        </w:rPr>
+        <w:t xml:space="preserve">) using </w:t>
       </w:r>
       <w:proofErr w:type="spellStart"/>
       <w:r>
         <w:rPr>
           <w:rFonts w:asciiTheme="minorHAnsi" w:eastAsia="Calibri" w:hAnsiTheme="minorHAnsi" w:cstheme="minorHAnsi"/>
-          <w:sz w:val="18"/>
-          <w:szCs w:val="18"/>
+          <w:sz w:val="17"/>
+          <w:szCs w:val="17"/>
         </w:rPr>
         <w:t>PyTorch</w:t>
       </w:r>
@@ -790,46 +791,46 @@
       <w:r>
         <w:rPr>
           <w:rFonts w:asciiTheme="minorHAnsi" w:eastAsia="Calibri" w:hAnsiTheme="minorHAnsi" w:cstheme="minorHAnsi"/>
-          <w:sz w:val="18"/>
-          <w:szCs w:val="18"/>
-        </w:rPr>
-        <w:t xml:space="preserve"> </w:t>
-      </w:r>
-      <w:r>
-        <w:rPr>
-          <w:rFonts w:asciiTheme="minorHAnsi" w:eastAsia="Calibri" w:hAnsiTheme="minorHAnsi" w:cstheme="minorHAnsi"/>
-          <w:b/>
-          <w:bCs/>
-          <w:sz w:val="18"/>
-          <w:szCs w:val="18"/>
-        </w:rPr>
-        <w:t>Profiler</w:t>
-      </w:r>
-      <w:r>
-        <w:rPr>
-          <w:rFonts w:asciiTheme="minorHAnsi" w:eastAsia="Calibri" w:hAnsiTheme="minorHAnsi" w:cstheme="minorHAnsi"/>
-          <w:sz w:val="18"/>
-          <w:szCs w:val="18"/>
-        </w:rPr>
-        <w:t xml:space="preserve">, CUDA Events, and NVIDIA </w:t>
-      </w:r>
-      <w:r>
-        <w:rPr>
-          <w:rFonts w:asciiTheme="minorHAnsi" w:eastAsia="Calibri" w:hAnsiTheme="minorHAnsi" w:cstheme="minorHAnsi"/>
-          <w:b/>
-          <w:bCs/>
-          <w:sz w:val="18"/>
-          <w:szCs w:val="18"/>
-        </w:rPr>
-        <w:t>Nsight</w:t>
-      </w:r>
-      <w:r>
-        <w:rPr>
-          <w:rFonts w:asciiTheme="minorHAnsi" w:eastAsia="Calibri" w:hAnsiTheme="minorHAnsi" w:cstheme="minorHAnsi"/>
-          <w:sz w:val="18"/>
-          <w:szCs w:val="18"/>
-        </w:rPr>
-        <w:t xml:space="preserve"> Systems; analyzed batch sizes 1–32, identified GEMM-dominated execution (~76% kernel activity), synchronization overhead, and throughput saturation beyond batch size 8, achieving peak throughput of ~105K tokens/sec</w:t>
+          <w:sz w:val="17"/>
+          <w:szCs w:val="17"/>
+        </w:rPr>
+        <w:t>, optimum-</w:t>
+      </w:r>
+      <w:proofErr w:type="spellStart"/>
+      <w:r>
+        <w:rPr>
+          <w:rFonts w:asciiTheme="minorHAnsi" w:eastAsia="Calibri" w:hAnsiTheme="minorHAnsi" w:cstheme="minorHAnsi"/>
+          <w:sz w:val="17"/>
+          <w:szCs w:val="17"/>
+        </w:rPr>
+        <w:t>quanto</w:t>
+      </w:r>
+      <w:proofErr w:type="spellEnd"/>
+      <w:r>
+        <w:rPr>
+          <w:rFonts w:asciiTheme="minorHAnsi" w:eastAsia="Calibri" w:hAnsiTheme="minorHAnsi" w:cstheme="minorHAnsi"/>
+          <w:sz w:val="17"/>
+          <w:szCs w:val="17"/>
+        </w:rPr>
+        <w:t xml:space="preserve">, and </w:t>
+      </w:r>
+      <w:proofErr w:type="spellStart"/>
+      <w:r>
+        <w:rPr>
+          <w:rFonts w:asciiTheme="minorHAnsi" w:eastAsia="Calibri" w:hAnsiTheme="minorHAnsi" w:cstheme="minorHAnsi"/>
+          <w:sz w:val="17"/>
+          <w:szCs w:val="17"/>
+        </w:rPr>
+        <w:t>torchao</w:t>
+      </w:r>
+      <w:proofErr w:type="spellEnd"/>
+      <w:r>
+        <w:rPr>
+          <w:rFonts w:asciiTheme="minorHAnsi" w:eastAsia="Calibri" w:hAnsiTheme="minorHAnsi" w:cstheme="minorHAnsi"/>
+          <w:sz w:val="17"/>
+          <w:szCs w:val="17"/>
+        </w:rPr>
+        <w:t>; FP16 delivered 3.2× lower latency, 120K tokens/s throughput, and 47% memory reduction with negligible accuracy loss; validated quantization tradeoffs via perplexity-based evaluation across all precision levels</w:t>
       </w:r>
     </w:p>
     <w:p>
@@ -841,52 +842,94 @@
         </w:numPr>
         <w:jc w:val="both"/>
         <w:rPr>
+          <w:rFonts w:asciiTheme="minorHAnsi" w:eastAsia="Calibri" w:hAnsiTheme="minorHAnsi" w:cstheme="minorHAnsi"/>
+          <w:sz w:val="17"/>
+          <w:szCs w:val="17"/>
+        </w:rPr>
+      </w:pPr>
+      <w:r>
+        <w:rPr>
           <w:rStyle w:val="fs13fw6overflow-hidden"/>
           <w:rFonts w:asciiTheme="minorHAnsi" w:eastAsia="Calibri" w:hAnsiTheme="minorHAnsi" w:cstheme="minorHAnsi"/>
           <w:b/>
           <w:bCs/>
-          <w:sz w:val="18"/>
-          <w:szCs w:val="18"/>
-        </w:rPr>
-      </w:pPr>
+          <w:sz w:val="17"/>
+          <w:szCs w:val="17"/>
+        </w:rPr>
+        <w:t xml:space="preserve">Foundation Model Quantization &amp; Optimization - </w:t>
+      </w:r>
       <w:r>
         <w:rPr>
           <w:rStyle w:val="fs13fw6overflow-hidden"/>
           <w:rFonts w:asciiTheme="minorHAnsi" w:eastAsia="Calibri" w:hAnsiTheme="minorHAnsi" w:cstheme="minorHAnsi"/>
-          <w:b/>
-          <w:bCs/>
-          <w:sz w:val="18"/>
-          <w:szCs w:val="18"/>
-        </w:rPr>
-        <w:t xml:space="preserve">LLM Quantization Benchmarking </w:t>
-      </w:r>
+          <w:sz w:val="17"/>
+          <w:szCs w:val="17"/>
+        </w:rPr>
+        <w:t xml:space="preserve">Quantized Lag-Llama time-series foundation model using 4-bit </w:t>
+      </w:r>
+      <w:proofErr w:type="spellStart"/>
       <w:r>
         <w:rPr>
           <w:rStyle w:val="fs13fw6overflow-hidden"/>
           <w:rFonts w:asciiTheme="minorHAnsi" w:eastAsia="Calibri" w:hAnsiTheme="minorHAnsi" w:cstheme="minorHAnsi"/>
           <w:b/>
           <w:bCs/>
-          <w:sz w:val="18"/>
-          <w:szCs w:val="18"/>
-        </w:rPr>
-        <w:t>-</w:t>
-      </w:r>
+          <w:sz w:val="17"/>
+          <w:szCs w:val="17"/>
+        </w:rPr>
+        <w:t>bitsandbytes</w:t>
+      </w:r>
+      <w:proofErr w:type="spellEnd"/>
       <w:r>
         <w:rPr>
           <w:rStyle w:val="fs13fw6overflow-hidden"/>
           <w:rFonts w:asciiTheme="minorHAnsi" w:eastAsia="Calibri" w:hAnsiTheme="minorHAnsi" w:cstheme="minorHAnsi"/>
-          <w:sz w:val="18"/>
-          <w:szCs w:val="18"/>
+          <w:sz w:val="17"/>
+          <w:szCs w:val="17"/>
+        </w:rPr>
+        <w:t xml:space="preserve"> NF4 and </w:t>
+      </w:r>
+      <w:proofErr w:type="spellStart"/>
+      <w:r>
+        <w:rPr>
+          <w:rStyle w:val="fs13fw6overflow-hidden"/>
+          <w:rFonts w:asciiTheme="minorHAnsi" w:eastAsia="Calibri" w:hAnsiTheme="minorHAnsi" w:cstheme="minorHAnsi"/>
+          <w:sz w:val="17"/>
+          <w:szCs w:val="17"/>
+        </w:rPr>
+        <w:t>PyTorch</w:t>
+      </w:r>
+      <w:proofErr w:type="spellEnd"/>
+      <w:r>
+        <w:rPr>
+          <w:rStyle w:val="fs13fw6overflow-hidden"/>
+          <w:rFonts w:asciiTheme="minorHAnsi" w:eastAsia="Calibri" w:hAnsiTheme="minorHAnsi" w:cstheme="minorHAnsi"/>
+          <w:sz w:val="17"/>
+          <w:szCs w:val="17"/>
         </w:rPr>
         <w:t xml:space="preserve"> </w:t>
       </w:r>
-      <w:r>
-        <w:rPr>
-          <w:rFonts w:asciiTheme="minorHAnsi" w:eastAsia="Calibri" w:hAnsiTheme="minorHAnsi" w:cstheme="minorHAnsi"/>
-          <w:sz w:val="18"/>
-          <w:szCs w:val="18"/>
-        </w:rPr>
-        <w:t>Built a GPU inference benchmarking framework to evaluate FP32, FP16, INT8, and INT4 precision modes for GPT-2 on an NVIDIA RTX 4080; achieved 3.2× latency reduction, 3× throughput improvement (120K tokens/s), and 48% memory savings with FP16 while quantifying the accuracy and performance impact of low-bit quantization through perplexity-based evaluation</w:t>
+      <w:proofErr w:type="spellStart"/>
+      <w:r>
+        <w:rPr>
+          <w:rStyle w:val="fs13fw6overflow-hidden"/>
+          <w:rFonts w:asciiTheme="minorHAnsi" w:eastAsia="Calibri" w:hAnsiTheme="minorHAnsi" w:cstheme="minorHAnsi"/>
+          <w:b/>
+          <w:bCs/>
+          <w:sz w:val="17"/>
+          <w:szCs w:val="17"/>
+        </w:rPr>
+        <w:t>torchao</w:t>
+      </w:r>
+      <w:proofErr w:type="spellEnd"/>
+      <w:r>
+        <w:rPr>
+          <w:rStyle w:val="fs13fw6overflow-hidden"/>
+          <w:rFonts w:asciiTheme="minorHAnsi" w:eastAsia="Calibri" w:hAnsiTheme="minorHAnsi" w:cstheme="minorHAnsi"/>
+          <w:sz w:val="17"/>
+          <w:szCs w:val="17"/>
+        </w:rPr>
+        <w:t xml:space="preserve"> INT4 weight-only quantization; benchmarked latency, memory usage, and zero-shot forecasting accuracy across multiple datasets, achieving up to 39% GPU memory reduction while analyzing quantization kernel constraints and accuracy-performance tradeoffs</w:t>
       </w:r>
     </w:p>
     <w:p>
@@ -898,124 +941,68 @@
         </w:numPr>
         <w:jc w:val="both"/>
         <w:rPr>
-          <w:rStyle w:val="fs13fw6overflow-hidden"/>
-          <w:rFonts w:asciiTheme="minorHAnsi" w:eastAsia="Calibri" w:hAnsiTheme="minorHAnsi" w:cstheme="minorHAnsi"/>
-          <w:b/>
-          <w:bCs/>
-          <w:sz w:val="18"/>
-          <w:szCs w:val="18"/>
-        </w:rPr>
-      </w:pPr>
-      <w:r>
-        <w:rPr>
-          <w:rStyle w:val="fs13fw6overflow-hidden"/>
-          <w:rFonts w:asciiTheme="minorHAnsi" w:eastAsia="Calibri" w:hAnsiTheme="minorHAnsi" w:cstheme="minorHAnsi"/>
-          <w:b/>
-          <w:bCs/>
-          <w:sz w:val="18"/>
-          <w:szCs w:val="18"/>
-        </w:rPr>
-        <w:t xml:space="preserve">AI Workload Analysis </w:t>
-      </w:r>
-      <w:r>
-        <w:rPr>
-          <w:rStyle w:val="fs13fw6overflow-hidden"/>
-          <w:rFonts w:asciiTheme="minorHAnsi" w:eastAsia="Calibri" w:hAnsiTheme="minorHAnsi" w:cstheme="minorHAnsi"/>
-          <w:b/>
-          <w:bCs/>
-          <w:sz w:val="18"/>
-          <w:szCs w:val="18"/>
-        </w:rPr>
-        <w:t>-</w:t>
-      </w:r>
-      <w:r>
-        <w:rPr>
-          <w:rStyle w:val="fs13fw6overflow-hidden"/>
-          <w:rFonts w:asciiTheme="minorHAnsi" w:eastAsia="Calibri" w:hAnsiTheme="minorHAnsi" w:cstheme="minorHAnsi"/>
-          <w:sz w:val="18"/>
-          <w:szCs w:val="18"/>
-        </w:rPr>
-        <w:t xml:space="preserve"> </w:t>
-      </w:r>
-      <w:r>
-        <w:rPr>
-          <w:rFonts w:asciiTheme="minorHAnsi" w:eastAsia="Calibri" w:hAnsiTheme="minorHAnsi" w:cstheme="minorHAnsi"/>
-          <w:sz w:val="18"/>
-          <w:szCs w:val="18"/>
-        </w:rPr>
-        <w:t xml:space="preserve">Conducted comparative performance analysis of </w:t>
-      </w:r>
-      <w:r>
-        <w:rPr>
-          <w:rFonts w:asciiTheme="minorHAnsi" w:eastAsia="Calibri" w:hAnsiTheme="minorHAnsi" w:cstheme="minorHAnsi"/>
-          <w:b/>
-          <w:bCs/>
-          <w:sz w:val="18"/>
-          <w:szCs w:val="18"/>
-        </w:rPr>
-        <w:t>GPT-2</w:t>
-      </w:r>
-      <w:r>
-        <w:rPr>
-          <w:rFonts w:asciiTheme="minorHAnsi" w:eastAsia="Calibri" w:hAnsiTheme="minorHAnsi" w:cstheme="minorHAnsi"/>
-          <w:sz w:val="18"/>
-          <w:szCs w:val="18"/>
-        </w:rPr>
-        <w:t xml:space="preserve">, </w:t>
-      </w:r>
-      <w:r>
-        <w:rPr>
-          <w:rFonts w:asciiTheme="minorHAnsi" w:eastAsia="Calibri" w:hAnsiTheme="minorHAnsi" w:cstheme="minorHAnsi"/>
-          <w:b/>
-          <w:bCs/>
-          <w:sz w:val="18"/>
-          <w:szCs w:val="18"/>
-        </w:rPr>
-        <w:t>DistilGPT-2</w:t>
-      </w:r>
-      <w:r>
-        <w:rPr>
-          <w:rFonts w:asciiTheme="minorHAnsi" w:eastAsia="Calibri" w:hAnsiTheme="minorHAnsi" w:cstheme="minorHAnsi"/>
-          <w:sz w:val="18"/>
-          <w:szCs w:val="18"/>
-        </w:rPr>
-        <w:t xml:space="preserve">, </w:t>
-      </w:r>
-      <w:r>
-        <w:rPr>
-          <w:rFonts w:asciiTheme="minorHAnsi" w:eastAsia="Calibri" w:hAnsiTheme="minorHAnsi" w:cstheme="minorHAnsi"/>
-          <w:b/>
-          <w:bCs/>
-          <w:sz w:val="18"/>
-          <w:szCs w:val="18"/>
-        </w:rPr>
-        <w:t>BERT-base</w:t>
-      </w:r>
-      <w:r>
-        <w:rPr>
-          <w:rFonts w:asciiTheme="minorHAnsi" w:eastAsia="Calibri" w:hAnsiTheme="minorHAnsi" w:cstheme="minorHAnsi"/>
-          <w:sz w:val="18"/>
-          <w:szCs w:val="18"/>
-        </w:rPr>
-        <w:t xml:space="preserve">, and </w:t>
-      </w:r>
-      <w:r>
-        <w:rPr>
-          <w:rFonts w:asciiTheme="minorHAnsi" w:eastAsia="Calibri" w:hAnsiTheme="minorHAnsi" w:cstheme="minorHAnsi"/>
-          <w:b/>
-          <w:bCs/>
-          <w:sz w:val="18"/>
-          <w:szCs w:val="18"/>
-        </w:rPr>
-        <w:t>ResNet-50</w:t>
-      </w:r>
-      <w:r>
-        <w:rPr>
-          <w:rFonts w:asciiTheme="minorHAnsi" w:eastAsia="Calibri" w:hAnsiTheme="minorHAnsi" w:cstheme="minorHAnsi"/>
-          <w:sz w:val="18"/>
-          <w:szCs w:val="18"/>
-        </w:rPr>
-        <w:t xml:space="preserve"> on an RTX 4080 GPU, measuring latency, throughput, memory footprint, FLOPs, and Model FLOP Utilization (MFU); identified batching saturation at batch sizes 8–16 and achieved up to 39% MFU during FP16 inference</w:t>
+          <w:rFonts w:asciiTheme="minorHAnsi" w:eastAsia="Calibri" w:hAnsiTheme="minorHAnsi" w:cstheme="minorHAnsi"/>
+          <w:b/>
+          <w:bCs/>
+          <w:sz w:val="17"/>
+          <w:szCs w:val="17"/>
+        </w:rPr>
+      </w:pPr>
+      <w:r>
+        <w:rPr>
+          <w:rFonts w:asciiTheme="minorHAnsi" w:eastAsia="Calibri" w:hAnsiTheme="minorHAnsi" w:cstheme="minorHAnsi"/>
+          <w:b/>
+          <w:bCs/>
+          <w:sz w:val="17"/>
+          <w:szCs w:val="17"/>
+        </w:rPr>
+        <w:t xml:space="preserve">Distributed Deep Learning Training Systems - </w:t>
+      </w:r>
+      <w:r>
+        <w:rPr>
+          <w:rFonts w:asciiTheme="minorHAnsi" w:eastAsia="Calibri" w:hAnsiTheme="minorHAnsi" w:cstheme="minorHAnsi"/>
+          <w:sz w:val="17"/>
+          <w:szCs w:val="17"/>
+        </w:rPr>
+        <w:t xml:space="preserve">Implemented BERT-base (110M) distributed fine-tuning on GLUE SST-2 across baseline </w:t>
+      </w:r>
+      <w:proofErr w:type="spellStart"/>
+      <w:r>
+        <w:rPr>
+          <w:rFonts w:asciiTheme="minorHAnsi" w:eastAsia="Calibri" w:hAnsiTheme="minorHAnsi" w:cstheme="minorHAnsi"/>
+          <w:sz w:val="17"/>
+          <w:szCs w:val="17"/>
+        </w:rPr>
+        <w:t>PyTorch</w:t>
+      </w:r>
+      <w:proofErr w:type="spellEnd"/>
+      <w:r>
+        <w:rPr>
+          <w:rFonts w:asciiTheme="minorHAnsi" w:eastAsia="Calibri" w:hAnsiTheme="minorHAnsi" w:cstheme="minorHAnsi"/>
+          <w:sz w:val="17"/>
+          <w:szCs w:val="17"/>
+        </w:rPr>
+        <w:t xml:space="preserve">, manual DDP, production </w:t>
+      </w:r>
+      <w:proofErr w:type="spellStart"/>
+      <w:r>
+        <w:rPr>
+          <w:rFonts w:asciiTheme="minorHAnsi" w:eastAsia="Calibri" w:hAnsiTheme="minorHAnsi" w:cstheme="minorHAnsi"/>
+          <w:b/>
+          <w:bCs/>
+          <w:sz w:val="17"/>
+          <w:szCs w:val="17"/>
+        </w:rPr>
+        <w:t>DistributedDataParallel</w:t>
+      </w:r>
+      <w:proofErr w:type="spellEnd"/>
+      <w:r>
+        <w:rPr>
+          <w:rFonts w:asciiTheme="minorHAnsi" w:eastAsia="Calibri" w:hAnsiTheme="minorHAnsi" w:cstheme="minorHAnsi"/>
+          <w:sz w:val="17"/>
+          <w:szCs w:val="17"/>
+        </w:rPr>
+        <w:t>, and a from-scratch multiprocessing-based DDP implementation; rebuilt gradient synchronization using custom broadcast/all-reduce primitives to demonstrate model replication, distributed sampling, and process coordination</w:t>
       </w:r>
     </w:p>
     <w:p>
@@ -1031,8 +1018,8 @@
           <w:rFonts w:asciiTheme="minorHAnsi" w:eastAsia="Calibri" w:hAnsiTheme="minorHAnsi" w:cstheme="minorHAnsi"/>
           <w:b/>
           <w:bCs/>
-          <w:sz w:val="18"/>
-          <w:szCs w:val="18"/>
+          <w:sz w:val="17"/>
+          <w:szCs w:val="17"/>
         </w:rPr>
       </w:pPr>
       <w:r>
@@ -1041,74 +1028,182 @@
           <w:rFonts w:asciiTheme="minorHAnsi" w:eastAsia="Calibri" w:hAnsiTheme="minorHAnsi" w:cstheme="minorHAnsi"/>
           <w:b/>
           <w:bCs/>
-          <w:sz w:val="18"/>
-          <w:szCs w:val="18"/>
-        </w:rPr>
-        <w:t>CUDA Kernel Optimization</w:t>
+          <w:sz w:val="17"/>
+          <w:szCs w:val="17"/>
+        </w:rPr>
+        <w:t>AI Workload Analysis -</w:t>
       </w:r>
       <w:r>
         <w:rPr>
           <w:rStyle w:val="fs13fw6overflow-hidden"/>
           <w:rFonts w:asciiTheme="minorHAnsi" w:eastAsia="Calibri" w:hAnsiTheme="minorHAnsi" w:cstheme="minorHAnsi"/>
-          <w:b/>
-          <w:bCs/>
-          <w:sz w:val="18"/>
-          <w:szCs w:val="18"/>
+          <w:sz w:val="17"/>
+          <w:szCs w:val="17"/>
         </w:rPr>
         <w:t xml:space="preserve"> </w:t>
       </w:r>
       <w:r>
         <w:rPr>
+          <w:rFonts w:asciiTheme="minorHAnsi" w:eastAsia="Calibri" w:hAnsiTheme="minorHAnsi" w:cstheme="minorHAnsi"/>
+          <w:sz w:val="17"/>
+          <w:szCs w:val="17"/>
+        </w:rPr>
+        <w:t xml:space="preserve">Conducted comparative performance analysis of </w:t>
+      </w:r>
+      <w:r>
+        <w:rPr>
+          <w:rFonts w:asciiTheme="minorHAnsi" w:eastAsia="Calibri" w:hAnsiTheme="minorHAnsi" w:cstheme="minorHAnsi"/>
+          <w:b/>
+          <w:bCs/>
+          <w:sz w:val="17"/>
+          <w:szCs w:val="17"/>
+        </w:rPr>
+        <w:t>GPT-2</w:t>
+      </w:r>
+      <w:r>
+        <w:rPr>
+          <w:rFonts w:asciiTheme="minorHAnsi" w:eastAsia="Calibri" w:hAnsiTheme="minorHAnsi" w:cstheme="minorHAnsi"/>
+          <w:sz w:val="17"/>
+          <w:szCs w:val="17"/>
+        </w:rPr>
+        <w:t xml:space="preserve">, </w:t>
+      </w:r>
+      <w:r>
+        <w:rPr>
+          <w:rFonts w:asciiTheme="minorHAnsi" w:eastAsia="Calibri" w:hAnsiTheme="minorHAnsi" w:cstheme="minorHAnsi"/>
+          <w:b/>
+          <w:bCs/>
+          <w:sz w:val="17"/>
+          <w:szCs w:val="17"/>
+        </w:rPr>
+        <w:t>DistilGPT-2</w:t>
+      </w:r>
+      <w:r>
+        <w:rPr>
+          <w:rFonts w:asciiTheme="minorHAnsi" w:eastAsia="Calibri" w:hAnsiTheme="minorHAnsi" w:cstheme="minorHAnsi"/>
+          <w:sz w:val="17"/>
+          <w:szCs w:val="17"/>
+        </w:rPr>
+        <w:t xml:space="preserve">, </w:t>
+      </w:r>
+      <w:r>
+        <w:rPr>
+          <w:rFonts w:asciiTheme="minorHAnsi" w:eastAsia="Calibri" w:hAnsiTheme="minorHAnsi" w:cstheme="minorHAnsi"/>
+          <w:b/>
+          <w:bCs/>
+          <w:sz w:val="17"/>
+          <w:szCs w:val="17"/>
+        </w:rPr>
+        <w:t>BERT-base</w:t>
+      </w:r>
+      <w:r>
+        <w:rPr>
+          <w:rFonts w:asciiTheme="minorHAnsi" w:eastAsia="Calibri" w:hAnsiTheme="minorHAnsi" w:cstheme="minorHAnsi"/>
+          <w:sz w:val="17"/>
+          <w:szCs w:val="17"/>
+        </w:rPr>
+        <w:t xml:space="preserve">, and </w:t>
+      </w:r>
+      <w:r>
+        <w:rPr>
+          <w:rFonts w:asciiTheme="minorHAnsi" w:eastAsia="Calibri" w:hAnsiTheme="minorHAnsi" w:cstheme="minorHAnsi"/>
+          <w:b/>
+          <w:bCs/>
+          <w:sz w:val="17"/>
+          <w:szCs w:val="17"/>
+        </w:rPr>
+        <w:t>ResNet-50</w:t>
+      </w:r>
+      <w:r>
+        <w:rPr>
+          <w:rFonts w:asciiTheme="minorHAnsi" w:eastAsia="Calibri" w:hAnsiTheme="minorHAnsi" w:cstheme="minorHAnsi"/>
+          <w:sz w:val="17"/>
+          <w:szCs w:val="17"/>
+        </w:rPr>
+        <w:t>, measuring latency, throughput, memory footprint,</w:t>
+      </w:r>
+      <w:r>
+        <w:rPr>
+          <w:rFonts w:asciiTheme="minorHAnsi" w:eastAsia="Calibri" w:hAnsiTheme="minorHAnsi" w:cstheme="minorHAnsi"/>
+          <w:sz w:val="17"/>
+          <w:szCs w:val="17"/>
+        </w:rPr>
+        <w:t xml:space="preserve"> and</w:t>
+      </w:r>
+      <w:r>
+        <w:rPr>
+          <w:rFonts w:asciiTheme="minorHAnsi" w:eastAsia="Calibri" w:hAnsiTheme="minorHAnsi" w:cstheme="minorHAnsi"/>
+          <w:sz w:val="17"/>
+          <w:szCs w:val="17"/>
+        </w:rPr>
+        <w:t xml:space="preserve"> FLOPs</w:t>
+      </w:r>
+      <w:r>
+        <w:rPr>
+          <w:rFonts w:asciiTheme="minorHAnsi" w:eastAsia="Calibri" w:hAnsiTheme="minorHAnsi" w:cstheme="minorHAnsi"/>
+          <w:sz w:val="17"/>
+          <w:szCs w:val="17"/>
+        </w:rPr>
+        <w:t>;</w:t>
+      </w:r>
+      <w:r>
+        <w:rPr>
+          <w:rFonts w:asciiTheme="minorHAnsi" w:eastAsia="Calibri" w:hAnsiTheme="minorHAnsi" w:cstheme="minorHAnsi"/>
+          <w:sz w:val="17"/>
+          <w:szCs w:val="17"/>
+        </w:rPr>
+        <w:t xml:space="preserve"> identified batching saturation at batch sizes 8–16 and achieved up to 39% MFU during FP16 inference</w:t>
+      </w:r>
+    </w:p>
+    <w:p>
+      <w:pPr>
+        <w:pStyle w:val="ListParagraph"/>
+        <w:numPr>
+          <w:ilvl w:val="0"/>
+          <w:numId w:val="19"/>
+        </w:numPr>
+        <w:jc w:val="both"/>
+        <w:rPr>
           <w:rStyle w:val="fs13fw6overflow-hidden"/>
           <w:rFonts w:asciiTheme="minorHAnsi" w:eastAsia="Calibri" w:hAnsiTheme="minorHAnsi" w:cstheme="minorHAnsi"/>
-          <w:b/>
-          <w:bCs/>
-          <w:sz w:val="18"/>
-          <w:szCs w:val="18"/>
-        </w:rPr>
-        <w:t>-</w:t>
-      </w:r>
+          <w:sz w:val="17"/>
+          <w:szCs w:val="17"/>
+        </w:rPr>
+      </w:pPr>
       <w:r>
         <w:rPr>
           <w:rStyle w:val="fs13fw6overflow-hidden"/>
           <w:rFonts w:asciiTheme="minorHAnsi" w:eastAsia="Calibri" w:hAnsiTheme="minorHAnsi" w:cstheme="minorHAnsi"/>
-          <w:sz w:val="18"/>
-          <w:szCs w:val="18"/>
+          <w:b/>
+          <w:bCs/>
+          <w:sz w:val="17"/>
+          <w:szCs w:val="17"/>
+        </w:rPr>
+        <w:t>GPU Profiling &amp; Analysis -</w:t>
+      </w:r>
+      <w:r>
+        <w:rPr>
+          <w:rStyle w:val="fs13fw6overflow-hidden"/>
+          <w:rFonts w:asciiTheme="minorHAnsi" w:eastAsia="Calibri" w:hAnsiTheme="minorHAnsi" w:cstheme="minorHAnsi"/>
+          <w:sz w:val="17"/>
+          <w:szCs w:val="17"/>
         </w:rPr>
         <w:t xml:space="preserve"> </w:t>
       </w:r>
       <w:r>
         <w:rPr>
           <w:rFonts w:asciiTheme="minorHAnsi" w:eastAsia="Calibri" w:hAnsiTheme="minorHAnsi" w:cstheme="minorHAnsi"/>
-          <w:sz w:val="18"/>
-          <w:szCs w:val="18"/>
-        </w:rPr>
-        <w:t xml:space="preserve">Developed custom </w:t>
-      </w:r>
-      <w:r>
-        <w:rPr>
-          <w:rFonts w:asciiTheme="minorHAnsi" w:eastAsia="Calibri" w:hAnsiTheme="minorHAnsi" w:cstheme="minorHAnsi"/>
-          <w:b/>
-          <w:bCs/>
-          <w:sz w:val="18"/>
-          <w:szCs w:val="18"/>
-        </w:rPr>
-        <w:t>CUDA kernels</w:t>
-      </w:r>
-      <w:r>
-        <w:rPr>
-          <w:rFonts w:asciiTheme="minorHAnsi" w:eastAsia="Calibri" w:hAnsiTheme="minorHAnsi" w:cstheme="minorHAnsi"/>
-          <w:sz w:val="18"/>
-          <w:szCs w:val="18"/>
-        </w:rPr>
-        <w:t xml:space="preserve"> (vector addition, tiled matrix multiplication, and warp-shuffle reduction) as </w:t>
+          <w:sz w:val="17"/>
+          <w:szCs w:val="17"/>
+        </w:rPr>
+        <w:t xml:space="preserve">Analyzed GPT-2 inference performance with </w:t>
       </w:r>
       <w:proofErr w:type="spellStart"/>
       <w:r>
         <w:rPr>
           <w:rFonts w:asciiTheme="minorHAnsi" w:eastAsia="Calibri" w:hAnsiTheme="minorHAnsi" w:cstheme="minorHAnsi"/>
-          <w:sz w:val="18"/>
-          <w:szCs w:val="18"/>
+          <w:sz w:val="17"/>
+          <w:szCs w:val="17"/>
         </w:rPr>
         <w:t>PyTorch</w:t>
       </w:r>
@@ -1116,10 +1211,10 @@
       <w:r>
         <w:rPr>
           <w:rFonts w:asciiTheme="minorHAnsi" w:eastAsia="Calibri" w:hAnsiTheme="minorHAnsi" w:cstheme="minorHAnsi"/>
-          <w:sz w:val="18"/>
-          <w:szCs w:val="18"/>
-        </w:rPr>
-        <w:t xml:space="preserve"> C++ extensions; achieved 630 GB/s memory bandwidth, 486 GFLOPS compute throughput, and up to 41× speedup over CPU baselines on an RTX 4080 Laptop GPU</w:t>
+          <w:sz w:val="17"/>
+          <w:szCs w:val="17"/>
+        </w:rPr>
+        <w:t xml:space="preserve"> Profiler and NVIDIA Nsight Systems; identified GPU bottlenecks, optimized batch scaling, and achieved ~105K tokens/sec throughput.</w:t>
       </w:r>
     </w:p>
     <w:p>
@@ -1170,8 +1265,8 @@
         <w:rPr>
           <w:rStyle w:val="fs13fw4"/>
           <w:rFonts w:asciiTheme="minorHAnsi" w:eastAsia="Calibri" w:hAnsiTheme="minorHAnsi" w:cstheme="minorHAnsi"/>
-          <w:sz w:val="18"/>
-          <w:szCs w:val="18"/>
+          <w:sz w:val="17"/>
+          <w:szCs w:val="17"/>
         </w:rPr>
       </w:pPr>
       <w:r>
@@ -1180,8 +1275,8 @@
           <w:rFonts w:asciiTheme="minorHAnsi" w:eastAsia="Calibri" w:hAnsiTheme="minorHAnsi" w:cstheme="minorHAnsi"/>
           <w:b/>
           <w:bCs/>
-          <w:sz w:val="18"/>
-          <w:szCs w:val="18"/>
+          <w:sz w:val="17"/>
+          <w:szCs w:val="17"/>
         </w:rPr>
         <w:t>JPMorgan Chase &amp; Co.</w:t>
       </w:r>
@@ -1189,8 +1284,8 @@
         <w:rPr>
           <w:rStyle w:val="fs13fw4"/>
           <w:rFonts w:asciiTheme="minorHAnsi" w:eastAsia="Calibri" w:hAnsiTheme="minorHAnsi" w:cstheme="minorHAnsi"/>
-          <w:sz w:val="18"/>
-          <w:szCs w:val="18"/>
+          <w:sz w:val="17"/>
+          <w:szCs w:val="17"/>
         </w:rPr>
         <w:tab/>
       </w:r>
@@ -1198,55 +1293,10 @@
         <w:rPr>
           <w:rStyle w:val="fs13fw4overflow-hidden"/>
           <w:rFonts w:asciiTheme="minorHAnsi" w:eastAsia="Calibri" w:hAnsiTheme="minorHAnsi" w:cstheme="minorHAnsi"/>
-          <w:sz w:val="18"/>
-          <w:szCs w:val="18"/>
-        </w:rPr>
-        <w:t>Jun 202</w:t>
-      </w:r>
-      <w:r>
-        <w:rPr>
-          <w:rStyle w:val="fs13fw4overflow-hidden"/>
-          <w:rFonts w:asciiTheme="minorHAnsi" w:eastAsia="Calibri" w:hAnsiTheme="minorHAnsi" w:cstheme="minorHAnsi"/>
-          <w:sz w:val="18"/>
-          <w:szCs w:val="18"/>
-        </w:rPr>
-        <w:t xml:space="preserve">5 </w:t>
-      </w:r>
-      <w:r>
-        <w:rPr>
-          <w:rStyle w:val="fs13fw4overflow-hidden"/>
-          <w:rFonts w:asciiTheme="minorHAnsi" w:eastAsia="Calibri" w:hAnsiTheme="minorHAnsi" w:cstheme="minorHAnsi"/>
-          <w:sz w:val="18"/>
-          <w:szCs w:val="18"/>
-        </w:rPr>
-        <w:t>-</w:t>
-      </w:r>
-      <w:r>
-        <w:rPr>
-          <w:rStyle w:val="fs13fw4overflow-hidden"/>
-          <w:rFonts w:asciiTheme="minorHAnsi" w:eastAsia="Calibri" w:hAnsiTheme="minorHAnsi" w:cstheme="minorHAnsi"/>
-          <w:sz w:val="18"/>
-          <w:szCs w:val="18"/>
-        </w:rPr>
-        <w:t xml:space="preserve"> Present | Jersey City</w:t>
-      </w:r>
-      <w:r>
-        <w:rPr>
-          <w:rStyle w:val="fs13fw4overflow-hidden"/>
-          <w:rFonts w:asciiTheme="minorHAnsi" w:eastAsia="Calibri" w:hAnsiTheme="minorHAnsi" w:cstheme="minorHAnsi"/>
-          <w:sz w:val="18"/>
-          <w:szCs w:val="18"/>
-        </w:rPr>
-        <w:t xml:space="preserve">, </w:t>
-      </w:r>
-      <w:r>
-        <w:rPr>
-          <w:rStyle w:val="fs13fw4overflow-hidden"/>
-          <w:rFonts w:asciiTheme="minorHAnsi" w:eastAsia="Calibri" w:hAnsiTheme="minorHAnsi" w:cstheme="minorHAnsi"/>
-          <w:sz w:val="18"/>
-          <w:szCs w:val="18"/>
-        </w:rPr>
-        <w:t>NJ</w:t>
+          <w:sz w:val="17"/>
+          <w:szCs w:val="17"/>
+        </w:rPr>
+        <w:t>Jun 2025 - Present | Jersey City, NJ</w:t>
       </w:r>
     </w:p>
     <w:p>
@@ -1258,61 +1308,25 @@
         <w:rPr>
           <w:rStyle w:val="fs13fw4"/>
           <w:rFonts w:asciiTheme="minorHAnsi" w:eastAsia="Calibri" w:hAnsiTheme="minorHAnsi" w:cstheme="minorHAnsi"/>
-          <w:sz w:val="18"/>
-          <w:szCs w:val="18"/>
+          <w:sz w:val="17"/>
+          <w:szCs w:val="17"/>
         </w:rPr>
       </w:pPr>
       <w:r>
         <w:rPr>
           <w:rStyle w:val="fs13fw6overflow-hidden"/>
           <w:rFonts w:asciiTheme="minorHAnsi" w:eastAsia="Calibri" w:hAnsiTheme="minorHAnsi" w:cstheme="minorHAnsi"/>
-          <w:sz w:val="18"/>
-          <w:szCs w:val="18"/>
-        </w:rPr>
-        <w:t>Quantitative Analy</w:t>
-      </w:r>
-      <w:r>
-        <w:rPr>
-          <w:rStyle w:val="fs13fw6overflow-hidden"/>
-          <w:rFonts w:asciiTheme="minorHAnsi" w:eastAsia="Calibri" w:hAnsiTheme="minorHAnsi" w:cstheme="minorHAnsi"/>
-          <w:sz w:val="18"/>
-          <w:szCs w:val="18"/>
-        </w:rPr>
-        <w:t>tics</w:t>
-      </w:r>
-      <w:r>
-        <w:rPr>
-          <w:rStyle w:val="fs13fw6overflow-hidden"/>
-          <w:rFonts w:asciiTheme="minorHAnsi" w:eastAsia="Calibri" w:hAnsiTheme="minorHAnsi" w:cstheme="minorHAnsi"/>
-          <w:sz w:val="18"/>
-          <w:szCs w:val="18"/>
-        </w:rPr>
-        <w:t xml:space="preserve"> </w:t>
-      </w:r>
-      <w:r>
-        <w:rPr>
-          <w:rStyle w:val="fs13fw6overflow-hidden"/>
-          <w:rFonts w:asciiTheme="minorHAnsi" w:eastAsia="Calibri" w:hAnsiTheme="minorHAnsi" w:cstheme="minorHAnsi"/>
-          <w:sz w:val="18"/>
-          <w:szCs w:val="18"/>
-        </w:rPr>
-        <w:t>Associate</w:t>
-      </w:r>
-      <w:r>
-        <w:rPr>
-          <w:rStyle w:val="fs13fw6overflow-hidden"/>
-          <w:rFonts w:asciiTheme="minorHAnsi" w:eastAsia="Calibri" w:hAnsiTheme="minorHAnsi" w:cstheme="minorHAnsi"/>
-          <w:sz w:val="18"/>
-          <w:szCs w:val="18"/>
-        </w:rPr>
-        <w:t xml:space="preserve"> </w:t>
+          <w:sz w:val="17"/>
+          <w:szCs w:val="17"/>
+        </w:rPr>
+        <w:t xml:space="preserve">Quantitative Analytics Associate </w:t>
       </w:r>
       <w:r>
         <w:rPr>
           <w:rStyle w:val="fs13fw4"/>
           <w:rFonts w:asciiTheme="minorHAnsi" w:eastAsia="Calibri" w:hAnsiTheme="minorHAnsi" w:cstheme="minorHAnsi"/>
-          <w:sz w:val="18"/>
-          <w:szCs w:val="18"/>
+          <w:sz w:val="17"/>
+          <w:szCs w:val="17"/>
         </w:rPr>
         <w:tab/>
       </w:r>
@@ -1320,8 +1334,8 @@
         <w:rPr>
           <w:rStyle w:val="fs13fw4overflow-hidden"/>
           <w:rFonts w:asciiTheme="minorHAnsi" w:eastAsia="Calibri" w:hAnsiTheme="minorHAnsi" w:cstheme="minorHAnsi"/>
-          <w:sz w:val="18"/>
-          <w:szCs w:val="18"/>
+          <w:sz w:val="17"/>
+          <w:szCs w:val="17"/>
         </w:rPr>
         <w:t xml:space="preserve"> </w:t>
       </w:r>
@@ -1340,15 +1354,15 @@
         <w:jc w:val="both"/>
         <w:rPr>
           <w:rFonts w:asciiTheme="minorHAnsi" w:eastAsia="Calibri" w:hAnsiTheme="minorHAnsi" w:cstheme="minorHAnsi"/>
-          <w:sz w:val="18"/>
-          <w:szCs w:val="18"/>
-        </w:rPr>
-      </w:pPr>
-      <w:r>
-        <w:rPr>
-          <w:rFonts w:asciiTheme="minorHAnsi" w:eastAsia="Calibri" w:hAnsiTheme="minorHAnsi" w:cstheme="minorHAnsi"/>
-          <w:sz w:val="18"/>
-          <w:szCs w:val="18"/>
+          <w:sz w:val="17"/>
+          <w:szCs w:val="17"/>
+        </w:rPr>
+      </w:pPr>
+      <w:r>
+        <w:rPr>
+          <w:rFonts w:asciiTheme="minorHAnsi" w:eastAsia="Calibri" w:hAnsiTheme="minorHAnsi" w:cstheme="minorHAnsi"/>
+          <w:sz w:val="17"/>
+          <w:szCs w:val="17"/>
         </w:rPr>
         <w:t>Architected and productionized a GPT-5 (</w:t>
       </w:r>
@@ -1358,8 +1372,8 @@
           <w:rFonts w:asciiTheme="minorHAnsi" w:eastAsia="Calibri" w:hAnsiTheme="minorHAnsi" w:cstheme="minorHAnsi"/>
           <w:b/>
           <w:bCs/>
-          <w:sz w:val="18"/>
-          <w:szCs w:val="18"/>
+          <w:sz w:val="17"/>
+          <w:szCs w:val="17"/>
         </w:rPr>
         <w:t>AzureOpenAI</w:t>
       </w:r>
@@ -1367,8 +1381,8 @@
       <w:r>
         <w:rPr>
           <w:rFonts w:asciiTheme="minorHAnsi" w:eastAsia="Calibri" w:hAnsiTheme="minorHAnsi" w:cstheme="minorHAnsi"/>
-          <w:sz w:val="18"/>
-          <w:szCs w:val="18"/>
+          <w:sz w:val="17"/>
+          <w:szCs w:val="17"/>
         </w:rPr>
         <w:t xml:space="preserve">) + Ensemble </w:t>
       </w:r>
@@ -1377,16 +1391,16 @@
           <w:rFonts w:asciiTheme="minorHAnsi" w:eastAsia="Calibri" w:hAnsiTheme="minorHAnsi" w:cstheme="minorHAnsi"/>
           <w:b/>
           <w:bCs/>
-          <w:sz w:val="18"/>
-          <w:szCs w:val="18"/>
+          <w:sz w:val="17"/>
+          <w:szCs w:val="17"/>
         </w:rPr>
         <w:t>RAG</w:t>
       </w:r>
       <w:r>
         <w:rPr>
           <w:rFonts w:asciiTheme="minorHAnsi" w:eastAsia="Calibri" w:hAnsiTheme="minorHAnsi" w:cstheme="minorHAnsi"/>
-          <w:sz w:val="18"/>
-          <w:szCs w:val="18"/>
+          <w:sz w:val="17"/>
+          <w:szCs w:val="17"/>
         </w:rPr>
         <w:t xml:space="preserve"> system (</w:t>
       </w:r>
@@ -1396,8 +1410,8 @@
           <w:rFonts w:asciiTheme="minorHAnsi" w:eastAsia="Calibri" w:hAnsiTheme="minorHAnsi" w:cstheme="minorHAnsi"/>
           <w:b/>
           <w:bCs/>
-          <w:sz w:val="18"/>
-          <w:szCs w:val="18"/>
+          <w:sz w:val="17"/>
+          <w:szCs w:val="17"/>
         </w:rPr>
         <w:t>LangChain</w:t>
       </w:r>
@@ -1405,8 +1419,8 @@
       <w:r>
         <w:rPr>
           <w:rFonts w:asciiTheme="minorHAnsi" w:eastAsia="Calibri" w:hAnsiTheme="minorHAnsi" w:cstheme="minorHAnsi"/>
-          <w:sz w:val="18"/>
-          <w:szCs w:val="18"/>
+          <w:sz w:val="17"/>
+          <w:szCs w:val="17"/>
         </w:rPr>
         <w:t xml:space="preserve">, Chroma Vector DB, BM25, Parent Document Retriever) to auto-generate structured risk review drafts from </w:t>
       </w:r>
@@ -1414,8 +1428,8 @@
       <w:r>
         <w:rPr>
           <w:rFonts w:asciiTheme="minorHAnsi" w:eastAsia="Calibri" w:hAnsiTheme="minorHAnsi" w:cstheme="minorHAnsi"/>
-          <w:sz w:val="18"/>
-          <w:szCs w:val="18"/>
+          <w:sz w:val="17"/>
+          <w:szCs w:val="17"/>
         </w:rPr>
         <w:t>80-400 page</w:t>
       </w:r>
@@ -1423,8 +1437,8 @@
       <w:r>
         <w:rPr>
           <w:rFonts w:asciiTheme="minorHAnsi" w:eastAsia="Calibri" w:hAnsiTheme="minorHAnsi" w:cstheme="minorHAnsi"/>
-          <w:sz w:val="18"/>
-          <w:szCs w:val="18"/>
+          <w:sz w:val="17"/>
+          <w:szCs w:val="17"/>
         </w:rPr>
         <w:t xml:space="preserve"> model documents, reducing enterprise model review cycle time by </w:t>
       </w:r>
@@ -1433,16 +1447,16 @@
           <w:rFonts w:asciiTheme="minorHAnsi" w:eastAsia="Calibri" w:hAnsiTheme="minorHAnsi" w:cstheme="minorHAnsi"/>
           <w:b/>
           <w:bCs/>
-          <w:sz w:val="18"/>
-          <w:szCs w:val="18"/>
+          <w:sz w:val="17"/>
+          <w:szCs w:val="17"/>
         </w:rPr>
         <w:t>33%</w:t>
       </w:r>
       <w:r>
         <w:rPr>
           <w:rFonts w:asciiTheme="minorHAnsi" w:eastAsia="Calibri" w:hAnsiTheme="minorHAnsi" w:cstheme="minorHAnsi"/>
-          <w:sz w:val="18"/>
-          <w:szCs w:val="18"/>
+          <w:sz w:val="17"/>
+          <w:szCs w:val="17"/>
         </w:rPr>
         <w:t xml:space="preserve"> (3 months to 2 months) across </w:t>
       </w:r>
@@ -1451,16 +1465,16 @@
           <w:rFonts w:asciiTheme="minorHAnsi" w:eastAsia="Calibri" w:hAnsiTheme="minorHAnsi" w:cstheme="minorHAnsi"/>
           <w:b/>
           <w:bCs/>
-          <w:sz w:val="18"/>
-          <w:szCs w:val="18"/>
+          <w:sz w:val="17"/>
+          <w:szCs w:val="17"/>
         </w:rPr>
         <w:t>500+</w:t>
       </w:r>
       <w:r>
         <w:rPr>
           <w:rFonts w:asciiTheme="minorHAnsi" w:eastAsia="Calibri" w:hAnsiTheme="minorHAnsi" w:cstheme="minorHAnsi"/>
-          <w:sz w:val="18"/>
-          <w:szCs w:val="18"/>
+          <w:sz w:val="17"/>
+          <w:szCs w:val="17"/>
         </w:rPr>
         <w:t xml:space="preserve"> analysts.</w:t>
       </w:r>
@@ -1479,15 +1493,15 @@
         <w:jc w:val="both"/>
         <w:rPr>
           <w:rFonts w:asciiTheme="minorHAnsi" w:eastAsia="Calibri" w:hAnsiTheme="minorHAnsi" w:cstheme="minorHAnsi"/>
-          <w:sz w:val="18"/>
-          <w:szCs w:val="18"/>
-        </w:rPr>
-      </w:pPr>
-      <w:r>
-        <w:rPr>
-          <w:rFonts w:asciiTheme="minorHAnsi" w:eastAsia="Calibri" w:hAnsiTheme="minorHAnsi" w:cstheme="minorHAnsi"/>
-          <w:sz w:val="18"/>
-          <w:szCs w:val="18"/>
+          <w:sz w:val="17"/>
+          <w:szCs w:val="17"/>
+        </w:rPr>
+      </w:pPr>
+      <w:r>
+        <w:rPr>
+          <w:rFonts w:asciiTheme="minorHAnsi" w:eastAsia="Calibri" w:hAnsiTheme="minorHAnsi" w:cstheme="minorHAnsi"/>
+          <w:sz w:val="17"/>
+          <w:szCs w:val="17"/>
         </w:rPr>
         <w:t xml:space="preserve">Implemented a </w:t>
       </w:r>
@@ -1497,8 +1511,8 @@
           <w:rFonts w:asciiTheme="minorHAnsi" w:eastAsia="Calibri" w:hAnsiTheme="minorHAnsi" w:cstheme="minorHAnsi"/>
           <w:b/>
           <w:bCs/>
-          <w:sz w:val="18"/>
-          <w:szCs w:val="18"/>
+          <w:sz w:val="17"/>
+          <w:szCs w:val="17"/>
         </w:rPr>
         <w:t>TabTransformer</w:t>
       </w:r>
@@ -1506,8 +1520,8 @@
       <w:r>
         <w:rPr>
           <w:rFonts w:asciiTheme="minorHAnsi" w:eastAsia="Calibri" w:hAnsiTheme="minorHAnsi" w:cstheme="minorHAnsi"/>
-          <w:sz w:val="18"/>
-          <w:szCs w:val="18"/>
+          <w:sz w:val="17"/>
+          <w:szCs w:val="17"/>
         </w:rPr>
         <w:t xml:space="preserve"> in </w:t>
       </w:r>
@@ -1515,8 +1529,8 @@
       <w:r>
         <w:rPr>
           <w:rFonts w:asciiTheme="minorHAnsi" w:eastAsia="Calibri" w:hAnsiTheme="minorHAnsi" w:cstheme="minorHAnsi"/>
-          <w:sz w:val="18"/>
-          <w:szCs w:val="18"/>
+          <w:sz w:val="17"/>
+          <w:szCs w:val="17"/>
         </w:rPr>
         <w:t>PyTorch</w:t>
       </w:r>
@@ -1524,8 +1538,8 @@
       <w:r>
         <w:rPr>
           <w:rFonts w:asciiTheme="minorHAnsi" w:eastAsia="Calibri" w:hAnsiTheme="minorHAnsi" w:cstheme="minorHAnsi"/>
-          <w:sz w:val="18"/>
-          <w:szCs w:val="18"/>
+          <w:sz w:val="17"/>
+          <w:szCs w:val="17"/>
         </w:rPr>
         <w:t xml:space="preserve"> on 300K loan records (11.5:1 imbalance), benchmarking against </w:t>
       </w:r>
@@ -1534,16 +1548,16 @@
           <w:rFonts w:asciiTheme="minorHAnsi" w:eastAsia="Calibri" w:hAnsiTheme="minorHAnsi" w:cstheme="minorHAnsi"/>
           <w:b/>
           <w:bCs/>
-          <w:sz w:val="18"/>
-          <w:szCs w:val="18"/>
+          <w:sz w:val="17"/>
+          <w:szCs w:val="17"/>
         </w:rPr>
         <w:t>Logistic Regression</w:t>
       </w:r>
       <w:r>
         <w:rPr>
           <w:rFonts w:asciiTheme="minorHAnsi" w:eastAsia="Calibri" w:hAnsiTheme="minorHAnsi" w:cstheme="minorHAnsi"/>
-          <w:sz w:val="18"/>
-          <w:szCs w:val="18"/>
+          <w:sz w:val="17"/>
+          <w:szCs w:val="17"/>
         </w:rPr>
         <w:t xml:space="preserve"> (0.58 ROC-AUC) and </w:t>
       </w:r>
@@ -1553,8 +1567,8 @@
           <w:rFonts w:asciiTheme="minorHAnsi" w:eastAsia="Calibri" w:hAnsiTheme="minorHAnsi" w:cstheme="minorHAnsi"/>
           <w:b/>
           <w:bCs/>
-          <w:sz w:val="18"/>
-          <w:szCs w:val="18"/>
+          <w:sz w:val="17"/>
+          <w:szCs w:val="17"/>
         </w:rPr>
         <w:t>XGBoost</w:t>
       </w:r>
@@ -1562,8 +1576,8 @@
       <w:r>
         <w:rPr>
           <w:rFonts w:asciiTheme="minorHAnsi" w:eastAsia="Calibri" w:hAnsiTheme="minorHAnsi" w:cstheme="minorHAnsi"/>
-          <w:sz w:val="18"/>
-          <w:szCs w:val="18"/>
+          <w:sz w:val="17"/>
+          <w:szCs w:val="17"/>
         </w:rPr>
         <w:t xml:space="preserve"> (0.65), achieving 0.61 ROC-AUC while evaluating attention-based feature interaction learning for credit risk modeling</w:t>
       </w:r>
@@ -1582,15 +1596,15 @@
         <w:jc w:val="both"/>
         <w:rPr>
           <w:rFonts w:asciiTheme="minorHAnsi" w:eastAsia="Calibri" w:hAnsiTheme="minorHAnsi" w:cstheme="minorHAnsi"/>
-          <w:sz w:val="18"/>
-          <w:szCs w:val="18"/>
-        </w:rPr>
-      </w:pPr>
-      <w:r>
-        <w:rPr>
-          <w:rFonts w:asciiTheme="minorHAnsi" w:eastAsia="Calibri" w:hAnsiTheme="minorHAnsi" w:cstheme="minorHAnsi"/>
-          <w:sz w:val="18"/>
-          <w:szCs w:val="18"/>
+          <w:sz w:val="17"/>
+          <w:szCs w:val="17"/>
+        </w:rPr>
+      </w:pPr>
+      <w:r>
+        <w:rPr>
+          <w:rFonts w:asciiTheme="minorHAnsi" w:eastAsia="Calibri" w:hAnsiTheme="minorHAnsi" w:cstheme="minorHAnsi"/>
+          <w:sz w:val="17"/>
+          <w:szCs w:val="17"/>
         </w:rPr>
         <w:t xml:space="preserve">Conducted assessment of a </w:t>
       </w:r>
@@ -1599,16 +1613,16 @@
           <w:rFonts w:asciiTheme="minorHAnsi" w:eastAsia="Calibri" w:hAnsiTheme="minorHAnsi" w:cstheme="minorHAnsi"/>
           <w:b/>
           <w:bCs/>
-          <w:sz w:val="18"/>
-          <w:szCs w:val="18"/>
+          <w:sz w:val="17"/>
+          <w:szCs w:val="17"/>
         </w:rPr>
         <w:t>Regression-based</w:t>
       </w:r>
       <w:r>
         <w:rPr>
           <w:rFonts w:asciiTheme="minorHAnsi" w:eastAsia="Calibri" w:hAnsiTheme="minorHAnsi" w:cstheme="minorHAnsi"/>
-          <w:sz w:val="18"/>
-          <w:szCs w:val="18"/>
+          <w:sz w:val="17"/>
+          <w:szCs w:val="17"/>
         </w:rPr>
         <w:t xml:space="preserve"> Auto loans recovery forecasting model (20K records) supporting an $85B auto-loans portfolio, executing marginal vs conditional </w:t>
       </w:r>
@@ -1617,16 +1631,16 @@
           <w:rFonts w:asciiTheme="minorHAnsi" w:eastAsia="Calibri" w:hAnsiTheme="minorHAnsi" w:cstheme="minorHAnsi"/>
           <w:b/>
           <w:bCs/>
-          <w:sz w:val="18"/>
-          <w:szCs w:val="18"/>
+          <w:sz w:val="17"/>
+          <w:szCs w:val="17"/>
         </w:rPr>
         <w:t>R²</w:t>
       </w:r>
       <w:r>
         <w:rPr>
           <w:rFonts w:asciiTheme="minorHAnsi" w:eastAsia="Calibri" w:hAnsiTheme="minorHAnsi" w:cstheme="minorHAnsi"/>
-          <w:sz w:val="18"/>
-          <w:szCs w:val="18"/>
+          <w:sz w:val="17"/>
+          <w:szCs w:val="17"/>
         </w:rPr>
         <w:t xml:space="preserve"> analysis, </w:t>
       </w:r>
@@ -1635,16 +1649,16 @@
           <w:rFonts w:asciiTheme="minorHAnsi" w:eastAsia="Calibri" w:hAnsiTheme="minorHAnsi" w:cstheme="minorHAnsi"/>
           <w:b/>
           <w:bCs/>
-          <w:sz w:val="18"/>
-          <w:szCs w:val="18"/>
+          <w:sz w:val="17"/>
+          <w:szCs w:val="17"/>
         </w:rPr>
         <w:t>KS/CSI</w:t>
       </w:r>
       <w:r>
         <w:rPr>
           <w:rFonts w:asciiTheme="minorHAnsi" w:eastAsia="Calibri" w:hAnsiTheme="minorHAnsi" w:cstheme="minorHAnsi"/>
-          <w:sz w:val="18"/>
-          <w:szCs w:val="18"/>
+          <w:sz w:val="17"/>
+          <w:szCs w:val="17"/>
         </w:rPr>
         <w:t xml:space="preserve"> stability tests, </w:t>
       </w:r>
@@ -1653,16 +1667,16 @@
           <w:rFonts w:asciiTheme="minorHAnsi" w:eastAsia="Calibri" w:hAnsiTheme="minorHAnsi" w:cstheme="minorHAnsi"/>
           <w:b/>
           <w:bCs/>
-          <w:sz w:val="18"/>
-          <w:szCs w:val="18"/>
+          <w:sz w:val="17"/>
+          <w:szCs w:val="17"/>
         </w:rPr>
         <w:t>VIF</w:t>
       </w:r>
       <w:r>
         <w:rPr>
           <w:rFonts w:asciiTheme="minorHAnsi" w:eastAsia="Calibri" w:hAnsiTheme="minorHAnsi" w:cstheme="minorHAnsi"/>
-          <w:sz w:val="18"/>
-          <w:szCs w:val="18"/>
+          <w:sz w:val="17"/>
+          <w:szCs w:val="17"/>
         </w:rPr>
         <w:t xml:space="preserve"> multicollinearity checks, </w:t>
       </w:r>
@@ -1671,16 +1685,16 @@
           <w:rFonts w:asciiTheme="minorHAnsi" w:eastAsia="Calibri" w:hAnsiTheme="minorHAnsi" w:cstheme="minorHAnsi"/>
           <w:b/>
           <w:bCs/>
-          <w:sz w:val="18"/>
-          <w:szCs w:val="18"/>
+          <w:sz w:val="17"/>
+          <w:szCs w:val="17"/>
         </w:rPr>
         <w:t>heteroskedasticity</w:t>
       </w:r>
       <w:r>
         <w:rPr>
           <w:rFonts w:asciiTheme="minorHAnsi" w:eastAsia="Calibri" w:hAnsiTheme="minorHAnsi" w:cstheme="minorHAnsi"/>
-          <w:sz w:val="18"/>
-          <w:szCs w:val="18"/>
+          <w:sz w:val="17"/>
+          <w:szCs w:val="17"/>
         </w:rPr>
         <w:t xml:space="preserve"> diagnostics, and </w:t>
       </w:r>
@@ -1688,8 +1702,8 @@
       <w:r>
         <w:rPr>
           <w:rFonts w:asciiTheme="minorHAnsi" w:eastAsia="Calibri" w:hAnsiTheme="minorHAnsi" w:cstheme="minorHAnsi"/>
-          <w:sz w:val="18"/>
-          <w:szCs w:val="18"/>
+          <w:sz w:val="17"/>
+          <w:szCs w:val="17"/>
         </w:rPr>
         <w:t>backtesting</w:t>
       </w:r>
@@ -1697,8 +1711,8 @@
       <w:r>
         <w:rPr>
           <w:rFonts w:asciiTheme="minorHAnsi" w:eastAsia="Calibri" w:hAnsiTheme="minorHAnsi" w:cstheme="minorHAnsi"/>
-          <w:sz w:val="18"/>
-          <w:szCs w:val="18"/>
+          <w:sz w:val="17"/>
+          <w:szCs w:val="17"/>
         </w:rPr>
         <w:t xml:space="preserve"> to surface structural risks prior to CCAR-aligned regulatory review</w:t>
       </w:r>
@@ -1717,15 +1731,15 @@
         <w:jc w:val="both"/>
         <w:rPr>
           <w:rFonts w:asciiTheme="minorHAnsi" w:eastAsia="Calibri" w:hAnsiTheme="minorHAnsi" w:cstheme="minorHAnsi"/>
-          <w:sz w:val="18"/>
-          <w:szCs w:val="18"/>
-        </w:rPr>
-      </w:pPr>
-      <w:r>
-        <w:rPr>
-          <w:rFonts w:asciiTheme="minorHAnsi" w:eastAsia="Calibri" w:hAnsiTheme="minorHAnsi" w:cstheme="minorHAnsi"/>
-          <w:sz w:val="18"/>
-          <w:szCs w:val="18"/>
+          <w:sz w:val="17"/>
+          <w:szCs w:val="17"/>
+        </w:rPr>
+      </w:pPr>
+      <w:r>
+        <w:rPr>
+          <w:rFonts w:asciiTheme="minorHAnsi" w:eastAsia="Calibri" w:hAnsiTheme="minorHAnsi" w:cstheme="minorHAnsi"/>
+          <w:sz w:val="17"/>
+          <w:szCs w:val="17"/>
         </w:rPr>
         <w:t xml:space="preserve">Reconstructed and audited an </w:t>
       </w:r>
@@ -1735,8 +1749,8 @@
           <w:rFonts w:asciiTheme="minorHAnsi" w:eastAsia="Calibri" w:hAnsiTheme="minorHAnsi" w:cstheme="minorHAnsi"/>
           <w:b/>
           <w:bCs/>
-          <w:sz w:val="18"/>
-          <w:szCs w:val="18"/>
+          <w:sz w:val="17"/>
+          <w:szCs w:val="17"/>
         </w:rPr>
         <w:t>XGBoost</w:t>
       </w:r>
@@ -1744,8 +1758,8 @@
       <w:r>
         <w:rPr>
           <w:rFonts w:asciiTheme="minorHAnsi" w:eastAsia="Calibri" w:hAnsiTheme="minorHAnsi" w:cstheme="minorHAnsi"/>
-          <w:sz w:val="18"/>
-          <w:szCs w:val="18"/>
+          <w:sz w:val="17"/>
+          <w:szCs w:val="17"/>
         </w:rPr>
         <w:t xml:space="preserve"> regression pipeline (20K datapoints) predicting 5 venture finance metrics using log transforms, k-fold CV, Random Search hyperparameter tuning, Recursive Feature Elimination, and SHAP explainability, identifying 7 risks before publication</w:t>
       </w:r>
@@ -1761,8 +1775,8 @@
           <w:rFonts w:asciiTheme="minorHAnsi" w:eastAsia="Calibri" w:hAnsiTheme="minorHAnsi" w:cstheme="minorHAnsi"/>
           <w:b/>
           <w:bCs/>
-          <w:sz w:val="18"/>
-          <w:szCs w:val="18"/>
+          <w:sz w:val="17"/>
+          <w:szCs w:val="17"/>
         </w:rPr>
       </w:pPr>
     </w:p>
@@ -1775,8 +1789,8 @@
         <w:rPr>
           <w:rStyle w:val="fs13fw4"/>
           <w:rFonts w:asciiTheme="minorHAnsi" w:eastAsia="Calibri" w:hAnsiTheme="minorHAnsi" w:cstheme="minorHAnsi"/>
-          <w:sz w:val="18"/>
-          <w:szCs w:val="18"/>
+          <w:sz w:val="17"/>
+          <w:szCs w:val="17"/>
         </w:rPr>
       </w:pPr>
       <w:r>
@@ -1785,8 +1799,8 @@
           <w:rFonts w:asciiTheme="minorHAnsi" w:eastAsia="Calibri" w:hAnsiTheme="minorHAnsi" w:cstheme="minorHAnsi"/>
           <w:b/>
           <w:bCs/>
-          <w:sz w:val="18"/>
-          <w:szCs w:val="18"/>
+          <w:sz w:val="17"/>
+          <w:szCs w:val="17"/>
         </w:rPr>
         <w:t>JPMorgan</w:t>
       </w:r>
@@ -1796,8 +1810,8 @@
           <w:rFonts w:asciiTheme="minorHAnsi" w:eastAsia="Calibri" w:hAnsiTheme="minorHAnsi" w:cstheme="minorHAnsi"/>
           <w:b/>
           <w:bCs/>
-          <w:sz w:val="18"/>
-          <w:szCs w:val="18"/>
+          <w:sz w:val="17"/>
+          <w:szCs w:val="17"/>
         </w:rPr>
         <w:t xml:space="preserve"> </w:t>
       </w:r>
@@ -1807,8 +1821,8 @@
           <w:rFonts w:asciiTheme="minorHAnsi" w:eastAsia="Calibri" w:hAnsiTheme="minorHAnsi" w:cstheme="minorHAnsi"/>
           <w:b/>
           <w:bCs/>
-          <w:sz w:val="18"/>
-          <w:szCs w:val="18"/>
+          <w:sz w:val="17"/>
+          <w:szCs w:val="17"/>
         </w:rPr>
         <w:t>Chase</w:t>
       </w:r>
@@ -1818,8 +1832,8 @@
           <w:rFonts w:asciiTheme="minorHAnsi" w:eastAsia="Calibri" w:hAnsiTheme="minorHAnsi" w:cstheme="minorHAnsi"/>
           <w:b/>
           <w:bCs/>
-          <w:sz w:val="18"/>
-          <w:szCs w:val="18"/>
+          <w:sz w:val="17"/>
+          <w:szCs w:val="17"/>
         </w:rPr>
         <w:t xml:space="preserve"> &amp; Co.</w:t>
       </w:r>
@@ -1827,8 +1841,8 @@
         <w:rPr>
           <w:rStyle w:val="fs13fw4"/>
           <w:rFonts w:asciiTheme="minorHAnsi" w:eastAsia="Calibri" w:hAnsiTheme="minorHAnsi" w:cstheme="minorHAnsi"/>
-          <w:sz w:val="18"/>
-          <w:szCs w:val="18"/>
+          <w:sz w:val="17"/>
+          <w:szCs w:val="17"/>
         </w:rPr>
         <w:tab/>
       </w:r>
@@ -1836,73 +1850,19 @@
         <w:rPr>
           <w:rStyle w:val="fs13fw4overflow-hidden"/>
           <w:rFonts w:asciiTheme="minorHAnsi" w:eastAsia="Calibri" w:hAnsiTheme="minorHAnsi" w:cstheme="minorHAnsi"/>
-          <w:sz w:val="18"/>
-          <w:szCs w:val="18"/>
-        </w:rPr>
-        <w:t>Jun 2024</w:t>
+          <w:sz w:val="17"/>
+          <w:szCs w:val="17"/>
+        </w:rPr>
+        <w:t>Jun 2024 - Aug 2024 | Jersey City</w:t>
       </w:r>
       <w:r>
         <w:rPr>
           <w:rStyle w:val="fs13fw4overflow-hidden"/>
           <w:rFonts w:asciiTheme="minorHAnsi" w:eastAsia="Calibri" w:hAnsiTheme="minorHAnsi" w:cstheme="minorHAnsi"/>
-          <w:sz w:val="18"/>
-          <w:szCs w:val="18"/>
-        </w:rPr>
-        <w:t xml:space="preserve"> </w:t>
-      </w:r>
-      <w:r>
-        <w:rPr>
-          <w:rStyle w:val="fs13fw4overflow-hidden"/>
-          <w:rFonts w:asciiTheme="minorHAnsi" w:eastAsia="Calibri" w:hAnsiTheme="minorHAnsi" w:cstheme="minorHAnsi"/>
-          <w:sz w:val="18"/>
-          <w:szCs w:val="18"/>
-        </w:rPr>
-        <w:t>-</w:t>
-      </w:r>
-      <w:r>
-        <w:rPr>
-          <w:rStyle w:val="fs13fw4overflow-hidden"/>
-          <w:rFonts w:asciiTheme="minorHAnsi" w:eastAsia="Calibri" w:hAnsiTheme="minorHAnsi" w:cstheme="minorHAnsi"/>
-          <w:sz w:val="18"/>
-          <w:szCs w:val="18"/>
-        </w:rPr>
-        <w:t xml:space="preserve"> </w:t>
-      </w:r>
-      <w:r>
-        <w:rPr>
-          <w:rStyle w:val="fs13fw4overflow-hidden"/>
-          <w:rFonts w:asciiTheme="minorHAnsi" w:eastAsia="Calibri" w:hAnsiTheme="minorHAnsi" w:cstheme="minorHAnsi"/>
-          <w:sz w:val="18"/>
-          <w:szCs w:val="18"/>
-        </w:rPr>
-        <w:t>Aug 2024</w:t>
-      </w:r>
-      <w:r>
-        <w:rPr>
-          <w:rStyle w:val="fs13fw4overflow-hidden"/>
-          <w:rFonts w:asciiTheme="minorHAnsi" w:eastAsia="Calibri" w:hAnsiTheme="minorHAnsi" w:cstheme="minorHAnsi"/>
-          <w:sz w:val="18"/>
-          <w:szCs w:val="18"/>
-        </w:rPr>
-        <w:t xml:space="preserve"> | Jersey City</w:t>
-      </w:r>
-      <w:r>
-        <w:rPr>
-          <w:rStyle w:val="fs13fw4overflow-hidden"/>
-          <w:rFonts w:asciiTheme="minorHAnsi" w:eastAsia="Calibri" w:hAnsiTheme="minorHAnsi" w:cstheme="minorHAnsi"/>
-          <w:sz w:val="18"/>
-          <w:szCs w:val="18"/>
-        </w:rPr>
-        <w:t xml:space="preserve">, </w:t>
-      </w:r>
-      <w:r>
-        <w:rPr>
-          <w:rStyle w:val="fs13fw4overflow-hidden"/>
-          <w:rFonts w:asciiTheme="minorHAnsi" w:eastAsia="Calibri" w:hAnsiTheme="minorHAnsi" w:cstheme="minorHAnsi"/>
-          <w:sz w:val="18"/>
-          <w:szCs w:val="18"/>
-        </w:rPr>
-        <w:t>NJ</w:t>
+          <w:sz w:val="17"/>
+          <w:szCs w:val="17"/>
+        </w:rPr>
+        <w:t>, NJ</w:t>
       </w:r>
     </w:p>
     <w:p>
@@ -1914,16 +1874,16 @@
         <w:rPr>
           <w:rStyle w:val="fs13fw4"/>
           <w:rFonts w:asciiTheme="minorHAnsi" w:eastAsia="Calibri" w:hAnsiTheme="minorHAnsi" w:cstheme="minorHAnsi"/>
-          <w:sz w:val="18"/>
-          <w:szCs w:val="18"/>
+          <w:sz w:val="17"/>
+          <w:szCs w:val="17"/>
         </w:rPr>
       </w:pPr>
       <w:r>
         <w:rPr>
           <w:rStyle w:val="fs13fw6overflow-hidden"/>
           <w:rFonts w:asciiTheme="minorHAnsi" w:eastAsia="Calibri" w:hAnsiTheme="minorHAnsi" w:cstheme="minorHAnsi"/>
-          <w:sz w:val="18"/>
-          <w:szCs w:val="18"/>
+          <w:sz w:val="17"/>
+          <w:szCs w:val="17"/>
         </w:rPr>
         <w:t>Quantitative Analyst Intern</w:t>
       </w:r>
@@ -1931,8 +1891,8 @@
         <w:rPr>
           <w:rStyle w:val="fs13fw6overflow-hidden"/>
           <w:rFonts w:asciiTheme="minorHAnsi" w:eastAsia="Calibri" w:hAnsiTheme="minorHAnsi" w:cstheme="minorHAnsi"/>
-          <w:sz w:val="18"/>
-          <w:szCs w:val="18"/>
+          <w:sz w:val="17"/>
+          <w:szCs w:val="17"/>
         </w:rPr>
         <w:t xml:space="preserve"> </w:t>
       </w:r>
@@ -1940,8 +1900,8 @@
         <w:rPr>
           <w:rStyle w:val="fs13fw4"/>
           <w:rFonts w:asciiTheme="minorHAnsi" w:eastAsia="Calibri" w:hAnsiTheme="minorHAnsi" w:cstheme="minorHAnsi"/>
-          <w:sz w:val="18"/>
-          <w:szCs w:val="18"/>
+          <w:sz w:val="17"/>
+          <w:szCs w:val="17"/>
         </w:rPr>
         <w:tab/>
       </w:r>
@@ -1949,8 +1909,8 @@
         <w:rPr>
           <w:rStyle w:val="fs13fw4overflow-hidden"/>
           <w:rFonts w:asciiTheme="minorHAnsi" w:eastAsia="Calibri" w:hAnsiTheme="minorHAnsi" w:cstheme="minorHAnsi"/>
-          <w:sz w:val="18"/>
-          <w:szCs w:val="18"/>
+          <w:sz w:val="17"/>
+          <w:szCs w:val="17"/>
         </w:rPr>
         <w:t xml:space="preserve"> </w:t>
       </w:r>
@@ -1966,15 +1926,15 @@
         <w:jc w:val="both"/>
         <w:rPr>
           <w:rFonts w:asciiTheme="minorHAnsi" w:eastAsia="Calibri" w:hAnsiTheme="minorHAnsi" w:cstheme="minorHAnsi"/>
-          <w:sz w:val="18"/>
-          <w:szCs w:val="18"/>
-        </w:rPr>
-      </w:pPr>
-      <w:r>
-        <w:rPr>
-          <w:rFonts w:asciiTheme="minorHAnsi" w:eastAsia="Calibri" w:hAnsiTheme="minorHAnsi" w:cstheme="minorHAnsi"/>
-          <w:sz w:val="18"/>
-          <w:szCs w:val="18"/>
+          <w:sz w:val="17"/>
+          <w:szCs w:val="17"/>
+        </w:rPr>
+      </w:pPr>
+      <w:r>
+        <w:rPr>
+          <w:rFonts w:asciiTheme="minorHAnsi" w:eastAsia="Calibri" w:hAnsiTheme="minorHAnsi" w:cstheme="minorHAnsi"/>
+          <w:sz w:val="17"/>
+          <w:szCs w:val="17"/>
         </w:rPr>
         <w:t>Built an LLM-based benchmarking platform evaluating 8 document extraction models, achieving 94% F1 on CoNLL-2003</w:t>
       </w:r>
@@ -1990,15 +1950,15 @@
         <w:jc w:val="both"/>
         <w:rPr>
           <w:rFonts w:asciiTheme="minorHAnsi" w:eastAsia="Calibri" w:hAnsiTheme="minorHAnsi" w:cstheme="minorHAnsi"/>
-          <w:sz w:val="18"/>
-          <w:szCs w:val="18"/>
-        </w:rPr>
-      </w:pPr>
-      <w:r>
-        <w:rPr>
-          <w:rFonts w:asciiTheme="minorHAnsi" w:eastAsia="Calibri" w:hAnsiTheme="minorHAnsi" w:cstheme="minorHAnsi"/>
-          <w:sz w:val="18"/>
-          <w:szCs w:val="18"/>
+          <w:sz w:val="17"/>
+          <w:szCs w:val="17"/>
+        </w:rPr>
+      </w:pPr>
+      <w:r>
+        <w:rPr>
+          <w:rFonts w:asciiTheme="minorHAnsi" w:eastAsia="Calibri" w:hAnsiTheme="minorHAnsi" w:cstheme="minorHAnsi"/>
+          <w:sz w:val="17"/>
+          <w:szCs w:val="17"/>
         </w:rPr>
         <w:t xml:space="preserve">Developed a </w:t>
       </w:r>
@@ -2007,26 +1967,18 @@
           <w:rFonts w:asciiTheme="minorHAnsi" w:eastAsia="Calibri" w:hAnsiTheme="minorHAnsi" w:cstheme="minorHAnsi"/>
           <w:b/>
           <w:bCs/>
-          <w:sz w:val="18"/>
-          <w:szCs w:val="18"/>
+          <w:sz w:val="17"/>
+          <w:szCs w:val="17"/>
         </w:rPr>
         <w:t>OpenCV</w:t>
       </w:r>
       <w:r>
         <w:rPr>
           <w:rFonts w:asciiTheme="minorHAnsi" w:eastAsia="Calibri" w:hAnsiTheme="minorHAnsi" w:cstheme="minorHAnsi"/>
-          <w:sz w:val="18"/>
-          <w:szCs w:val="18"/>
-        </w:rPr>
-        <w:t xml:space="preserve"> based </w:t>
-      </w:r>
-      <w:r>
-        <w:rPr>
-          <w:rFonts w:asciiTheme="minorHAnsi" w:eastAsia="Calibri" w:hAnsiTheme="minorHAnsi" w:cstheme="minorHAnsi"/>
-          <w:sz w:val="18"/>
-          <w:szCs w:val="18"/>
-        </w:rPr>
-        <w:t>document stress-testing engine generating 10+ noisy variants per file to evaluate robustness of 8 extraction models</w:t>
+          <w:sz w:val="17"/>
+          <w:szCs w:val="17"/>
+        </w:rPr>
+        <w:t xml:space="preserve"> based document stress-testing engine generating 10+ noisy variants per file to evaluate robustness of 8 extraction models</w:t>
       </w:r>
     </w:p>
     <w:p>
@@ -2040,8 +1992,8 @@
           <w:rFonts w:asciiTheme="minorHAnsi" w:eastAsia="Calibri" w:hAnsiTheme="minorHAnsi" w:cstheme="minorHAnsi"/>
           <w:b/>
           <w:bCs/>
-          <w:sz w:val="18"/>
-          <w:szCs w:val="18"/>
+          <w:sz w:val="17"/>
+          <w:szCs w:val="17"/>
         </w:rPr>
       </w:pPr>
     </w:p>
@@ -2054,8 +2006,8 @@
         <w:rPr>
           <w:rStyle w:val="fs13fw4"/>
           <w:rFonts w:asciiTheme="minorHAnsi" w:eastAsia="Calibri" w:hAnsiTheme="minorHAnsi" w:cstheme="minorHAnsi"/>
-          <w:sz w:val="18"/>
-          <w:szCs w:val="18"/>
+          <w:sz w:val="17"/>
+          <w:szCs w:val="17"/>
         </w:rPr>
       </w:pPr>
       <w:r>
@@ -2064,8 +2016,8 @@
           <w:rFonts w:asciiTheme="minorHAnsi" w:eastAsia="Calibri" w:hAnsiTheme="minorHAnsi" w:cstheme="minorHAnsi"/>
           <w:b/>
           <w:bCs/>
-          <w:sz w:val="18"/>
-          <w:szCs w:val="18"/>
+          <w:sz w:val="17"/>
+          <w:szCs w:val="17"/>
         </w:rPr>
         <w:t>Siemens Digital Industries Software</w:t>
       </w:r>
@@ -2073,8 +2025,8 @@
         <w:rPr>
           <w:rStyle w:val="fs13fw4"/>
           <w:rFonts w:asciiTheme="minorHAnsi" w:eastAsia="Calibri" w:hAnsiTheme="minorHAnsi" w:cstheme="minorHAnsi"/>
-          <w:sz w:val="18"/>
-          <w:szCs w:val="18"/>
+          <w:sz w:val="17"/>
+          <w:szCs w:val="17"/>
         </w:rPr>
         <w:tab/>
       </w:r>
@@ -2082,62 +2034,26 @@
         <w:rPr>
           <w:rStyle w:val="fs13fw4overflow-hidden"/>
           <w:rFonts w:asciiTheme="minorHAnsi" w:eastAsia="Calibri" w:hAnsiTheme="minorHAnsi" w:cstheme="minorHAnsi"/>
-          <w:sz w:val="18"/>
-          <w:szCs w:val="18"/>
-        </w:rPr>
-        <w:t>Jul 2021</w:t>
+          <w:sz w:val="17"/>
+          <w:szCs w:val="17"/>
+        </w:rPr>
+        <w:t>Jul 2021 - Jul 2023</w:t>
+      </w:r>
+      <w:r>
+        <w:rPr>
+          <w:rStyle w:val="fs13fw4"/>
+          <w:rFonts w:asciiTheme="minorHAnsi" w:eastAsia="Calibri" w:hAnsiTheme="minorHAnsi" w:cstheme="minorHAnsi"/>
+          <w:sz w:val="17"/>
+          <w:szCs w:val="17"/>
+        </w:rPr>
+        <w:t xml:space="preserve"> | </w:t>
       </w:r>
       <w:r>
         <w:rPr>
           <w:rStyle w:val="fs13fw4overflow-hidden"/>
           <w:rFonts w:asciiTheme="minorHAnsi" w:eastAsia="Calibri" w:hAnsiTheme="minorHAnsi" w:cstheme="minorHAnsi"/>
-          <w:sz w:val="18"/>
-          <w:szCs w:val="18"/>
-        </w:rPr>
-        <w:t xml:space="preserve"> </w:t>
-      </w:r>
-      <w:r>
-        <w:rPr>
-          <w:rStyle w:val="fs13fw4overflow-hidden"/>
-          <w:rFonts w:asciiTheme="minorHAnsi" w:eastAsia="Calibri" w:hAnsiTheme="minorHAnsi" w:cstheme="minorHAnsi"/>
-          <w:sz w:val="18"/>
-          <w:szCs w:val="18"/>
-        </w:rPr>
-        <w:t>-</w:t>
-      </w:r>
-      <w:r>
-        <w:rPr>
-          <w:rStyle w:val="fs13fw4overflow-hidden"/>
-          <w:rFonts w:asciiTheme="minorHAnsi" w:eastAsia="Calibri" w:hAnsiTheme="minorHAnsi" w:cstheme="minorHAnsi"/>
-          <w:sz w:val="18"/>
-          <w:szCs w:val="18"/>
-        </w:rPr>
-        <w:t xml:space="preserve"> </w:t>
-      </w:r>
-      <w:r>
-        <w:rPr>
-          <w:rStyle w:val="fs13fw4overflow-hidden"/>
-          <w:rFonts w:asciiTheme="minorHAnsi" w:eastAsia="Calibri" w:hAnsiTheme="minorHAnsi" w:cstheme="minorHAnsi"/>
-          <w:sz w:val="18"/>
-          <w:szCs w:val="18"/>
-        </w:rPr>
-        <w:t>Jul 2023</w:t>
-      </w:r>
-      <w:r>
-        <w:rPr>
-          <w:rStyle w:val="fs13fw4"/>
-          <w:rFonts w:asciiTheme="minorHAnsi" w:eastAsia="Calibri" w:hAnsiTheme="minorHAnsi" w:cstheme="minorHAnsi"/>
-          <w:sz w:val="18"/>
-          <w:szCs w:val="18"/>
-        </w:rPr>
-        <w:t xml:space="preserve"> | </w:t>
-      </w:r>
-      <w:r>
-        <w:rPr>
-          <w:rStyle w:val="fs13fw4overflow-hidden"/>
-          <w:rFonts w:asciiTheme="minorHAnsi" w:eastAsia="Calibri" w:hAnsiTheme="minorHAnsi" w:cstheme="minorHAnsi"/>
-          <w:sz w:val="18"/>
-          <w:szCs w:val="18"/>
+          <w:sz w:val="17"/>
+          <w:szCs w:val="17"/>
         </w:rPr>
         <w:t>Pune, India</w:t>
       </w:r>
@@ -2151,16 +2067,16 @@
         <w:rPr>
           <w:rStyle w:val="fs13fw4"/>
           <w:rFonts w:asciiTheme="minorHAnsi" w:eastAsia="Calibri" w:hAnsiTheme="minorHAnsi" w:cstheme="minorHAnsi"/>
-          <w:sz w:val="18"/>
-          <w:szCs w:val="18"/>
+          <w:sz w:val="17"/>
+          <w:szCs w:val="17"/>
         </w:rPr>
       </w:pPr>
       <w:r>
         <w:rPr>
           <w:rStyle w:val="fs13fw6overflow-hidden"/>
           <w:rFonts w:asciiTheme="minorHAnsi" w:eastAsia="Calibri" w:hAnsiTheme="minorHAnsi" w:cstheme="minorHAnsi"/>
-          <w:sz w:val="18"/>
-          <w:szCs w:val="18"/>
+          <w:sz w:val="17"/>
+          <w:szCs w:val="17"/>
         </w:rPr>
         <w:t xml:space="preserve">Associate </w:t>
       </w:r>
@@ -2168,8 +2084,8 @@
         <w:rPr>
           <w:rStyle w:val="fs13fw6overflow-hidden"/>
           <w:rFonts w:asciiTheme="minorHAnsi" w:eastAsia="Calibri" w:hAnsiTheme="minorHAnsi" w:cstheme="minorHAnsi"/>
-          <w:sz w:val="18"/>
-          <w:szCs w:val="18"/>
+          <w:sz w:val="17"/>
+          <w:szCs w:val="17"/>
         </w:rPr>
         <w:t>Software Engineer</w:t>
       </w:r>
@@ -2177,8 +2093,8 @@
         <w:rPr>
           <w:rStyle w:val="fs13fw4"/>
           <w:rFonts w:asciiTheme="minorHAnsi" w:eastAsia="Calibri" w:hAnsiTheme="minorHAnsi" w:cstheme="minorHAnsi"/>
-          <w:sz w:val="18"/>
-          <w:szCs w:val="18"/>
+          <w:sz w:val="17"/>
+          <w:szCs w:val="17"/>
         </w:rPr>
         <w:tab/>
       </w:r>
@@ -2194,15 +2110,15 @@
         <w:jc w:val="both"/>
         <w:rPr>
           <w:rFonts w:asciiTheme="minorHAnsi" w:eastAsia="Calibri" w:hAnsiTheme="minorHAnsi" w:cstheme="minorHAnsi"/>
-          <w:sz w:val="18"/>
-          <w:szCs w:val="18"/>
-        </w:rPr>
-      </w:pPr>
-      <w:r>
-        <w:rPr>
-          <w:rFonts w:asciiTheme="minorHAnsi" w:eastAsia="Calibri" w:hAnsiTheme="minorHAnsi" w:cstheme="minorHAnsi"/>
-          <w:sz w:val="18"/>
-          <w:szCs w:val="18"/>
+          <w:sz w:val="17"/>
+          <w:szCs w:val="17"/>
+        </w:rPr>
+      </w:pPr>
+      <w:r>
+        <w:rPr>
+          <w:rFonts w:asciiTheme="minorHAnsi" w:eastAsia="Calibri" w:hAnsiTheme="minorHAnsi" w:cstheme="minorHAnsi"/>
+          <w:sz w:val="17"/>
+          <w:szCs w:val="17"/>
         </w:rPr>
         <w:t xml:space="preserve">Designed a two-stage AI pipeline </w:t>
       </w:r>
@@ -2211,8 +2127,8 @@
           <w:rFonts w:asciiTheme="minorHAnsi" w:eastAsia="Calibri" w:hAnsiTheme="minorHAnsi" w:cstheme="minorHAnsi"/>
           <w:b/>
           <w:bCs/>
-          <w:sz w:val="18"/>
-          <w:szCs w:val="18"/>
+          <w:sz w:val="17"/>
+          <w:szCs w:val="17"/>
         </w:rPr>
         <w:t xml:space="preserve">(OpenCV + Tesseract/Google Vision OCR + </w:t>
       </w:r>
@@ -2222,8 +2138,8 @@
           <w:rFonts w:asciiTheme="minorHAnsi" w:eastAsia="Calibri" w:hAnsiTheme="minorHAnsi" w:cstheme="minorHAnsi"/>
           <w:b/>
           <w:bCs/>
-          <w:sz w:val="18"/>
-          <w:szCs w:val="18"/>
+          <w:sz w:val="17"/>
+          <w:szCs w:val="17"/>
         </w:rPr>
         <w:t>SpaCy</w:t>
       </w:r>
@@ -2233,16 +2149,16 @@
           <w:rFonts w:asciiTheme="minorHAnsi" w:eastAsia="Calibri" w:hAnsiTheme="minorHAnsi" w:cstheme="minorHAnsi"/>
           <w:b/>
           <w:bCs/>
-          <w:sz w:val="18"/>
-          <w:szCs w:val="18"/>
+          <w:sz w:val="17"/>
+          <w:szCs w:val="17"/>
         </w:rPr>
         <w:t>/BERT NER)</w:t>
       </w:r>
       <w:r>
         <w:rPr>
           <w:rFonts w:asciiTheme="minorHAnsi" w:eastAsia="Calibri" w:hAnsiTheme="minorHAnsi" w:cstheme="minorHAnsi"/>
-          <w:sz w:val="18"/>
-          <w:szCs w:val="18"/>
+          <w:sz w:val="17"/>
+          <w:szCs w:val="17"/>
         </w:rPr>
         <w:t xml:space="preserve"> to convert scanned PDF manufacturing drawings into </w:t>
       </w:r>
@@ -2250,8 +2166,8 @@
       <w:r>
         <w:rPr>
           <w:rFonts w:asciiTheme="minorHAnsi" w:eastAsia="Calibri" w:hAnsiTheme="minorHAnsi" w:cstheme="minorHAnsi"/>
-          <w:sz w:val="18"/>
-          <w:szCs w:val="18"/>
+          <w:sz w:val="17"/>
+          <w:szCs w:val="17"/>
         </w:rPr>
         <w:t>SolidEdge</w:t>
       </w:r>
@@ -2259,8 +2175,8 @@
       <w:r>
         <w:rPr>
           <w:rFonts w:asciiTheme="minorHAnsi" w:eastAsia="Calibri" w:hAnsiTheme="minorHAnsi" w:cstheme="minorHAnsi"/>
-          <w:sz w:val="18"/>
-          <w:szCs w:val="18"/>
+          <w:sz w:val="17"/>
+          <w:szCs w:val="17"/>
         </w:rPr>
         <w:t xml:space="preserve">-native 2D CAD files by extracting geometric primitives (73% shape accuracy) and metadata tables (90% NER accuracy), integrating outputs via </w:t>
       </w:r>
@@ -2268,8 +2184,8 @@
       <w:r>
         <w:rPr>
           <w:rFonts w:asciiTheme="minorHAnsi" w:eastAsia="Calibri" w:hAnsiTheme="minorHAnsi" w:cstheme="minorHAnsi"/>
-          <w:sz w:val="18"/>
-          <w:szCs w:val="18"/>
+          <w:sz w:val="17"/>
+          <w:szCs w:val="17"/>
         </w:rPr>
         <w:t>SolidEdge</w:t>
       </w:r>
@@ -2277,8 +2193,8 @@
       <w:r>
         <w:rPr>
           <w:rFonts w:asciiTheme="minorHAnsi" w:eastAsia="Calibri" w:hAnsiTheme="minorHAnsi" w:cstheme="minorHAnsi"/>
-          <w:sz w:val="18"/>
-          <w:szCs w:val="18"/>
+          <w:sz w:val="17"/>
+          <w:szCs w:val="17"/>
         </w:rPr>
         <w:t xml:space="preserve"> APIs to prototype a </w:t>
       </w:r>
@@ -2287,16 +2203,16 @@
           <w:rFonts w:asciiTheme="minorHAnsi" w:eastAsia="Calibri" w:hAnsiTheme="minorHAnsi" w:cstheme="minorHAnsi"/>
           <w:b/>
           <w:bCs/>
-          <w:sz w:val="18"/>
-          <w:szCs w:val="18"/>
+          <w:sz w:val="17"/>
+          <w:szCs w:val="17"/>
         </w:rPr>
         <w:t>top</w:t>
       </w:r>
       <w:r>
         <w:rPr>
           <w:rFonts w:asciiTheme="minorHAnsi" w:eastAsia="Calibri" w:hAnsiTheme="minorHAnsi" w:cstheme="minorHAnsi"/>
-          <w:sz w:val="18"/>
-          <w:szCs w:val="18"/>
+          <w:sz w:val="17"/>
+          <w:szCs w:val="17"/>
         </w:rPr>
         <w:t xml:space="preserve"> </w:t>
       </w:r>
@@ -2305,16 +2221,16 @@
           <w:rFonts w:asciiTheme="minorHAnsi" w:eastAsia="Calibri" w:hAnsiTheme="minorHAnsi" w:cstheme="minorHAnsi"/>
           <w:b/>
           <w:bCs/>
-          <w:sz w:val="18"/>
-          <w:szCs w:val="18"/>
+          <w:sz w:val="17"/>
+          <w:szCs w:val="17"/>
         </w:rPr>
         <w:t>customer-requested</w:t>
       </w:r>
       <w:r>
         <w:rPr>
           <w:rFonts w:asciiTheme="minorHAnsi" w:eastAsia="Calibri" w:hAnsiTheme="minorHAnsi" w:cstheme="minorHAnsi"/>
-          <w:sz w:val="18"/>
-          <w:szCs w:val="18"/>
+          <w:sz w:val="17"/>
+          <w:szCs w:val="17"/>
         </w:rPr>
         <w:t xml:space="preserve"> automation feature in the CAD modeling domain</w:t>
       </w:r>
@@ -2330,15 +2246,15 @@
         <w:jc w:val="both"/>
         <w:rPr>
           <w:rFonts w:asciiTheme="minorHAnsi" w:eastAsia="Calibri" w:hAnsiTheme="minorHAnsi" w:cstheme="minorHAnsi"/>
-          <w:sz w:val="18"/>
-          <w:szCs w:val="18"/>
-        </w:rPr>
-      </w:pPr>
-      <w:r>
-        <w:rPr>
-          <w:rFonts w:asciiTheme="minorHAnsi" w:eastAsia="Calibri" w:hAnsiTheme="minorHAnsi" w:cstheme="minorHAnsi"/>
-          <w:sz w:val="18"/>
-          <w:szCs w:val="18"/>
+          <w:sz w:val="17"/>
+          <w:szCs w:val="17"/>
+        </w:rPr>
+      </w:pPr>
+      <w:r>
+        <w:rPr>
+          <w:rFonts w:asciiTheme="minorHAnsi" w:eastAsia="Calibri" w:hAnsiTheme="minorHAnsi" w:cstheme="minorHAnsi"/>
+          <w:sz w:val="17"/>
+          <w:szCs w:val="17"/>
         </w:rPr>
         <w:t xml:space="preserve">Developed an early </w:t>
       </w:r>
@@ -2347,16 +2263,16 @@
           <w:rFonts w:asciiTheme="minorHAnsi" w:eastAsia="Calibri" w:hAnsiTheme="minorHAnsi" w:cstheme="minorHAnsi"/>
           <w:b/>
           <w:bCs/>
-          <w:sz w:val="18"/>
-          <w:szCs w:val="18"/>
+          <w:sz w:val="17"/>
+          <w:szCs w:val="17"/>
         </w:rPr>
         <w:t>GPT-3.5-powered conversational assistant</w:t>
       </w:r>
       <w:r>
         <w:rPr>
           <w:rFonts w:asciiTheme="minorHAnsi" w:eastAsia="Calibri" w:hAnsiTheme="minorHAnsi" w:cstheme="minorHAnsi"/>
-          <w:sz w:val="18"/>
-          <w:szCs w:val="18"/>
+          <w:sz w:val="17"/>
+          <w:szCs w:val="17"/>
         </w:rPr>
         <w:t xml:space="preserve"> integrated into a web-based CAD editor (Zel-X) that leveraged help documentation to guide users through complex modeling workflows, prototyping an LLM-driven support interface to improve user experience</w:t>
       </w:r>
@@ -2372,49 +2288,33 @@
         <w:jc w:val="both"/>
         <w:rPr>
           <w:rFonts w:asciiTheme="minorHAnsi" w:eastAsia="Calibri" w:hAnsiTheme="minorHAnsi" w:cstheme="minorHAnsi"/>
-          <w:sz w:val="18"/>
-          <w:szCs w:val="18"/>
-        </w:rPr>
-      </w:pPr>
-      <w:r>
-        <w:rPr>
-          <w:rFonts w:asciiTheme="minorHAnsi" w:eastAsia="Calibri" w:hAnsiTheme="minorHAnsi" w:cstheme="minorHAnsi"/>
-          <w:sz w:val="18"/>
-          <w:szCs w:val="18"/>
+          <w:sz w:val="17"/>
+          <w:szCs w:val="17"/>
+        </w:rPr>
+      </w:pPr>
+      <w:r>
+        <w:rPr>
+          <w:rFonts w:asciiTheme="minorHAnsi" w:eastAsia="Calibri" w:hAnsiTheme="minorHAnsi" w:cstheme="minorHAnsi"/>
+          <w:sz w:val="17"/>
+          <w:szCs w:val="17"/>
         </w:rPr>
         <w:t xml:space="preserve">Delivered 9 features and resolved 50+ issues across </w:t>
       </w:r>
       <w:r>
         <w:rPr>
           <w:rFonts w:asciiTheme="minorHAnsi" w:eastAsia="Calibri" w:hAnsiTheme="minorHAnsi" w:cstheme="minorHAnsi"/>
-          <w:sz w:val="18"/>
-          <w:szCs w:val="18"/>
+          <w:sz w:val="17"/>
+          <w:szCs w:val="17"/>
         </w:rPr>
         <w:t xml:space="preserve">two </w:t>
       </w:r>
       <w:r>
         <w:rPr>
           <w:rFonts w:asciiTheme="minorHAnsi" w:eastAsia="Calibri" w:hAnsiTheme="minorHAnsi" w:cstheme="minorHAnsi"/>
-          <w:sz w:val="18"/>
-          <w:szCs w:val="18"/>
-        </w:rPr>
-        <w:t xml:space="preserve">cloud </w:t>
-      </w:r>
-      <w:r>
-        <w:rPr>
-          <w:rFonts w:asciiTheme="minorHAnsi" w:eastAsia="Calibri" w:hAnsiTheme="minorHAnsi" w:cstheme="minorHAnsi"/>
-          <w:sz w:val="18"/>
-          <w:szCs w:val="18"/>
-        </w:rPr>
-        <w:t>SaaS products</w:t>
-      </w:r>
-      <w:r>
-        <w:rPr>
-          <w:rFonts w:asciiTheme="minorHAnsi" w:eastAsia="Calibri" w:hAnsiTheme="minorHAnsi" w:cstheme="minorHAnsi"/>
-          <w:sz w:val="18"/>
-          <w:szCs w:val="18"/>
-        </w:rPr>
-        <w:t xml:space="preserve"> while increasing automated test coverage to 98%.</w:t>
+          <w:sz w:val="17"/>
+          <w:szCs w:val="17"/>
+        </w:rPr>
+        <w:t>cloud SaaS products while increasing automated test coverage to 98%.</w:t>
       </w:r>
     </w:p>
     <w:p>
@@ -2475,17 +2375,25 @@
       <w:r>
         <w:rPr>
           <w:rFonts w:asciiTheme="minorHAnsi" w:eastAsia="Calibri" w:hAnsiTheme="minorHAnsi" w:cstheme="minorHAnsi"/>
-          <w:sz w:val="18"/>
-          <w:szCs w:val="18"/>
-        </w:rPr>
-        <w:t xml:space="preserve">Python, C++, CUDA, </w:t>
+          <w:sz w:val="17"/>
+          <w:szCs w:val="17"/>
+        </w:rPr>
+        <w:t>Python</w:t>
+      </w:r>
+      <w:r>
+        <w:rPr>
+          <w:rFonts w:asciiTheme="minorHAnsi" w:eastAsia="Calibri" w:hAnsiTheme="minorHAnsi" w:cstheme="minorHAnsi"/>
+          <w:sz w:val="17"/>
+          <w:szCs w:val="17"/>
+        </w:rPr>
+        <w:t xml:space="preserve">, </w:t>
       </w:r>
       <w:proofErr w:type="spellStart"/>
       <w:r>
         <w:rPr>
           <w:rFonts w:asciiTheme="minorHAnsi" w:eastAsia="Calibri" w:hAnsiTheme="minorHAnsi" w:cstheme="minorHAnsi"/>
-          <w:sz w:val="18"/>
-          <w:szCs w:val="18"/>
+          <w:sz w:val="17"/>
+          <w:szCs w:val="17"/>
         </w:rPr>
         <w:t>PyTorch</w:t>
       </w:r>
@@ -2493,8 +2401,8 @@
       <w:r>
         <w:rPr>
           <w:rFonts w:asciiTheme="minorHAnsi" w:eastAsia="Calibri" w:hAnsiTheme="minorHAnsi" w:cstheme="minorHAnsi"/>
-          <w:sz w:val="18"/>
-          <w:szCs w:val="18"/>
+          <w:sz w:val="17"/>
+          <w:szCs w:val="17"/>
         </w:rPr>
         <w:t xml:space="preserve">, Hugging Face Transformers, ONNX Runtime, </w:t>
       </w:r>
@@ -2502,8 +2410,8 @@
       <w:r>
         <w:rPr>
           <w:rFonts w:asciiTheme="minorHAnsi" w:eastAsia="Calibri" w:hAnsiTheme="minorHAnsi" w:cstheme="minorHAnsi"/>
-          <w:sz w:val="18"/>
-          <w:szCs w:val="18"/>
+          <w:sz w:val="17"/>
+          <w:szCs w:val="17"/>
         </w:rPr>
         <w:t>TensorRT</w:t>
       </w:r>
@@ -2511,8 +2419,8 @@
       <w:r>
         <w:rPr>
           <w:rFonts w:asciiTheme="minorHAnsi" w:eastAsia="Calibri" w:hAnsiTheme="minorHAnsi" w:cstheme="minorHAnsi"/>
-          <w:sz w:val="18"/>
-          <w:szCs w:val="18"/>
+          <w:sz w:val="17"/>
+          <w:szCs w:val="17"/>
         </w:rPr>
         <w:t xml:space="preserve">, </w:t>
       </w:r>
@@ -2520,8 +2428,26 @@
       <w:r>
         <w:rPr>
           <w:rFonts w:asciiTheme="minorHAnsi" w:eastAsia="Calibri" w:hAnsiTheme="minorHAnsi" w:cstheme="minorHAnsi"/>
-          <w:sz w:val="18"/>
-          <w:szCs w:val="18"/>
+          <w:sz w:val="17"/>
+          <w:szCs w:val="17"/>
+        </w:rPr>
+        <w:t>TensorRT</w:t>
+      </w:r>
+      <w:proofErr w:type="spellEnd"/>
+      <w:r>
+        <w:rPr>
+          <w:rFonts w:asciiTheme="minorHAnsi" w:eastAsia="Calibri" w:hAnsiTheme="minorHAnsi" w:cstheme="minorHAnsi"/>
+          <w:sz w:val="17"/>
+          <w:szCs w:val="17"/>
+        </w:rPr>
+        <w:t xml:space="preserve">-LLM, </w:t>
+      </w:r>
+      <w:proofErr w:type="spellStart"/>
+      <w:r>
+        <w:rPr>
+          <w:rFonts w:asciiTheme="minorHAnsi" w:eastAsia="Calibri" w:hAnsiTheme="minorHAnsi" w:cstheme="minorHAnsi"/>
+          <w:sz w:val="17"/>
+          <w:szCs w:val="17"/>
         </w:rPr>
         <w:t>vLLM</w:t>
       </w:r>
@@ -2529,54 +2455,36 @@
       <w:r>
         <w:rPr>
           <w:rFonts w:asciiTheme="minorHAnsi" w:eastAsia="Calibri" w:hAnsiTheme="minorHAnsi" w:cstheme="minorHAnsi"/>
-          <w:sz w:val="18"/>
-          <w:szCs w:val="18"/>
-        </w:rPr>
-        <w:t xml:space="preserve">, NVIDIA Triton Inference Server, </w:t>
+          <w:sz w:val="17"/>
+          <w:szCs w:val="17"/>
+        </w:rPr>
+        <w:t xml:space="preserve">, </w:t>
       </w:r>
       <w:proofErr w:type="spellStart"/>
       <w:r>
         <w:rPr>
           <w:rFonts w:asciiTheme="minorHAnsi" w:eastAsia="Calibri" w:hAnsiTheme="minorHAnsi" w:cstheme="minorHAnsi"/>
-          <w:sz w:val="18"/>
-          <w:szCs w:val="18"/>
-        </w:rPr>
-        <w:t>TensorRT</w:t>
+          <w:sz w:val="17"/>
+          <w:szCs w:val="17"/>
+        </w:rPr>
+        <w:t>SGLang</w:t>
       </w:r>
       <w:proofErr w:type="spellEnd"/>
       <w:r>
         <w:rPr>
           <w:rFonts w:asciiTheme="minorHAnsi" w:eastAsia="Calibri" w:hAnsiTheme="minorHAnsi" w:cstheme="minorHAnsi"/>
-          <w:sz w:val="18"/>
-          <w:szCs w:val="18"/>
-        </w:rPr>
-        <w:t xml:space="preserve">-LLM, </w:t>
-      </w:r>
-      <w:proofErr w:type="spellStart"/>
-      <w:r>
-        <w:rPr>
-          <w:rFonts w:asciiTheme="minorHAnsi" w:eastAsia="Calibri" w:hAnsiTheme="minorHAnsi" w:cstheme="minorHAnsi"/>
-          <w:sz w:val="18"/>
-          <w:szCs w:val="18"/>
-        </w:rPr>
-        <w:t>SGLang</w:t>
-      </w:r>
-      <w:proofErr w:type="spellEnd"/>
-      <w:r>
-        <w:rPr>
-          <w:rFonts w:asciiTheme="minorHAnsi" w:eastAsia="Calibri" w:hAnsiTheme="minorHAnsi" w:cstheme="minorHAnsi"/>
-          <w:sz w:val="18"/>
-          <w:szCs w:val="18"/>
-        </w:rPr>
-        <w:t xml:space="preserve">, </w:t>
+          <w:sz w:val="17"/>
+          <w:szCs w:val="17"/>
+        </w:rPr>
+        <w:t xml:space="preserve">, NVIDIA Triton, </w:t>
       </w:r>
       <w:proofErr w:type="spellStart"/>
       <w:proofErr w:type="gramStart"/>
       <w:r>
         <w:rPr>
           <w:rFonts w:asciiTheme="minorHAnsi" w:eastAsia="Calibri" w:hAnsiTheme="minorHAnsi" w:cstheme="minorHAnsi"/>
-          <w:sz w:val="18"/>
-          <w:szCs w:val="18"/>
+          <w:sz w:val="17"/>
+          <w:szCs w:val="17"/>
         </w:rPr>
         <w:t>torch.compile</w:t>
       </w:r>
@@ -2585,25 +2493,37 @@
       <w:r>
         <w:rPr>
           <w:rFonts w:asciiTheme="minorHAnsi" w:eastAsia="Calibri" w:hAnsiTheme="minorHAnsi" w:cstheme="minorHAnsi"/>
-          <w:sz w:val="18"/>
-          <w:szCs w:val="18"/>
+          <w:sz w:val="17"/>
+          <w:szCs w:val="17"/>
         </w:rPr>
         <w:t xml:space="preserve">, </w:t>
       </w:r>
-      <w:r>
-        <w:rPr>
-          <w:rFonts w:asciiTheme="minorHAnsi" w:eastAsia="Calibri" w:hAnsiTheme="minorHAnsi" w:cstheme="minorHAnsi"/>
-          <w:sz w:val="18"/>
-          <w:szCs w:val="18"/>
-        </w:rPr>
-        <w:t xml:space="preserve">NVIDIA Nsight Systems, </w:t>
-      </w:r>
       <w:proofErr w:type="spellStart"/>
-      <w:r>
-        <w:rPr>
-          <w:rFonts w:asciiTheme="minorHAnsi" w:eastAsia="Calibri" w:hAnsiTheme="minorHAnsi" w:cstheme="minorHAnsi"/>
-          <w:sz w:val="18"/>
-          <w:szCs w:val="18"/>
+      <w:proofErr w:type="gramStart"/>
+      <w:r>
+        <w:rPr>
+          <w:rFonts w:asciiTheme="minorHAnsi" w:eastAsia="Calibri" w:hAnsiTheme="minorHAnsi" w:cstheme="minorHAnsi"/>
+          <w:sz w:val="17"/>
+          <w:szCs w:val="17"/>
+        </w:rPr>
+        <w:t>torch.distributed</w:t>
+      </w:r>
+      <w:proofErr w:type="spellEnd"/>
+      <w:proofErr w:type="gramEnd"/>
+      <w:r>
+        <w:rPr>
+          <w:rFonts w:asciiTheme="minorHAnsi" w:eastAsia="Calibri" w:hAnsiTheme="minorHAnsi" w:cstheme="minorHAnsi"/>
+          <w:sz w:val="17"/>
+          <w:szCs w:val="17"/>
+        </w:rPr>
+        <w:t xml:space="preserve">, DDP, NVIDIA Nsight Systems, Nsight Compute, </w:t>
+      </w:r>
+      <w:proofErr w:type="spellStart"/>
+      <w:r>
+        <w:rPr>
+          <w:rFonts w:asciiTheme="minorHAnsi" w:eastAsia="Calibri" w:hAnsiTheme="minorHAnsi" w:cstheme="minorHAnsi"/>
+          <w:sz w:val="17"/>
+          <w:szCs w:val="17"/>
         </w:rPr>
         <w:t>PyTorch</w:t>
       </w:r>
@@ -2611,17 +2531,71 @@
       <w:r>
         <w:rPr>
           <w:rFonts w:asciiTheme="minorHAnsi" w:eastAsia="Calibri" w:hAnsiTheme="minorHAnsi" w:cstheme="minorHAnsi"/>
-          <w:sz w:val="18"/>
-          <w:szCs w:val="18"/>
-        </w:rPr>
-        <w:t xml:space="preserve"> Profiler, Azure OpenAI, </w:t>
+          <w:sz w:val="17"/>
+          <w:szCs w:val="17"/>
+        </w:rPr>
+        <w:t xml:space="preserve"> Profiler, CUDA Events, FP16/INT8/INT4 Quantization, </w:t>
       </w:r>
       <w:proofErr w:type="spellStart"/>
       <w:r>
         <w:rPr>
           <w:rFonts w:asciiTheme="minorHAnsi" w:eastAsia="Calibri" w:hAnsiTheme="minorHAnsi" w:cstheme="minorHAnsi"/>
-          <w:sz w:val="18"/>
-          <w:szCs w:val="18"/>
+          <w:sz w:val="17"/>
+          <w:szCs w:val="17"/>
+        </w:rPr>
+        <w:t>bitsandbytes</w:t>
+      </w:r>
+      <w:proofErr w:type="spellEnd"/>
+      <w:r>
+        <w:rPr>
+          <w:rFonts w:asciiTheme="minorHAnsi" w:eastAsia="Calibri" w:hAnsiTheme="minorHAnsi" w:cstheme="minorHAnsi"/>
+          <w:sz w:val="17"/>
+          <w:szCs w:val="17"/>
+        </w:rPr>
+        <w:t xml:space="preserve">, </w:t>
+      </w:r>
+      <w:proofErr w:type="spellStart"/>
+      <w:r>
+        <w:rPr>
+          <w:rFonts w:asciiTheme="minorHAnsi" w:eastAsia="Calibri" w:hAnsiTheme="minorHAnsi" w:cstheme="minorHAnsi"/>
+          <w:sz w:val="17"/>
+          <w:szCs w:val="17"/>
+        </w:rPr>
+        <w:t>torchao</w:t>
+      </w:r>
+      <w:proofErr w:type="spellEnd"/>
+      <w:r>
+        <w:rPr>
+          <w:rFonts w:asciiTheme="minorHAnsi" w:eastAsia="Calibri" w:hAnsiTheme="minorHAnsi" w:cstheme="minorHAnsi"/>
+          <w:sz w:val="17"/>
+          <w:szCs w:val="17"/>
+        </w:rPr>
+        <w:t xml:space="preserve">, </w:t>
+      </w:r>
+      <w:proofErr w:type="spellStart"/>
+      <w:r>
+        <w:rPr>
+          <w:rFonts w:asciiTheme="minorHAnsi" w:eastAsia="Calibri" w:hAnsiTheme="minorHAnsi" w:cstheme="minorHAnsi"/>
+          <w:sz w:val="17"/>
+          <w:szCs w:val="17"/>
+        </w:rPr>
+        <w:t>FastAPI</w:t>
+      </w:r>
+      <w:proofErr w:type="spellEnd"/>
+      <w:r>
+        <w:rPr>
+          <w:rFonts w:asciiTheme="minorHAnsi" w:eastAsia="Calibri" w:hAnsiTheme="minorHAnsi" w:cstheme="minorHAnsi"/>
+          <w:sz w:val="17"/>
+          <w:szCs w:val="17"/>
+        </w:rPr>
+        <w:t xml:space="preserve">, Azure OpenAI, </w:t>
+      </w:r>
+      <w:proofErr w:type="spellStart"/>
+      <w:r>
+        <w:rPr>
+          <w:rFonts w:asciiTheme="minorHAnsi" w:eastAsia="Calibri" w:hAnsiTheme="minorHAnsi" w:cstheme="minorHAnsi"/>
+          <w:sz w:val="17"/>
+          <w:szCs w:val="17"/>
         </w:rPr>
         <w:t>LangChain</w:t>
       </w:r>
@@ -2629,8 +2603,26 @@
       <w:r>
         <w:rPr>
           <w:rFonts w:asciiTheme="minorHAnsi" w:eastAsia="Calibri" w:hAnsiTheme="minorHAnsi" w:cstheme="minorHAnsi"/>
-          <w:sz w:val="18"/>
-          <w:szCs w:val="18"/>
+          <w:sz w:val="17"/>
+          <w:szCs w:val="17"/>
+        </w:rPr>
+        <w:t xml:space="preserve">, RAG, </w:t>
+      </w:r>
+      <w:proofErr w:type="spellStart"/>
+      <w:r>
+        <w:rPr>
+          <w:rFonts w:asciiTheme="minorHAnsi" w:eastAsia="Calibri" w:hAnsiTheme="minorHAnsi" w:cstheme="minorHAnsi"/>
+          <w:sz w:val="17"/>
+          <w:szCs w:val="17"/>
+        </w:rPr>
+        <w:t>XGBoost</w:t>
+      </w:r>
+      <w:proofErr w:type="spellEnd"/>
+      <w:r>
+        <w:rPr>
+          <w:rFonts w:asciiTheme="minorHAnsi" w:eastAsia="Calibri" w:hAnsiTheme="minorHAnsi" w:cstheme="minorHAnsi"/>
+          <w:sz w:val="17"/>
+          <w:szCs w:val="17"/>
         </w:rPr>
         <w:t xml:space="preserve">, </w:t>
       </w:r>
@@ -2638,130 +2630,20 @@
       <w:r>
         <w:rPr>
           <w:rFonts w:asciiTheme="minorHAnsi" w:eastAsia="Calibri" w:hAnsiTheme="minorHAnsi" w:cstheme="minorHAnsi"/>
-          <w:sz w:val="18"/>
-          <w:szCs w:val="18"/>
-        </w:rPr>
-        <w:t>ChromaDB</w:t>
+          <w:sz w:val="17"/>
+          <w:szCs w:val="17"/>
+        </w:rPr>
+        <w:t>TabTransformer</w:t>
       </w:r>
       <w:proofErr w:type="spellEnd"/>
       <w:r>
         <w:rPr>
           <w:rFonts w:asciiTheme="minorHAnsi" w:eastAsia="Calibri" w:hAnsiTheme="minorHAnsi" w:cstheme="minorHAnsi"/>
-          <w:sz w:val="18"/>
-          <w:szCs w:val="18"/>
-        </w:rPr>
-        <w:t xml:space="preserve">, BM25, RAG, </w:t>
-      </w:r>
-      <w:proofErr w:type="spellStart"/>
-      <w:r>
-        <w:rPr>
-          <w:rFonts w:asciiTheme="minorHAnsi" w:eastAsia="Calibri" w:hAnsiTheme="minorHAnsi" w:cstheme="minorHAnsi"/>
-          <w:sz w:val="18"/>
-          <w:szCs w:val="18"/>
-        </w:rPr>
-        <w:t>FastAPI</w:t>
-      </w:r>
-      <w:proofErr w:type="spellEnd"/>
-      <w:r>
-        <w:rPr>
-          <w:rFonts w:asciiTheme="minorHAnsi" w:eastAsia="Calibri" w:hAnsiTheme="minorHAnsi" w:cstheme="minorHAnsi"/>
-          <w:sz w:val="18"/>
-          <w:szCs w:val="18"/>
-        </w:rPr>
-        <w:t xml:space="preserve">, </w:t>
-      </w:r>
-      <w:proofErr w:type="spellStart"/>
-      <w:r>
-        <w:rPr>
-          <w:rFonts w:asciiTheme="minorHAnsi" w:eastAsia="Calibri" w:hAnsiTheme="minorHAnsi" w:cstheme="minorHAnsi"/>
-          <w:sz w:val="18"/>
-          <w:szCs w:val="18"/>
-        </w:rPr>
-        <w:t>XGBoost</w:t>
-      </w:r>
-      <w:proofErr w:type="spellEnd"/>
-      <w:r>
-        <w:rPr>
-          <w:rFonts w:asciiTheme="minorHAnsi" w:eastAsia="Calibri" w:hAnsiTheme="minorHAnsi" w:cstheme="minorHAnsi"/>
-          <w:sz w:val="18"/>
-          <w:szCs w:val="18"/>
-        </w:rPr>
-        <w:t xml:space="preserve">, </w:t>
-      </w:r>
-      <w:proofErr w:type="spellStart"/>
-      <w:r>
-        <w:rPr>
-          <w:rFonts w:asciiTheme="minorHAnsi" w:eastAsia="Calibri" w:hAnsiTheme="minorHAnsi" w:cstheme="minorHAnsi"/>
-          <w:sz w:val="18"/>
-          <w:szCs w:val="18"/>
-        </w:rPr>
-        <w:t>TabTransformer</w:t>
-      </w:r>
-      <w:proofErr w:type="spellEnd"/>
-      <w:r>
-        <w:rPr>
-          <w:rFonts w:asciiTheme="minorHAnsi" w:eastAsia="Calibri" w:hAnsiTheme="minorHAnsi" w:cstheme="minorHAnsi"/>
-          <w:sz w:val="18"/>
-          <w:szCs w:val="18"/>
-        </w:rPr>
-        <w:t xml:space="preserve">, SHAP, </w:t>
-      </w:r>
-      <w:proofErr w:type="spellStart"/>
-      <w:r>
-        <w:rPr>
-          <w:rFonts w:asciiTheme="minorHAnsi" w:eastAsia="Calibri" w:hAnsiTheme="minorHAnsi" w:cstheme="minorHAnsi"/>
-          <w:sz w:val="18"/>
-          <w:szCs w:val="18"/>
-        </w:rPr>
-        <w:t>Statsmodels</w:t>
-      </w:r>
-      <w:proofErr w:type="spellEnd"/>
-      <w:r>
-        <w:rPr>
-          <w:rFonts w:asciiTheme="minorHAnsi" w:eastAsia="Calibri" w:hAnsiTheme="minorHAnsi" w:cstheme="minorHAnsi"/>
-          <w:sz w:val="18"/>
-          <w:szCs w:val="18"/>
-        </w:rPr>
-        <w:t xml:space="preserve">, OpenCV, Tesseract OCR, Google Vision API, </w:t>
-      </w:r>
-      <w:proofErr w:type="spellStart"/>
-      <w:r>
-        <w:rPr>
-          <w:rFonts w:asciiTheme="minorHAnsi" w:eastAsia="Calibri" w:hAnsiTheme="minorHAnsi" w:cstheme="minorHAnsi"/>
-          <w:sz w:val="18"/>
-          <w:szCs w:val="18"/>
-        </w:rPr>
-        <w:t>PyMuPDF</w:t>
-      </w:r>
-      <w:proofErr w:type="spellEnd"/>
-      <w:r>
-        <w:rPr>
-          <w:rFonts w:asciiTheme="minorHAnsi" w:eastAsia="Calibri" w:hAnsiTheme="minorHAnsi" w:cstheme="minorHAnsi"/>
-          <w:sz w:val="18"/>
-          <w:szCs w:val="18"/>
-        </w:rPr>
-        <w:t xml:space="preserve">, Pandas, </w:t>
-      </w:r>
-      <w:proofErr w:type="spellStart"/>
-      <w:r>
-        <w:rPr>
-          <w:rFonts w:asciiTheme="minorHAnsi" w:eastAsia="Calibri" w:hAnsiTheme="minorHAnsi" w:cstheme="minorHAnsi"/>
-          <w:sz w:val="18"/>
-          <w:szCs w:val="18"/>
-        </w:rPr>
-        <w:t>AsyncIO</w:t>
-      </w:r>
-      <w:proofErr w:type="spellEnd"/>
-    </w:p>
-    <w:p>
-      <w:pPr>
-        <w:spacing w:line="200" w:lineRule="atLeast"/>
-        <w:rPr>
-          <w:rFonts w:asciiTheme="minorHAnsi" w:eastAsia="Calibri" w:hAnsiTheme="minorHAnsi" w:cstheme="minorHAnsi"/>
-          <w:sz w:val="18"/>
-          <w:szCs w:val="18"/>
-        </w:rPr>
-      </w:pPr>
+          <w:sz w:val="17"/>
+          <w:szCs w:val="17"/>
+        </w:rPr>
+        <w:t>, SHAP, OpenCV, Pandas, NumPy, C++, CUDA C++</w:t>
+      </w:r>
     </w:p>
     <w:p>
       <w:pPr>
@@ -2778,7 +2660,13 @@
           <w:szCs w:val="19"/>
         </w:rPr>
       </w:pPr>
-      <w:r>
+    </w:p>
+    <w:p>
+      <w:pPr>
+        <w:pBdr>
+          <w:bottom w:val="single" w:sz="6" w:space="0" w:color="000000"/>
+        </w:pBdr>
+        <w:spacing w:line="200" w:lineRule="atLeast"/>
         <w:rPr>
           <w:rFonts w:asciiTheme="minorHAnsi" w:eastAsia="Calibri" w:hAnsiTheme="minorHAnsi" w:cstheme="minorHAnsi"/>
           <w:b/>
@@ -2787,6 +2675,16 @@
           <w:sz w:val="19"/>
           <w:szCs w:val="19"/>
         </w:rPr>
+      </w:pPr>
+      <w:r>
+        <w:rPr>
+          <w:rFonts w:asciiTheme="minorHAnsi" w:eastAsia="Calibri" w:hAnsiTheme="minorHAnsi" w:cstheme="minorHAnsi"/>
+          <w:b/>
+          <w:bCs/>
+          <w:caps/>
+          <w:sz w:val="19"/>
+          <w:szCs w:val="19"/>
+        </w:rPr>
         <w:t>education</w:t>
       </w:r>
     </w:p>
@@ -2799,16 +2697,16 @@
         <w:rPr>
           <w:rStyle w:val="fs13fw4"/>
           <w:rFonts w:asciiTheme="minorHAnsi" w:eastAsia="Calibri" w:hAnsiTheme="minorHAnsi" w:cstheme="minorHAnsi"/>
-          <w:sz w:val="18"/>
-          <w:szCs w:val="18"/>
+          <w:sz w:val="17"/>
+          <w:szCs w:val="17"/>
         </w:rPr>
       </w:pPr>
       <w:r>
         <w:rPr>
           <w:rStyle w:val="fs13fw6overflow-hidden"/>
           <w:rFonts w:asciiTheme="minorHAnsi" w:eastAsia="Calibri" w:hAnsiTheme="minorHAnsi" w:cstheme="minorHAnsi"/>
-          <w:sz w:val="18"/>
-          <w:szCs w:val="18"/>
+          <w:sz w:val="17"/>
+          <w:szCs w:val="17"/>
         </w:rPr>
         <w:t>University of Southern California</w:t>
       </w:r>
@@ -2816,8 +2714,8 @@
         <w:rPr>
           <w:rStyle w:val="fs13fw4"/>
           <w:rFonts w:asciiTheme="minorHAnsi" w:eastAsia="Calibri" w:hAnsiTheme="minorHAnsi" w:cstheme="minorHAnsi"/>
-          <w:sz w:val="18"/>
-          <w:szCs w:val="18"/>
+          <w:sz w:val="17"/>
+          <w:szCs w:val="17"/>
         </w:rPr>
         <w:tab/>
       </w:r>
@@ -2825,55 +2723,10 @@
         <w:rPr>
           <w:rStyle w:val="fs13fw4overflow-hidden"/>
           <w:rFonts w:asciiTheme="minorHAnsi" w:eastAsia="Calibri" w:hAnsiTheme="minorHAnsi" w:cstheme="minorHAnsi"/>
-          <w:sz w:val="18"/>
-          <w:szCs w:val="18"/>
-        </w:rPr>
-        <w:t>Aug 2023</w:t>
-      </w:r>
-      <w:r>
-        <w:rPr>
-          <w:rStyle w:val="fs13fw4overflow-hidden"/>
-          <w:rFonts w:asciiTheme="minorHAnsi" w:eastAsia="Calibri" w:hAnsiTheme="minorHAnsi" w:cstheme="minorHAnsi"/>
-          <w:sz w:val="18"/>
-          <w:szCs w:val="18"/>
-        </w:rPr>
-        <w:t xml:space="preserve"> </w:t>
-      </w:r>
-      <w:r>
-        <w:rPr>
-          <w:rStyle w:val="fs13fw4overflow-hidden"/>
-          <w:rFonts w:asciiTheme="minorHAnsi" w:eastAsia="Calibri" w:hAnsiTheme="minorHAnsi" w:cstheme="minorHAnsi"/>
-          <w:sz w:val="18"/>
-          <w:szCs w:val="18"/>
-        </w:rPr>
-        <w:t>-</w:t>
-      </w:r>
-      <w:r>
-        <w:rPr>
-          <w:rStyle w:val="fs13fw4overflow-hidden"/>
-          <w:rFonts w:asciiTheme="minorHAnsi" w:eastAsia="Calibri" w:hAnsiTheme="minorHAnsi" w:cstheme="minorHAnsi"/>
-          <w:sz w:val="18"/>
-          <w:szCs w:val="18"/>
-        </w:rPr>
-        <w:t xml:space="preserve"> </w:t>
-      </w:r>
-      <w:r>
-        <w:rPr>
-          <w:rStyle w:val="fs13fw4overflow-hidden"/>
-          <w:rFonts w:asciiTheme="minorHAnsi" w:eastAsia="Calibri" w:hAnsiTheme="minorHAnsi" w:cstheme="minorHAnsi"/>
-          <w:sz w:val="18"/>
-          <w:szCs w:val="18"/>
-        </w:rPr>
-        <w:t>May 2025</w:t>
-      </w:r>
-      <w:r>
-        <w:rPr>
-          <w:rStyle w:val="fs13fw4overflow-hidden"/>
-          <w:rFonts w:asciiTheme="minorHAnsi" w:eastAsia="Calibri" w:hAnsiTheme="minorHAnsi" w:cstheme="minorHAnsi"/>
-          <w:sz w:val="18"/>
-          <w:szCs w:val="18"/>
-        </w:rPr>
-        <w:t xml:space="preserve"> | Los Angeles, USA</w:t>
+          <w:sz w:val="17"/>
+          <w:szCs w:val="17"/>
+        </w:rPr>
+        <w:t>Aug 2023 - May 2025 | Los Angeles, USA</w:t>
       </w:r>
     </w:p>
     <w:p>
@@ -2885,16 +2738,16 @@
         <w:rPr>
           <w:rStyle w:val="fs13fw4overflow-hidden"/>
           <w:rFonts w:asciiTheme="minorHAnsi" w:eastAsia="Calibri" w:hAnsiTheme="minorHAnsi" w:cstheme="minorHAnsi"/>
-          <w:sz w:val="18"/>
-          <w:szCs w:val="18"/>
+          <w:sz w:val="17"/>
+          <w:szCs w:val="17"/>
         </w:rPr>
       </w:pPr>
       <w:r>
         <w:rPr>
           <w:rStyle w:val="fs13fw6overflow-hidden"/>
           <w:rFonts w:asciiTheme="minorHAnsi" w:eastAsia="Calibri" w:hAnsiTheme="minorHAnsi" w:cstheme="minorHAnsi"/>
-          <w:sz w:val="18"/>
-          <w:szCs w:val="18"/>
+          <w:sz w:val="17"/>
+          <w:szCs w:val="17"/>
         </w:rPr>
         <w:t>Master of Science in Computer Science</w:t>
       </w:r>
@@ -2902,8 +2755,8 @@
         <w:rPr>
           <w:rStyle w:val="fs13fw4"/>
           <w:rFonts w:asciiTheme="minorHAnsi" w:eastAsia="Calibri" w:hAnsiTheme="minorHAnsi" w:cstheme="minorHAnsi"/>
-          <w:sz w:val="18"/>
-          <w:szCs w:val="18"/>
+          <w:sz w:val="17"/>
+          <w:szCs w:val="17"/>
         </w:rPr>
         <w:tab/>
       </w:r>
@@ -2911,19 +2764,10 @@
         <w:rPr>
           <w:rStyle w:val="fs13fw4overflow-hidden"/>
           <w:rFonts w:asciiTheme="minorHAnsi" w:eastAsia="Calibri" w:hAnsiTheme="minorHAnsi" w:cstheme="minorHAnsi"/>
-          <w:sz w:val="18"/>
-          <w:szCs w:val="18"/>
-        </w:rPr>
-        <w:t>GPA - 3.73</w:t>
-      </w:r>
-      <w:r>
-        <w:rPr>
-          <w:rStyle w:val="fs13fw4overflow-hidden"/>
-          <w:rFonts w:asciiTheme="minorHAnsi" w:eastAsia="Calibri" w:hAnsiTheme="minorHAnsi" w:cstheme="minorHAnsi"/>
-          <w:sz w:val="18"/>
-          <w:szCs w:val="18"/>
-        </w:rPr>
-        <w:t xml:space="preserve"> / 4</w:t>
+          <w:sz w:val="17"/>
+          <w:szCs w:val="17"/>
+        </w:rPr>
+        <w:t>GPA - 3.73 / 4</w:t>
       </w:r>
     </w:p>
     <w:p>
@@ -2931,15 +2775,15 @@
         <w:spacing w:line="140" w:lineRule="atLeast"/>
         <w:rPr>
           <w:rFonts w:asciiTheme="minorHAnsi" w:eastAsia="Calibri" w:hAnsiTheme="minorHAnsi" w:cstheme="minorHAnsi"/>
-          <w:sz w:val="18"/>
-          <w:szCs w:val="18"/>
-        </w:rPr>
-      </w:pPr>
-      <w:r>
-        <w:rPr>
-          <w:rFonts w:asciiTheme="minorHAnsi" w:eastAsia="Calibri" w:hAnsiTheme="minorHAnsi" w:cstheme="minorHAnsi"/>
-          <w:sz w:val="18"/>
-          <w:szCs w:val="18"/>
+          <w:sz w:val="17"/>
+          <w:szCs w:val="17"/>
+        </w:rPr>
+      </w:pPr>
+      <w:r>
+        <w:rPr>
+          <w:rFonts w:asciiTheme="minorHAnsi" w:eastAsia="Calibri" w:hAnsiTheme="minorHAnsi" w:cstheme="minorHAnsi"/>
+          <w:sz w:val="17"/>
+          <w:szCs w:val="17"/>
         </w:rPr>
         <w:t> </w:t>
       </w:r>
@@ -2953,16 +2797,16 @@
         <w:rPr>
           <w:rStyle w:val="fs13fw4"/>
           <w:rFonts w:asciiTheme="minorHAnsi" w:eastAsia="Calibri" w:hAnsiTheme="minorHAnsi" w:cstheme="minorHAnsi"/>
-          <w:sz w:val="18"/>
-          <w:szCs w:val="18"/>
+          <w:sz w:val="17"/>
+          <w:szCs w:val="17"/>
         </w:rPr>
       </w:pPr>
       <w:r>
         <w:rPr>
           <w:rStyle w:val="fs13fw6overflow-hidden"/>
           <w:rFonts w:asciiTheme="minorHAnsi" w:eastAsia="Calibri" w:hAnsiTheme="minorHAnsi" w:cstheme="minorHAnsi"/>
-          <w:sz w:val="18"/>
-          <w:szCs w:val="18"/>
+          <w:sz w:val="17"/>
+          <w:szCs w:val="17"/>
         </w:rPr>
         <w:t>Pune Institute of Computer Technology</w:t>
       </w:r>
@@ -2970,8 +2814,8 @@
         <w:rPr>
           <w:rStyle w:val="fs13fw4"/>
           <w:rFonts w:asciiTheme="minorHAnsi" w:eastAsia="Calibri" w:hAnsiTheme="minorHAnsi" w:cstheme="minorHAnsi"/>
-          <w:sz w:val="18"/>
-          <w:szCs w:val="18"/>
+          <w:sz w:val="17"/>
+          <w:szCs w:val="17"/>
         </w:rPr>
         <w:tab/>
       </w:r>
@@ -2979,55 +2823,10 @@
         <w:rPr>
           <w:rStyle w:val="fs13fw4overflow-hidden"/>
           <w:rFonts w:asciiTheme="minorHAnsi" w:eastAsia="Calibri" w:hAnsiTheme="minorHAnsi" w:cstheme="minorHAnsi"/>
-          <w:sz w:val="18"/>
-          <w:szCs w:val="18"/>
-        </w:rPr>
-        <w:t>Aug 2017</w:t>
-      </w:r>
-      <w:r>
-        <w:rPr>
-          <w:rStyle w:val="fs13fw4overflow-hidden"/>
-          <w:rFonts w:asciiTheme="minorHAnsi" w:eastAsia="Calibri" w:hAnsiTheme="minorHAnsi" w:cstheme="minorHAnsi"/>
-          <w:sz w:val="18"/>
-          <w:szCs w:val="18"/>
-        </w:rPr>
-        <w:t xml:space="preserve"> </w:t>
-      </w:r>
-      <w:r>
-        <w:rPr>
-          <w:rStyle w:val="fs13fw4overflow-hidden"/>
-          <w:rFonts w:asciiTheme="minorHAnsi" w:eastAsia="Calibri" w:hAnsiTheme="minorHAnsi" w:cstheme="minorHAnsi"/>
-          <w:sz w:val="18"/>
-          <w:szCs w:val="18"/>
-        </w:rPr>
-        <w:t>-</w:t>
-      </w:r>
-      <w:r>
-        <w:rPr>
-          <w:rStyle w:val="fs13fw4overflow-hidden"/>
-          <w:rFonts w:asciiTheme="minorHAnsi" w:eastAsia="Calibri" w:hAnsiTheme="minorHAnsi" w:cstheme="minorHAnsi"/>
-          <w:sz w:val="18"/>
-          <w:szCs w:val="18"/>
-        </w:rPr>
-        <w:t xml:space="preserve"> </w:t>
-      </w:r>
-      <w:r>
-        <w:rPr>
-          <w:rStyle w:val="fs13fw4overflow-hidden"/>
-          <w:rFonts w:asciiTheme="minorHAnsi" w:eastAsia="Calibri" w:hAnsiTheme="minorHAnsi" w:cstheme="minorHAnsi"/>
-          <w:sz w:val="18"/>
-          <w:szCs w:val="18"/>
-        </w:rPr>
-        <w:t>April 2021</w:t>
-      </w:r>
-      <w:r>
-        <w:rPr>
-          <w:rStyle w:val="fs13fw4overflow-hidden"/>
-          <w:rFonts w:asciiTheme="minorHAnsi" w:eastAsia="Calibri" w:hAnsiTheme="minorHAnsi" w:cstheme="minorHAnsi"/>
-          <w:sz w:val="18"/>
-          <w:szCs w:val="18"/>
-        </w:rPr>
-        <w:t xml:space="preserve"> | Pune, India</w:t>
+          <w:sz w:val="17"/>
+          <w:szCs w:val="17"/>
+        </w:rPr>
+        <w:t>Aug 2017 - April 2021 | Pune, India</w:t>
       </w:r>
     </w:p>
     <w:p>
@@ -3038,16 +2837,16 @@
         <w:spacing w:line="200" w:lineRule="atLeast"/>
         <w:rPr>
           <w:rFonts w:asciiTheme="minorHAnsi" w:eastAsia="Calibri" w:hAnsiTheme="minorHAnsi" w:cstheme="minorHAnsi"/>
-          <w:sz w:val="18"/>
-          <w:szCs w:val="18"/>
+          <w:sz w:val="17"/>
+          <w:szCs w:val="17"/>
         </w:rPr>
       </w:pPr>
       <w:r>
         <w:rPr>
           <w:rStyle w:val="fs13fw6overflow-hidden"/>
           <w:rFonts w:asciiTheme="minorHAnsi" w:eastAsia="Calibri" w:hAnsiTheme="minorHAnsi" w:cstheme="minorHAnsi"/>
-          <w:sz w:val="18"/>
-          <w:szCs w:val="18"/>
+          <w:sz w:val="17"/>
+          <w:szCs w:val="17"/>
         </w:rPr>
         <w:t>Bachelor of Engineering in Computer Engineering</w:t>
       </w:r>
@@ -3055,8 +2854,8 @@
         <w:rPr>
           <w:rStyle w:val="fs13fw4"/>
           <w:rFonts w:asciiTheme="minorHAnsi" w:eastAsia="Calibri" w:hAnsiTheme="minorHAnsi" w:cstheme="minorHAnsi"/>
-          <w:sz w:val="18"/>
-          <w:szCs w:val="18"/>
+          <w:sz w:val="17"/>
+          <w:szCs w:val="17"/>
         </w:rPr>
         <w:tab/>
       </w:r>
@@ -3064,19 +2863,10 @@
         <w:rPr>
           <w:rStyle w:val="fs13fw4overflow-hidden"/>
           <w:rFonts w:asciiTheme="minorHAnsi" w:eastAsia="Calibri" w:hAnsiTheme="minorHAnsi" w:cstheme="minorHAnsi"/>
-          <w:sz w:val="18"/>
-          <w:szCs w:val="18"/>
-        </w:rPr>
-        <w:t>GPA - 9.14</w:t>
-      </w:r>
-      <w:r>
-        <w:rPr>
-          <w:rStyle w:val="fs13fw4overflow-hidden"/>
-          <w:rFonts w:asciiTheme="minorHAnsi" w:eastAsia="Calibri" w:hAnsiTheme="minorHAnsi" w:cstheme="minorHAnsi"/>
-          <w:sz w:val="18"/>
-          <w:szCs w:val="18"/>
-        </w:rPr>
-        <w:t xml:space="preserve"> / 10</w:t>
+          <w:sz w:val="17"/>
+          <w:szCs w:val="17"/>
+        </w:rPr>
+        <w:t>GPA - 9.14 / 10</w:t>
       </w:r>
     </w:p>
     <w:sectPr>

</xml_diff>